<commit_message>
Tested and Made Test Cases Document and Updated SRS and SAD Docs
</commit_message>
<xml_diff>
--- a/Software Architecture and Design Document.docx
+++ b/Software Architecture and Design Document.docx
@@ -1,6 +1,6 @@
 
 <file path=word/document.xml><?xml version="1.0" encoding="utf-8"?>
-<w:document xmlns:wpc="http://schemas.microsoft.com/office/word/2010/wordprocessingCanvas" xmlns:mc="http://schemas.openxmlformats.org/markup-compatibility/2006" xmlns:o="urn:schemas-microsoft-com:office:office" xmlns:r="http://schemas.openxmlformats.org/officeDocument/2006/relationships" xmlns:m="http://schemas.openxmlformats.org/officeDocument/2006/math" xmlns:v="urn:schemas-microsoft-com:vml" xmlns:wp14="http://schemas.microsoft.com/office/word/2010/wordprocessingDrawing" xmlns:wp="http://schemas.openxmlformats.org/drawingml/2006/wordprocessingDrawing" xmlns:w10="urn:schemas-microsoft-com:office:word" xmlns:w="http://schemas.openxmlformats.org/wordprocessingml/2006/main" xmlns:w14="http://schemas.microsoft.com/office/word/2010/wordml" xmlns:wpg="http://schemas.microsoft.com/office/word/2010/wordprocessingGroup" xmlns:wpi="http://schemas.microsoft.com/office/word/2010/wordprocessingInk" xmlns:wne="http://schemas.microsoft.com/office/word/2006/wordml" xmlns:wps="http://schemas.microsoft.com/office/word/2010/wordprocessingShape" mc:Ignorable="w14 wp14">
+<w:document xmlns:wpc="http://schemas.microsoft.com/office/word/2010/wordprocessingCanvas" xmlns:cx="http://schemas.microsoft.com/office/drawing/2014/chartex" xmlns:cx1="http://schemas.microsoft.com/office/drawing/2015/9/8/chartex" xmlns:cx2="http://schemas.microsoft.com/office/drawing/2015/10/21/chartex" xmlns:cx3="http://schemas.microsoft.com/office/drawing/2016/5/9/chartex" xmlns:cx4="http://schemas.microsoft.com/office/drawing/2016/5/10/chartex" xmlns:cx5="http://schemas.microsoft.com/office/drawing/2016/5/11/chartex" xmlns:cx6="http://schemas.microsoft.com/office/drawing/2016/5/12/chartex" xmlns:cx7="http://schemas.microsoft.com/office/drawing/2016/5/13/chartex" xmlns:cx8="http://schemas.microsoft.com/office/drawing/2016/5/14/chartex" xmlns:mc="http://schemas.openxmlformats.org/markup-compatibility/2006" xmlns:aink="http://schemas.microsoft.com/office/drawing/2016/ink" xmlns:am3d="http://schemas.microsoft.com/office/drawing/2017/model3d" xmlns:o="urn:schemas-microsoft-com:office:office" xmlns:oel="http://schemas.microsoft.com/office/2019/extlst" xmlns:r="http://schemas.openxmlformats.org/officeDocument/2006/relationships" xmlns:m="http://schemas.openxmlformats.org/officeDocument/2006/math" xmlns:v="urn:schemas-microsoft-com:vml" xmlns:wp14="http://schemas.microsoft.com/office/word/2010/wordprocessingDrawing" xmlns:wp="http://schemas.openxmlformats.org/drawingml/2006/wordprocessingDrawing" xmlns:w10="urn:schemas-microsoft-com:office:word" xmlns:w="http://schemas.openxmlformats.org/wordprocessingml/2006/main" xmlns:w14="http://schemas.microsoft.com/office/word/2010/wordml" xmlns:w15="http://schemas.microsoft.com/office/word/2012/wordml" xmlns:w16cex="http://schemas.microsoft.com/office/word/2018/wordml/cex" xmlns:w16cid="http://schemas.microsoft.com/office/word/2016/wordml/cid" xmlns:w16="http://schemas.microsoft.com/office/word/2018/wordml" xmlns:w16du="http://schemas.microsoft.com/office/word/2023/wordml/word16du" xmlns:w16sdtdh="http://schemas.microsoft.com/office/word/2020/wordml/sdtdatahash" xmlns:w16sdtfl="http://schemas.microsoft.com/office/word/2024/wordml/sdtformatlock" xmlns:w16se="http://schemas.microsoft.com/office/word/2015/wordml/symex" xmlns:wpg="http://schemas.microsoft.com/office/word/2010/wordprocessingGroup" xmlns:wpi="http://schemas.microsoft.com/office/word/2010/wordprocessingInk" xmlns:wne="http://schemas.microsoft.com/office/word/2006/wordml" xmlns:wps="http://schemas.microsoft.com/office/word/2010/wordprocessingShape" mc:Ignorable="w14 w15 w16se w16cid w16 w16cex w16sdtdh w16sdtfl w16du wp14">
   <w:body>
     <w:p>
       <w:pPr>
@@ -19,7 +19,7 @@
           <w:szCs w:val="24"/>
           <w:lang w:eastAsia="en-IN"/>
         </w:rPr>
-        <w:pict>
+        <w:pict w14:anchorId="7BA0ABA5">
           <v:rect id="_x0000_i1025" style="width:0;height:1.5pt" o:hralign="center" o:hrstd="t" o:hr="t" fillcolor="#a0a0a0" stroked="f"/>
         </w:pict>
       </w:r>
@@ -106,7 +106,223 @@
           <w:szCs w:val="24"/>
           <w:lang w:eastAsia="en-IN"/>
         </w:rPr>
-        <w:t xml:space="preserve">Authors: </w:t>
+        <w:t>Authors: Mevin Jose,</w:t>
+      </w:r>
+      <w:r>
+        <w:rPr>
+          <w:rFonts w:ascii="Times New Roman" w:eastAsia="Times New Roman" w:hAnsi="Times New Roman" w:cs="Times New Roman"/>
+          <w:sz w:val="24"/>
+          <w:szCs w:val="24"/>
+          <w:lang w:eastAsia="en-IN"/>
+        </w:rPr>
+        <w:t xml:space="preserve"> K Abhiram, Prateek Meher</w:t>
+      </w:r>
+      <w:r>
+        <w:rPr>
+          <w:rFonts w:ascii="Times New Roman" w:eastAsia="Times New Roman" w:hAnsi="Times New Roman" w:cs="Times New Roman"/>
+          <w:sz w:val="24"/>
+          <w:szCs w:val="24"/>
+          <w:lang w:eastAsia="en-IN"/>
+        </w:rPr>
+        <w:t>,</w:t>
+      </w:r>
+      <w:r>
+        <w:rPr>
+          <w:rFonts w:ascii="Times New Roman" w:eastAsia="Times New Roman" w:hAnsi="Times New Roman" w:cs="Times New Roman"/>
+          <w:sz w:val="24"/>
+          <w:szCs w:val="24"/>
+          <w:lang w:eastAsia="en-IN"/>
+        </w:rPr>
+        <w:t xml:space="preserve"> K Rajeev</w:t>
+      </w:r>
+    </w:p>
+    <w:p>
+      <w:pPr>
+        <w:spacing w:before="100" w:beforeAutospacing="1" w:after="100" w:afterAutospacing="1" w:line="240" w:lineRule="auto"/>
+        <w:rPr>
+          <w:rFonts w:ascii="Times New Roman" w:eastAsia="Times New Roman" w:hAnsi="Times New Roman" w:cs="Times New Roman"/>
+          <w:sz w:val="24"/>
+          <w:szCs w:val="24"/>
+          <w:lang w:eastAsia="en-IN"/>
+        </w:rPr>
+      </w:pPr>
+      <w:r>
+        <w:rPr>
+          <w:rFonts w:ascii="Times New Roman" w:eastAsia="Times New Roman" w:hAnsi="Times New Roman" w:cs="Times New Roman"/>
+          <w:sz w:val="24"/>
+          <w:szCs w:val="24"/>
+          <w:lang w:eastAsia="en-IN"/>
+        </w:rPr>
+        <w:t>Date: September 29, 2025</w:t>
+      </w:r>
+    </w:p>
+    <w:p>
+      <w:pPr>
+        <w:spacing w:before="100" w:beforeAutospacing="1" w:after="100" w:afterAutospacing="1" w:line="240" w:lineRule="auto"/>
+        <w:rPr>
+          <w:rFonts w:ascii="Times New Roman" w:eastAsia="Times New Roman" w:hAnsi="Times New Roman" w:cs="Times New Roman"/>
+          <w:sz w:val="24"/>
+          <w:szCs w:val="24"/>
+          <w:lang w:eastAsia="en-IN"/>
+        </w:rPr>
+      </w:pPr>
+      <w:r>
+        <w:rPr>
+          <w:rFonts w:ascii="Times New Roman" w:eastAsia="Times New Roman" w:hAnsi="Times New Roman" w:cs="Times New Roman"/>
+          <w:sz w:val="24"/>
+          <w:szCs w:val="24"/>
+          <w:lang w:eastAsia="en-IN"/>
+        </w:rPr>
+        <w:t>Status: Draft</w:t>
+      </w:r>
+    </w:p>
+    <w:p>
+      <w:pPr>
+        <w:spacing w:before="100" w:beforeAutospacing="1" w:after="100" w:afterAutospacing="1" w:line="240" w:lineRule="auto"/>
+        <w:rPr>
+          <w:rFonts w:ascii="Times New Roman" w:eastAsia="Times New Roman" w:hAnsi="Times New Roman" w:cs="Times New Roman"/>
+          <w:sz w:val="24"/>
+          <w:szCs w:val="24"/>
+          <w:lang w:eastAsia="en-IN"/>
+        </w:rPr>
+      </w:pPr>
+      <w:r>
+        <w:rPr>
+          <w:rFonts w:ascii="Times New Roman" w:eastAsia="Times New Roman" w:hAnsi="Times New Roman" w:cs="Times New Roman"/>
+          <w:sz w:val="24"/>
+          <w:szCs w:val="24"/>
+          <w:lang w:eastAsia="en-IN"/>
+        </w:rPr>
+        <w:t>Revision History</w:t>
+      </w:r>
+    </w:p>
+    <w:p>
+      <w:pPr>
+        <w:spacing w:before="100" w:beforeAutospacing="1" w:after="100" w:afterAutospacing="1" w:line="240" w:lineRule="auto"/>
+        <w:rPr>
+          <w:rFonts w:ascii="Times New Roman" w:eastAsia="Times New Roman" w:hAnsi="Times New Roman" w:cs="Times New Roman"/>
+          <w:sz w:val="24"/>
+          <w:szCs w:val="24"/>
+          <w:lang w:eastAsia="en-IN"/>
+        </w:rPr>
+      </w:pPr>
+      <w:r>
+        <w:rPr>
+          <w:rFonts w:ascii="Times New Roman" w:eastAsia="Times New Roman" w:hAnsi="Times New Roman" w:cs="Times New Roman"/>
+          <w:sz w:val="24"/>
+          <w:szCs w:val="24"/>
+          <w:lang w:eastAsia="en-IN"/>
+        </w:rPr>
+        <w:t>| Version | Date | Author | Change Summary |</w:t>
+      </w:r>
+    </w:p>
+    <w:p>
+      <w:pPr>
+        <w:spacing w:before="100" w:beforeAutospacing="1" w:after="100" w:afterAutospacing="1" w:line="240" w:lineRule="auto"/>
+        <w:rPr>
+          <w:rFonts w:ascii="Times New Roman" w:eastAsia="Times New Roman" w:hAnsi="Times New Roman" w:cs="Times New Roman"/>
+          <w:sz w:val="24"/>
+          <w:szCs w:val="24"/>
+          <w:lang w:eastAsia="en-IN"/>
+        </w:rPr>
+      </w:pPr>
+      <w:r>
+        <w:rPr>
+          <w:rFonts w:ascii="Times New Roman" w:eastAsia="Times New Roman" w:hAnsi="Times New Roman" w:cs="Times New Roman"/>
+          <w:sz w:val="24"/>
+          <w:szCs w:val="24"/>
+          <w:lang w:eastAsia="en-IN"/>
+        </w:rPr>
+        <w:t>|---|---|---|---|</w:t>
+      </w:r>
+    </w:p>
+    <w:p>
+      <w:pPr>
+        <w:spacing w:before="100" w:beforeAutospacing="1" w:after="100" w:afterAutospacing="1" w:line="240" w:lineRule="auto"/>
+        <w:rPr>
+          <w:rFonts w:ascii="Times New Roman" w:eastAsia="Times New Roman" w:hAnsi="Times New Roman" w:cs="Times New Roman"/>
+          <w:sz w:val="24"/>
+          <w:szCs w:val="24"/>
+          <w:lang w:eastAsia="en-IN"/>
+        </w:rPr>
+      </w:pPr>
+      <w:r>
+        <w:rPr>
+          <w:rFonts w:ascii="Times New Roman" w:eastAsia="Times New Roman" w:hAnsi="Times New Roman" w:cs="Times New Roman"/>
+          <w:sz w:val="24"/>
+          <w:szCs w:val="24"/>
+          <w:lang w:eastAsia="en-IN"/>
+        </w:rPr>
+        <w:t>| 1.0 | 09-29-2025 | Design Team | Architecture</w:t>
+      </w:r>
+      <w:r>
+        <w:rPr>
+          <w:rFonts w:ascii="Times New Roman" w:eastAsia="Times New Roman" w:hAnsi="Times New Roman" w:cs="Times New Roman"/>
+          <w:sz w:val="24"/>
+          <w:szCs w:val="24"/>
+          <w:lang w:eastAsia="en-IN"/>
+        </w:rPr>
+        <w:t xml:space="preserve"> document creation |</w:t>
+      </w:r>
+    </w:p>
+    <w:p>
+      <w:pPr>
+        <w:spacing w:before="100" w:beforeAutospacing="1" w:after="100" w:afterAutospacing="1" w:line="240" w:lineRule="auto"/>
+        <w:rPr>
+          <w:rFonts w:ascii="Times New Roman" w:eastAsia="Times New Roman" w:hAnsi="Times New Roman" w:cs="Times New Roman"/>
+          <w:sz w:val="24"/>
+          <w:szCs w:val="24"/>
+          <w:lang w:eastAsia="en-IN"/>
+        </w:rPr>
+      </w:pPr>
+      <w:r>
+        <w:rPr>
+          <w:rFonts w:ascii="Times New Roman" w:eastAsia="Times New Roman" w:hAnsi="Times New Roman" w:cs="Times New Roman"/>
+          <w:sz w:val="24"/>
+          <w:szCs w:val="24"/>
+          <w:lang w:eastAsia="en-IN"/>
+        </w:rPr>
+        <w:t>Approvals</w:t>
+      </w:r>
+    </w:p>
+    <w:p>
+      <w:pPr>
+        <w:spacing w:before="100" w:beforeAutospacing="1" w:after="100" w:afterAutospacing="1" w:line="240" w:lineRule="auto"/>
+        <w:rPr>
+          <w:rFonts w:ascii="Times New Roman" w:eastAsia="Times New Roman" w:hAnsi="Times New Roman" w:cs="Times New Roman"/>
+          <w:sz w:val="24"/>
+          <w:szCs w:val="24"/>
+          <w:lang w:eastAsia="en-IN"/>
+        </w:rPr>
+      </w:pPr>
+      <w:r>
+        <w:rPr>
+          <w:rFonts w:ascii="Times New Roman" w:eastAsia="Times New Roman" w:hAnsi="Times New Roman" w:cs="Times New Roman"/>
+          <w:sz w:val="24"/>
+          <w:szCs w:val="24"/>
+          <w:lang w:eastAsia="en-IN"/>
+        </w:rPr>
+        <w:t>| Role | Name | Signature/Date |</w:t>
+      </w:r>
+    </w:p>
+    <w:p>
+      <w:pPr>
+        <w:spacing w:before="100" w:beforeAutospacing="1" w:after="100" w:afterAutospacing="1" w:line="240" w:lineRule="auto"/>
+        <w:rPr>
+          <w:rFonts w:ascii="Times New Roman" w:eastAsia="Times New Roman" w:hAnsi="Times New Roman" w:cs="Times New Roman"/>
+          <w:sz w:val="24"/>
+          <w:szCs w:val="24"/>
+          <w:lang w:eastAsia="en-IN"/>
+        </w:rPr>
+      </w:pPr>
+      <w:r>
+        <w:rPr>
+          <w:rFonts w:ascii="Times New Roman" w:eastAsia="Times New Roman" w:hAnsi="Times New Roman" w:cs="Times New Roman"/>
+          <w:sz w:val="24"/>
+          <w:szCs w:val="24"/>
+          <w:lang w:eastAsia="en-IN"/>
+        </w:rPr>
+        <w:t xml:space="preserve">|Team </w:t>
       </w:r>
       <w:proofErr w:type="spellStart"/>
       <w:r>
@@ -116,7 +332,7 @@
           <w:szCs w:val="24"/>
           <w:lang w:eastAsia="en-IN"/>
         </w:rPr>
-        <w:t>Mevin</w:t>
+        <w:t>leader|Mevin</w:t>
       </w:r>
       <w:proofErr w:type="spellEnd"/>
       <w:r>
@@ -126,284 +342,6 @@
           <w:szCs w:val="24"/>
           <w:lang w:eastAsia="en-IN"/>
         </w:rPr>
-        <w:t xml:space="preserve"> Jose,</w:t>
-      </w:r>
-      <w:r>
-        <w:rPr>
-          <w:rFonts w:ascii="Times New Roman" w:eastAsia="Times New Roman" w:hAnsi="Times New Roman" w:cs="Times New Roman"/>
-          <w:sz w:val="24"/>
-          <w:szCs w:val="24"/>
-          <w:lang w:eastAsia="en-IN"/>
-        </w:rPr>
-        <w:t xml:space="preserve"> K </w:t>
-      </w:r>
-      <w:proofErr w:type="spellStart"/>
-      <w:r>
-        <w:rPr>
-          <w:rFonts w:ascii="Times New Roman" w:eastAsia="Times New Roman" w:hAnsi="Times New Roman" w:cs="Times New Roman"/>
-          <w:sz w:val="24"/>
-          <w:szCs w:val="24"/>
-          <w:lang w:eastAsia="en-IN"/>
-        </w:rPr>
-        <w:t>Abhiram</w:t>
-      </w:r>
-      <w:proofErr w:type="spellEnd"/>
-      <w:r>
-        <w:rPr>
-          <w:rFonts w:ascii="Times New Roman" w:eastAsia="Times New Roman" w:hAnsi="Times New Roman" w:cs="Times New Roman"/>
-          <w:sz w:val="24"/>
-          <w:szCs w:val="24"/>
-          <w:lang w:eastAsia="en-IN"/>
-        </w:rPr>
-        <w:t xml:space="preserve">, </w:t>
-      </w:r>
-      <w:proofErr w:type="spellStart"/>
-      <w:r>
-        <w:rPr>
-          <w:rFonts w:ascii="Times New Roman" w:eastAsia="Times New Roman" w:hAnsi="Times New Roman" w:cs="Times New Roman"/>
-          <w:sz w:val="24"/>
-          <w:szCs w:val="24"/>
-          <w:lang w:eastAsia="en-IN"/>
-        </w:rPr>
-        <w:t>Prateek</w:t>
-      </w:r>
-      <w:proofErr w:type="spellEnd"/>
-      <w:r>
-        <w:rPr>
-          <w:rFonts w:ascii="Times New Roman" w:eastAsia="Times New Roman" w:hAnsi="Times New Roman" w:cs="Times New Roman"/>
-          <w:sz w:val="24"/>
-          <w:szCs w:val="24"/>
-          <w:lang w:eastAsia="en-IN"/>
-        </w:rPr>
-        <w:t xml:space="preserve"> Meher</w:t>
-      </w:r>
-      <w:r>
-        <w:rPr>
-          <w:rFonts w:ascii="Times New Roman" w:eastAsia="Times New Roman" w:hAnsi="Times New Roman" w:cs="Times New Roman"/>
-          <w:sz w:val="24"/>
-          <w:szCs w:val="24"/>
-          <w:lang w:eastAsia="en-IN"/>
-        </w:rPr>
-        <w:t>,</w:t>
-      </w:r>
-      <w:bookmarkStart w:id="0" w:name="_GoBack"/>
-      <w:bookmarkEnd w:id="0"/>
-      <w:r>
-        <w:rPr>
-          <w:rFonts w:ascii="Times New Roman" w:eastAsia="Times New Roman" w:hAnsi="Times New Roman" w:cs="Times New Roman"/>
-          <w:sz w:val="24"/>
-          <w:szCs w:val="24"/>
-          <w:lang w:eastAsia="en-IN"/>
-        </w:rPr>
-        <w:t xml:space="preserve"> K Rajeev</w:t>
-      </w:r>
-    </w:p>
-    <w:p>
-      <w:pPr>
-        <w:spacing w:before="100" w:beforeAutospacing="1" w:after="100" w:afterAutospacing="1" w:line="240" w:lineRule="auto"/>
-        <w:rPr>
-          <w:rFonts w:ascii="Times New Roman" w:eastAsia="Times New Roman" w:hAnsi="Times New Roman" w:cs="Times New Roman"/>
-          <w:sz w:val="24"/>
-          <w:szCs w:val="24"/>
-          <w:lang w:eastAsia="en-IN"/>
-        </w:rPr>
-      </w:pPr>
-      <w:r>
-        <w:rPr>
-          <w:rFonts w:ascii="Times New Roman" w:eastAsia="Times New Roman" w:hAnsi="Times New Roman" w:cs="Times New Roman"/>
-          <w:sz w:val="24"/>
-          <w:szCs w:val="24"/>
-          <w:lang w:eastAsia="en-IN"/>
-        </w:rPr>
-        <w:t>Date: September 29, 2025</w:t>
-      </w:r>
-    </w:p>
-    <w:p>
-      <w:pPr>
-        <w:spacing w:before="100" w:beforeAutospacing="1" w:after="100" w:afterAutospacing="1" w:line="240" w:lineRule="auto"/>
-        <w:rPr>
-          <w:rFonts w:ascii="Times New Roman" w:eastAsia="Times New Roman" w:hAnsi="Times New Roman" w:cs="Times New Roman"/>
-          <w:sz w:val="24"/>
-          <w:szCs w:val="24"/>
-          <w:lang w:eastAsia="en-IN"/>
-        </w:rPr>
-      </w:pPr>
-      <w:r>
-        <w:rPr>
-          <w:rFonts w:ascii="Times New Roman" w:eastAsia="Times New Roman" w:hAnsi="Times New Roman" w:cs="Times New Roman"/>
-          <w:sz w:val="24"/>
-          <w:szCs w:val="24"/>
-          <w:lang w:eastAsia="en-IN"/>
-        </w:rPr>
-        <w:t>Status: Draft</w:t>
-      </w:r>
-    </w:p>
-    <w:p>
-      <w:pPr>
-        <w:spacing w:before="100" w:beforeAutospacing="1" w:after="100" w:afterAutospacing="1" w:line="240" w:lineRule="auto"/>
-        <w:rPr>
-          <w:rFonts w:ascii="Times New Roman" w:eastAsia="Times New Roman" w:hAnsi="Times New Roman" w:cs="Times New Roman"/>
-          <w:sz w:val="24"/>
-          <w:szCs w:val="24"/>
-          <w:lang w:eastAsia="en-IN"/>
-        </w:rPr>
-      </w:pPr>
-      <w:r>
-        <w:rPr>
-          <w:rFonts w:ascii="Times New Roman" w:eastAsia="Times New Roman" w:hAnsi="Times New Roman" w:cs="Times New Roman"/>
-          <w:sz w:val="24"/>
-          <w:szCs w:val="24"/>
-          <w:lang w:eastAsia="en-IN"/>
-        </w:rPr>
-        <w:t>Revision History</w:t>
-      </w:r>
-    </w:p>
-    <w:p>
-      <w:pPr>
-        <w:spacing w:before="100" w:beforeAutospacing="1" w:after="100" w:afterAutospacing="1" w:line="240" w:lineRule="auto"/>
-        <w:rPr>
-          <w:rFonts w:ascii="Times New Roman" w:eastAsia="Times New Roman" w:hAnsi="Times New Roman" w:cs="Times New Roman"/>
-          <w:sz w:val="24"/>
-          <w:szCs w:val="24"/>
-          <w:lang w:eastAsia="en-IN"/>
-        </w:rPr>
-      </w:pPr>
-      <w:r>
-        <w:rPr>
-          <w:rFonts w:ascii="Times New Roman" w:eastAsia="Times New Roman" w:hAnsi="Times New Roman" w:cs="Times New Roman"/>
-          <w:sz w:val="24"/>
-          <w:szCs w:val="24"/>
-          <w:lang w:eastAsia="en-IN"/>
-        </w:rPr>
-        <w:t>| Version | Date | Author | Change Summary |</w:t>
-      </w:r>
-    </w:p>
-    <w:p>
-      <w:pPr>
-        <w:spacing w:before="100" w:beforeAutospacing="1" w:after="100" w:afterAutospacing="1" w:line="240" w:lineRule="auto"/>
-        <w:rPr>
-          <w:rFonts w:ascii="Times New Roman" w:eastAsia="Times New Roman" w:hAnsi="Times New Roman" w:cs="Times New Roman"/>
-          <w:sz w:val="24"/>
-          <w:szCs w:val="24"/>
-          <w:lang w:eastAsia="en-IN"/>
-        </w:rPr>
-      </w:pPr>
-      <w:r>
-        <w:rPr>
-          <w:rFonts w:ascii="Times New Roman" w:eastAsia="Times New Roman" w:hAnsi="Times New Roman" w:cs="Times New Roman"/>
-          <w:sz w:val="24"/>
-          <w:szCs w:val="24"/>
-          <w:lang w:eastAsia="en-IN"/>
-        </w:rPr>
-        <w:t>|---|---|---|---|</w:t>
-      </w:r>
-    </w:p>
-    <w:p>
-      <w:pPr>
-        <w:spacing w:before="100" w:beforeAutospacing="1" w:after="100" w:afterAutospacing="1" w:line="240" w:lineRule="auto"/>
-        <w:rPr>
-          <w:rFonts w:ascii="Times New Roman" w:eastAsia="Times New Roman" w:hAnsi="Times New Roman" w:cs="Times New Roman"/>
-          <w:sz w:val="24"/>
-          <w:szCs w:val="24"/>
-          <w:lang w:eastAsia="en-IN"/>
-        </w:rPr>
-      </w:pPr>
-      <w:r>
-        <w:rPr>
-          <w:rFonts w:ascii="Times New Roman" w:eastAsia="Times New Roman" w:hAnsi="Times New Roman" w:cs="Times New Roman"/>
-          <w:sz w:val="24"/>
-          <w:szCs w:val="24"/>
-          <w:lang w:eastAsia="en-IN"/>
-        </w:rPr>
-        <w:t>| 1.0 | 09-29-2025 | Design Team | Architecture</w:t>
-      </w:r>
-      <w:r>
-        <w:rPr>
-          <w:rFonts w:ascii="Times New Roman" w:eastAsia="Times New Roman" w:hAnsi="Times New Roman" w:cs="Times New Roman"/>
-          <w:sz w:val="24"/>
-          <w:szCs w:val="24"/>
-          <w:lang w:eastAsia="en-IN"/>
-        </w:rPr>
-        <w:t xml:space="preserve"> document creation |</w:t>
-      </w:r>
-    </w:p>
-    <w:p>
-      <w:pPr>
-        <w:spacing w:before="100" w:beforeAutospacing="1" w:after="100" w:afterAutospacing="1" w:line="240" w:lineRule="auto"/>
-        <w:rPr>
-          <w:rFonts w:ascii="Times New Roman" w:eastAsia="Times New Roman" w:hAnsi="Times New Roman" w:cs="Times New Roman"/>
-          <w:sz w:val="24"/>
-          <w:szCs w:val="24"/>
-          <w:lang w:eastAsia="en-IN"/>
-        </w:rPr>
-      </w:pPr>
-      <w:r>
-        <w:rPr>
-          <w:rFonts w:ascii="Times New Roman" w:eastAsia="Times New Roman" w:hAnsi="Times New Roman" w:cs="Times New Roman"/>
-          <w:sz w:val="24"/>
-          <w:szCs w:val="24"/>
-          <w:lang w:eastAsia="en-IN"/>
-        </w:rPr>
-        <w:t>Approvals</w:t>
-      </w:r>
-    </w:p>
-    <w:p>
-      <w:pPr>
-        <w:spacing w:before="100" w:beforeAutospacing="1" w:after="100" w:afterAutospacing="1" w:line="240" w:lineRule="auto"/>
-        <w:rPr>
-          <w:rFonts w:ascii="Times New Roman" w:eastAsia="Times New Roman" w:hAnsi="Times New Roman" w:cs="Times New Roman"/>
-          <w:sz w:val="24"/>
-          <w:szCs w:val="24"/>
-          <w:lang w:eastAsia="en-IN"/>
-        </w:rPr>
-      </w:pPr>
-      <w:r>
-        <w:rPr>
-          <w:rFonts w:ascii="Times New Roman" w:eastAsia="Times New Roman" w:hAnsi="Times New Roman" w:cs="Times New Roman"/>
-          <w:sz w:val="24"/>
-          <w:szCs w:val="24"/>
-          <w:lang w:eastAsia="en-IN"/>
-        </w:rPr>
-        <w:t>| Role | Name | Signature/Date |</w:t>
-      </w:r>
-    </w:p>
-    <w:p>
-      <w:pPr>
-        <w:spacing w:before="100" w:beforeAutospacing="1" w:after="100" w:afterAutospacing="1" w:line="240" w:lineRule="auto"/>
-        <w:rPr>
-          <w:rFonts w:ascii="Times New Roman" w:eastAsia="Times New Roman" w:hAnsi="Times New Roman" w:cs="Times New Roman"/>
-          <w:sz w:val="24"/>
-          <w:szCs w:val="24"/>
-          <w:lang w:eastAsia="en-IN"/>
-        </w:rPr>
-      </w:pPr>
-      <w:r>
-        <w:rPr>
-          <w:rFonts w:ascii="Times New Roman" w:eastAsia="Times New Roman" w:hAnsi="Times New Roman" w:cs="Times New Roman"/>
-          <w:sz w:val="24"/>
-          <w:szCs w:val="24"/>
-          <w:lang w:eastAsia="en-IN"/>
-        </w:rPr>
-        <w:t xml:space="preserve">|Team </w:t>
-      </w:r>
-      <w:proofErr w:type="spellStart"/>
-      <w:r>
-        <w:rPr>
-          <w:rFonts w:ascii="Times New Roman" w:eastAsia="Times New Roman" w:hAnsi="Times New Roman" w:cs="Times New Roman"/>
-          <w:sz w:val="24"/>
-          <w:szCs w:val="24"/>
-          <w:lang w:eastAsia="en-IN"/>
-        </w:rPr>
-        <w:t>leader|Mevin</w:t>
-      </w:r>
-      <w:proofErr w:type="spellEnd"/>
-      <w:r>
-        <w:rPr>
-          <w:rFonts w:ascii="Times New Roman" w:eastAsia="Times New Roman" w:hAnsi="Times New Roman" w:cs="Times New Roman"/>
-          <w:sz w:val="24"/>
-          <w:szCs w:val="24"/>
-          <w:lang w:eastAsia="en-IN"/>
-        </w:rPr>
         <w:t xml:space="preserve"> Jose|29-09-2025</w:t>
       </w:r>
       <w:r>
@@ -473,7 +411,7 @@
           <w:szCs w:val="24"/>
           <w:lang w:eastAsia="en-IN"/>
         </w:rPr>
-        <w:pict>
+        <w:pict w14:anchorId="5DE5C669">
           <v:rect id="_x0000_i1026" style="width:0;height:1.5pt" o:hralign="center" o:hrstd="t" o:hr="t" fillcolor="#a0a0a0" stroked="f"/>
         </w:pict>
       </w:r>
@@ -856,7 +794,7 @@
           <w:szCs w:val="24"/>
           <w:lang w:eastAsia="en-IN"/>
         </w:rPr>
-        <w:pict>
+        <w:pict w14:anchorId="52F99285">
           <v:rect id="_x0000_i1027" style="width:0;height:1.5pt" o:hralign="center" o:hrstd="t" o:hr="t" fillcolor="#a0a0a0" stroked="f"/>
         </w:pict>
       </w:r>
@@ -1078,7 +1016,7 @@
           <w:szCs w:val="24"/>
           <w:lang w:eastAsia="en-IN"/>
         </w:rPr>
-        <w:pict>
+        <w:pict w14:anchorId="4B76D321">
           <v:rect id="_x0000_i1028" style="width:0;height:1.5pt" o:hralign="center" o:hrstd="t" o:hr="t" fillcolor="#a0a0a0" stroked="f"/>
         </w:pict>
       </w:r>
@@ -1400,7 +1338,7 @@
           <w:lang w:eastAsia="en-IN"/>
         </w:rPr>
         <w:drawing>
-          <wp:inline distT="0" distB="0" distL="0" distR="0" wp14:anchorId="650CDDE0" wp14:editId="39A8BC28">
+          <wp:inline distT="0" distB="0" distL="0" distR="0" wp14:anchorId="288E7886" wp14:editId="7CB276DB">
             <wp:extent cx="6122504" cy="2051437"/>
             <wp:effectExtent l="0" t="0" r="0" b="6350"/>
             <wp:docPr id="2" name="Picture 2" descr="D:\downloads\component_diagram.png"/>
@@ -1417,7 +1355,7 @@
                     </pic:cNvPicPr>
                   </pic:nvPicPr>
                   <pic:blipFill>
-                    <a:blip r:embed="rId7">
+                    <a:blip r:embed="rId6">
                       <a:extLst>
                         <a:ext uri="{28A0092B-C50C-407E-A947-70E740481C1C}">
                           <a14:useLocalDpi xmlns:a14="http://schemas.microsoft.com/office/drawing/2010/main" val="0"/>
@@ -1743,29 +1681,16 @@
         </w:rPr>
         <w:t xml:space="preserve">The chosen architectural pattern is </w:t>
       </w:r>
-      <w:proofErr w:type="spellStart"/>
-      <w:r>
-        <w:rPr>
-          <w:rFonts w:ascii="Times New Roman" w:eastAsia="Times New Roman" w:hAnsi="Times New Roman" w:cs="Times New Roman"/>
-          <w:b/>
-          <w:bCs/>
-          <w:sz w:val="24"/>
-          <w:szCs w:val="24"/>
-          <w:lang w:eastAsia="en-IN"/>
-        </w:rPr>
-        <w:t>Microservices</w:t>
-      </w:r>
-      <w:proofErr w:type="spellEnd"/>
-      <w:r>
-        <w:rPr>
-          <w:rFonts w:ascii="Times New Roman" w:eastAsia="Times New Roman" w:hAnsi="Times New Roman" w:cs="Times New Roman"/>
-          <w:b/>
-          <w:bCs/>
-          <w:sz w:val="24"/>
-          <w:szCs w:val="24"/>
-          <w:lang w:eastAsia="en-IN"/>
-        </w:rPr>
-        <w:t xml:space="preserve"> Architecture</w:t>
+      <w:r>
+        <w:rPr>
+          <w:rFonts w:ascii="Times New Roman" w:eastAsia="Times New Roman" w:hAnsi="Times New Roman" w:cs="Times New Roman"/>
+          <w:b/>
+          <w:bCs/>
+          <w:sz w:val="24"/>
+          <w:szCs w:val="24"/>
+          <w:lang w:eastAsia="en-IN"/>
+        </w:rPr>
+        <w:t>Microservices Architecture</w:t>
       </w:r>
       <w:r>
         <w:rPr>
@@ -2720,7 +2645,7 @@
           <w:szCs w:val="24"/>
           <w:lang w:eastAsia="en-IN"/>
         </w:rPr>
-        <w:pict>
+        <w:pict w14:anchorId="6586A904">
           <v:rect id="_x0000_i1029" style="width:0;height:1.5pt" o:hralign="center" o:hrstd="t" o:hr="t" fillcolor="#a0a0a0" stroked="f"/>
         </w:pict>
       </w:r>
@@ -2792,38 +2717,7 @@
           <w:szCs w:val="24"/>
           <w:lang w:eastAsia="en-IN"/>
         </w:rPr>
-        <w:t xml:space="preserve">The SMMS is designed with </w:t>
-      </w:r>
-      <w:proofErr w:type="gramStart"/>
-      <w:r>
-        <w:rPr>
-          <w:rFonts w:ascii="Times New Roman" w:eastAsia="Times New Roman" w:hAnsi="Times New Roman" w:cs="Times New Roman"/>
-          <w:sz w:val="24"/>
-          <w:szCs w:val="24"/>
-          <w:lang w:eastAsia="en-IN"/>
-        </w:rPr>
-        <w:t xml:space="preserve">a </w:t>
-      </w:r>
-      <w:proofErr w:type="spellStart"/>
-      <w:r>
-        <w:rPr>
-          <w:rFonts w:ascii="Times New Roman" w:eastAsia="Times New Roman" w:hAnsi="Times New Roman" w:cs="Times New Roman"/>
-          <w:sz w:val="24"/>
-          <w:szCs w:val="24"/>
-          <w:lang w:eastAsia="en-IN"/>
-        </w:rPr>
-        <w:t>microservices</w:t>
-      </w:r>
-      <w:proofErr w:type="spellEnd"/>
-      <w:proofErr w:type="gramEnd"/>
-      <w:r>
-        <w:rPr>
-          <w:rFonts w:ascii="Times New Roman" w:eastAsia="Times New Roman" w:hAnsi="Times New Roman" w:cs="Times New Roman"/>
-          <w:sz w:val="24"/>
-          <w:szCs w:val="24"/>
-          <w:lang w:eastAsia="en-IN"/>
-        </w:rPr>
-        <w:t xml:space="preserve"> architecture to provide a clear separation of concerns, which enhances modularity and maintainability.</w:t>
+        <w:t>The SMMS is designed with a microservices architecture to provide a clear separation of concerns, which enhances modularity and maintainability.</w:t>
       </w:r>
     </w:p>
     <w:p>
@@ -2871,7 +2765,7 @@
         </w:rPr>
         <w:lastRenderedPageBreak/>
         <w:drawing>
-          <wp:inline distT="0" distB="0" distL="0" distR="0">
+          <wp:inline distT="0" distB="0" distL="0" distR="0" wp14:anchorId="7A0EE939" wp14:editId="291629B1">
             <wp:extent cx="5510254" cy="3499468"/>
             <wp:effectExtent l="0" t="0" r="0" b="6350"/>
             <wp:docPr id="1" name="Picture 1" descr="C:\Users\Devi\AppData\Local\Packages\5319275A.WhatsAppDesktop_cv1g1gvanyjgm\TempState\4F001117E74BD0FA8352FA3D720A30EF\WhatsApp Image 2025-09-29 at 23.25.10_b9961abf.jpg"/>
@@ -2888,7 +2782,7 @@
                     </pic:cNvPicPr>
                   </pic:nvPicPr>
                   <pic:blipFill>
-                    <a:blip r:embed="rId8">
+                    <a:blip r:embed="rId7">
                       <a:extLst>
                         <a:ext uri="{28A0092B-C50C-407E-A947-70E740481C1C}">
                           <a14:useLocalDpi xmlns:a14="http://schemas.microsoft.com/office/drawing/2010/main" val="0"/>
@@ -2942,7 +2836,905 @@
           <w:szCs w:val="24"/>
           <w:lang w:eastAsia="en-IN"/>
         </w:rPr>
-        <w:t>4.3 API Design</w:t>
+        <w:t>4.</w:t>
+      </w:r>
+      <w:r>
+        <w:rPr>
+          <w:rFonts w:ascii="Times New Roman" w:eastAsia="Times New Roman" w:hAnsi="Times New Roman" w:cs="Times New Roman"/>
+          <w:b/>
+          <w:bCs/>
+          <w:sz w:val="24"/>
+          <w:szCs w:val="24"/>
+          <w:lang w:eastAsia="en-IN"/>
+        </w:rPr>
+        <w:t>3</w:t>
+      </w:r>
+      <w:r>
+        <w:rPr>
+          <w:rFonts w:ascii="Times New Roman" w:eastAsia="Times New Roman" w:hAnsi="Times New Roman" w:cs="Times New Roman"/>
+          <w:b/>
+          <w:bCs/>
+          <w:sz w:val="24"/>
+          <w:szCs w:val="24"/>
+          <w:lang w:eastAsia="en-IN"/>
+        </w:rPr>
+        <w:t xml:space="preserve"> Authentication Service Design (DS-Auth-01)</w:t>
+      </w:r>
+    </w:p>
+    <w:p>
+      <w:pPr>
+        <w:spacing w:before="100" w:beforeAutospacing="1" w:after="100" w:afterAutospacing="1" w:line="240" w:lineRule="auto"/>
+        <w:outlineLvl w:val="3"/>
+        <w:rPr>
+          <w:rFonts w:ascii="Times New Roman" w:eastAsia="Times New Roman" w:hAnsi="Times New Roman" w:cs="Times New Roman"/>
+          <w:b/>
+          <w:bCs/>
+          <w:sz w:val="24"/>
+          <w:szCs w:val="24"/>
+          <w:lang w:eastAsia="en-IN"/>
+        </w:rPr>
+      </w:pPr>
+      <w:r>
+        <w:rPr>
+          <w:rFonts w:ascii="Times New Roman" w:eastAsia="Times New Roman" w:hAnsi="Times New Roman" w:cs="Times New Roman"/>
+          <w:b/>
+          <w:bCs/>
+          <w:sz w:val="24"/>
+          <w:szCs w:val="24"/>
+          <w:lang w:eastAsia="en-IN"/>
+        </w:rPr>
+        <w:t>This section specifies the design for user registration, login, password hashing, and session creation.</w:t>
+      </w:r>
+      <w:r>
+        <w:rPr>
+          <w:rFonts w:ascii="Times New Roman" w:eastAsia="Times New Roman" w:hAnsi="Times New Roman" w:cs="Times New Roman"/>
+          <w:b/>
+          <w:bCs/>
+          <w:sz w:val="24"/>
+          <w:szCs w:val="24"/>
+          <w:lang w:eastAsia="en-IN"/>
+        </w:rPr>
+        <w:br/>
+        <w:t>It maps to SRS requirements: SMMS-F-001, SMMS-F-002, SMMS-F-003.</w:t>
+      </w:r>
+    </w:p>
+    <w:p>
+      <w:pPr>
+        <w:spacing w:before="100" w:beforeAutospacing="1" w:after="100" w:afterAutospacing="1" w:line="240" w:lineRule="auto"/>
+        <w:outlineLvl w:val="3"/>
+        <w:rPr>
+          <w:rFonts w:ascii="Times New Roman" w:eastAsia="Times New Roman" w:hAnsi="Times New Roman" w:cs="Times New Roman"/>
+          <w:b/>
+          <w:bCs/>
+          <w:sz w:val="24"/>
+          <w:szCs w:val="24"/>
+          <w:lang w:eastAsia="en-IN"/>
+        </w:rPr>
+      </w:pPr>
+      <w:r>
+        <w:rPr>
+          <w:rFonts w:ascii="Times New Roman" w:eastAsia="Times New Roman" w:hAnsi="Times New Roman" w:cs="Times New Roman"/>
+          <w:b/>
+          <w:bCs/>
+          <w:sz w:val="24"/>
+          <w:szCs w:val="24"/>
+          <w:lang w:eastAsia="en-IN"/>
+        </w:rPr>
+        <w:pict w14:anchorId="4860FDAC">
+          <v:rect id="_x0000_i1072" style="width:0;height:1.5pt" o:hralign="center" o:hrstd="t" o:hr="t" fillcolor="#a0a0a0" stroked="f"/>
+        </w:pict>
+      </w:r>
+    </w:p>
+    <w:p>
+      <w:pPr>
+        <w:spacing w:before="100" w:beforeAutospacing="1" w:after="100" w:afterAutospacing="1" w:line="240" w:lineRule="auto"/>
+        <w:outlineLvl w:val="3"/>
+        <w:rPr>
+          <w:rFonts w:ascii="Times New Roman" w:eastAsia="Times New Roman" w:hAnsi="Times New Roman" w:cs="Times New Roman"/>
+          <w:b/>
+          <w:bCs/>
+          <w:sz w:val="24"/>
+          <w:szCs w:val="24"/>
+          <w:lang w:eastAsia="en-IN"/>
+        </w:rPr>
+      </w:pPr>
+      <w:r>
+        <w:rPr>
+          <w:rFonts w:ascii="Times New Roman" w:eastAsia="Times New Roman" w:hAnsi="Times New Roman" w:cs="Times New Roman"/>
+          <w:b/>
+          <w:bCs/>
+          <w:sz w:val="24"/>
+          <w:szCs w:val="24"/>
+          <w:lang w:eastAsia="en-IN"/>
+        </w:rPr>
+        <w:t>4.</w:t>
+      </w:r>
+      <w:r>
+        <w:rPr>
+          <w:rFonts w:ascii="Times New Roman" w:eastAsia="Times New Roman" w:hAnsi="Times New Roman" w:cs="Times New Roman"/>
+          <w:b/>
+          <w:bCs/>
+          <w:sz w:val="24"/>
+          <w:szCs w:val="24"/>
+          <w:lang w:eastAsia="en-IN"/>
+        </w:rPr>
+        <w:t>4</w:t>
+      </w:r>
+      <w:r>
+        <w:rPr>
+          <w:rFonts w:ascii="Times New Roman" w:eastAsia="Times New Roman" w:hAnsi="Times New Roman" w:cs="Times New Roman"/>
+          <w:b/>
+          <w:bCs/>
+          <w:sz w:val="24"/>
+          <w:szCs w:val="24"/>
+          <w:lang w:eastAsia="en-IN"/>
+        </w:rPr>
+        <w:t xml:space="preserve"> Role-Based Access Control Design (DS-RBAC-01)</w:t>
+      </w:r>
+    </w:p>
+    <w:p>
+      <w:pPr>
+        <w:spacing w:before="100" w:beforeAutospacing="1" w:after="100" w:afterAutospacing="1" w:line="240" w:lineRule="auto"/>
+        <w:outlineLvl w:val="3"/>
+        <w:rPr>
+          <w:rFonts w:ascii="Times New Roman" w:eastAsia="Times New Roman" w:hAnsi="Times New Roman" w:cs="Times New Roman"/>
+          <w:b/>
+          <w:bCs/>
+          <w:sz w:val="24"/>
+          <w:szCs w:val="24"/>
+          <w:lang w:eastAsia="en-IN"/>
+        </w:rPr>
+      </w:pPr>
+      <w:r>
+        <w:rPr>
+          <w:rFonts w:ascii="Times New Roman" w:eastAsia="Times New Roman" w:hAnsi="Times New Roman" w:cs="Times New Roman"/>
+          <w:b/>
+          <w:bCs/>
+          <w:sz w:val="24"/>
+          <w:szCs w:val="24"/>
+          <w:lang w:eastAsia="en-IN"/>
+        </w:rPr>
+        <w:t>This section describes Admin/User role separation, access rules, and permissions enforcement.</w:t>
+      </w:r>
+      <w:r>
+        <w:rPr>
+          <w:rFonts w:ascii="Times New Roman" w:eastAsia="Times New Roman" w:hAnsi="Times New Roman" w:cs="Times New Roman"/>
+          <w:b/>
+          <w:bCs/>
+          <w:sz w:val="24"/>
+          <w:szCs w:val="24"/>
+          <w:lang w:eastAsia="en-IN"/>
+        </w:rPr>
+        <w:br/>
+        <w:t>Maps to: SMMS-F-004, SMMS-SR-004.</w:t>
+      </w:r>
+    </w:p>
+    <w:p>
+      <w:pPr>
+        <w:spacing w:before="100" w:beforeAutospacing="1" w:after="100" w:afterAutospacing="1" w:line="240" w:lineRule="auto"/>
+        <w:outlineLvl w:val="3"/>
+        <w:rPr>
+          <w:rFonts w:ascii="Times New Roman" w:eastAsia="Times New Roman" w:hAnsi="Times New Roman" w:cs="Times New Roman"/>
+          <w:b/>
+          <w:bCs/>
+          <w:sz w:val="24"/>
+          <w:szCs w:val="24"/>
+          <w:lang w:eastAsia="en-IN"/>
+        </w:rPr>
+      </w:pPr>
+      <w:r>
+        <w:rPr>
+          <w:rFonts w:ascii="Times New Roman" w:eastAsia="Times New Roman" w:hAnsi="Times New Roman" w:cs="Times New Roman"/>
+          <w:b/>
+          <w:bCs/>
+          <w:sz w:val="24"/>
+          <w:szCs w:val="24"/>
+          <w:lang w:eastAsia="en-IN"/>
+        </w:rPr>
+        <w:pict w14:anchorId="4BF083EE">
+          <v:rect id="_x0000_i1073" style="width:0;height:1.5pt" o:hralign="center" o:hrstd="t" o:hr="t" fillcolor="#a0a0a0" stroked="f"/>
+        </w:pict>
+      </w:r>
+    </w:p>
+    <w:p>
+      <w:pPr>
+        <w:spacing w:before="100" w:beforeAutospacing="1" w:after="100" w:afterAutospacing="1" w:line="240" w:lineRule="auto"/>
+        <w:outlineLvl w:val="3"/>
+        <w:rPr>
+          <w:rFonts w:ascii="Times New Roman" w:eastAsia="Times New Roman" w:hAnsi="Times New Roman" w:cs="Times New Roman"/>
+          <w:b/>
+          <w:bCs/>
+          <w:sz w:val="24"/>
+          <w:szCs w:val="24"/>
+          <w:lang w:eastAsia="en-IN"/>
+        </w:rPr>
+      </w:pPr>
+      <w:r>
+        <w:rPr>
+          <w:rFonts w:ascii="Times New Roman" w:eastAsia="Times New Roman" w:hAnsi="Times New Roman" w:cs="Times New Roman"/>
+          <w:b/>
+          <w:bCs/>
+          <w:sz w:val="24"/>
+          <w:szCs w:val="24"/>
+          <w:lang w:eastAsia="en-IN"/>
+        </w:rPr>
+        <w:t>4.</w:t>
+      </w:r>
+      <w:r>
+        <w:rPr>
+          <w:rFonts w:ascii="Times New Roman" w:eastAsia="Times New Roman" w:hAnsi="Times New Roman" w:cs="Times New Roman"/>
+          <w:b/>
+          <w:bCs/>
+          <w:sz w:val="24"/>
+          <w:szCs w:val="24"/>
+          <w:lang w:eastAsia="en-IN"/>
+        </w:rPr>
+        <w:t>5</w:t>
+      </w:r>
+      <w:r>
+        <w:rPr>
+          <w:rFonts w:ascii="Times New Roman" w:eastAsia="Times New Roman" w:hAnsi="Times New Roman" w:cs="Times New Roman"/>
+          <w:b/>
+          <w:bCs/>
+          <w:sz w:val="24"/>
+          <w:szCs w:val="24"/>
+          <w:lang w:eastAsia="en-IN"/>
+        </w:rPr>
+        <w:t xml:space="preserve"> Post Management Module Design (DS-Post-01)</w:t>
+      </w:r>
+    </w:p>
+    <w:p>
+      <w:pPr>
+        <w:spacing w:before="100" w:beforeAutospacing="1" w:after="100" w:afterAutospacing="1" w:line="240" w:lineRule="auto"/>
+        <w:outlineLvl w:val="3"/>
+        <w:rPr>
+          <w:rFonts w:ascii="Times New Roman" w:eastAsia="Times New Roman" w:hAnsi="Times New Roman" w:cs="Times New Roman"/>
+          <w:b/>
+          <w:bCs/>
+          <w:sz w:val="24"/>
+          <w:szCs w:val="24"/>
+          <w:lang w:eastAsia="en-IN"/>
+        </w:rPr>
+      </w:pPr>
+      <w:r>
+        <w:rPr>
+          <w:rFonts w:ascii="Times New Roman" w:eastAsia="Times New Roman" w:hAnsi="Times New Roman" w:cs="Times New Roman"/>
+          <w:b/>
+          <w:bCs/>
+          <w:sz w:val="24"/>
+          <w:szCs w:val="24"/>
+          <w:lang w:eastAsia="en-IN"/>
+        </w:rPr>
+        <w:t>Design for creating posts, uploading images, saving drafts, editing, deleting.</w:t>
+      </w:r>
+      <w:r>
+        <w:rPr>
+          <w:rFonts w:ascii="Times New Roman" w:eastAsia="Times New Roman" w:hAnsi="Times New Roman" w:cs="Times New Roman"/>
+          <w:b/>
+          <w:bCs/>
+          <w:sz w:val="24"/>
+          <w:szCs w:val="24"/>
+          <w:lang w:eastAsia="en-IN"/>
+        </w:rPr>
+        <w:br/>
+        <w:t>Maps to: SMMS-F-005, SMMS-F-006, SMMS-F-007, SMMS-F-012.</w:t>
+      </w:r>
+    </w:p>
+    <w:p>
+      <w:pPr>
+        <w:spacing w:before="100" w:beforeAutospacing="1" w:after="100" w:afterAutospacing="1" w:line="240" w:lineRule="auto"/>
+        <w:outlineLvl w:val="3"/>
+        <w:rPr>
+          <w:rFonts w:ascii="Times New Roman" w:eastAsia="Times New Roman" w:hAnsi="Times New Roman" w:cs="Times New Roman"/>
+          <w:b/>
+          <w:bCs/>
+          <w:sz w:val="24"/>
+          <w:szCs w:val="24"/>
+          <w:lang w:eastAsia="en-IN"/>
+        </w:rPr>
+      </w:pPr>
+      <w:r>
+        <w:rPr>
+          <w:rFonts w:ascii="Times New Roman" w:eastAsia="Times New Roman" w:hAnsi="Times New Roman" w:cs="Times New Roman"/>
+          <w:b/>
+          <w:bCs/>
+          <w:sz w:val="24"/>
+          <w:szCs w:val="24"/>
+          <w:lang w:eastAsia="en-IN"/>
+        </w:rPr>
+        <w:pict w14:anchorId="65021022">
+          <v:rect id="_x0000_i1074" style="width:0;height:1.5pt" o:hralign="center" o:hrstd="t" o:hr="t" fillcolor="#a0a0a0" stroked="f"/>
+        </w:pict>
+      </w:r>
+    </w:p>
+    <w:p>
+      <w:pPr>
+        <w:spacing w:before="100" w:beforeAutospacing="1" w:after="100" w:afterAutospacing="1" w:line="240" w:lineRule="auto"/>
+        <w:outlineLvl w:val="3"/>
+        <w:rPr>
+          <w:rFonts w:ascii="Times New Roman" w:eastAsia="Times New Roman" w:hAnsi="Times New Roman" w:cs="Times New Roman"/>
+          <w:b/>
+          <w:bCs/>
+          <w:sz w:val="24"/>
+          <w:szCs w:val="24"/>
+          <w:lang w:eastAsia="en-IN"/>
+        </w:rPr>
+      </w:pPr>
+      <w:r>
+        <w:rPr>
+          <w:rFonts w:ascii="Times New Roman" w:eastAsia="Times New Roman" w:hAnsi="Times New Roman" w:cs="Times New Roman"/>
+          <w:b/>
+          <w:bCs/>
+          <w:sz w:val="24"/>
+          <w:szCs w:val="24"/>
+          <w:lang w:eastAsia="en-IN"/>
+        </w:rPr>
+        <w:t>4.</w:t>
+      </w:r>
+      <w:r>
+        <w:rPr>
+          <w:rFonts w:ascii="Times New Roman" w:eastAsia="Times New Roman" w:hAnsi="Times New Roman" w:cs="Times New Roman"/>
+          <w:b/>
+          <w:bCs/>
+          <w:sz w:val="24"/>
+          <w:szCs w:val="24"/>
+          <w:lang w:eastAsia="en-IN"/>
+        </w:rPr>
+        <w:t>6</w:t>
+      </w:r>
+      <w:r>
+        <w:rPr>
+          <w:rFonts w:ascii="Times New Roman" w:eastAsia="Times New Roman" w:hAnsi="Times New Roman" w:cs="Times New Roman"/>
+          <w:b/>
+          <w:bCs/>
+          <w:sz w:val="24"/>
+          <w:szCs w:val="24"/>
+          <w:lang w:eastAsia="en-IN"/>
+        </w:rPr>
+        <w:t xml:space="preserve"> Scheduler Service Design (DS-Sched-01)</w:t>
+      </w:r>
+    </w:p>
+    <w:p>
+      <w:pPr>
+        <w:spacing w:before="100" w:beforeAutospacing="1" w:after="100" w:afterAutospacing="1" w:line="240" w:lineRule="auto"/>
+        <w:outlineLvl w:val="3"/>
+        <w:rPr>
+          <w:rFonts w:ascii="Times New Roman" w:eastAsia="Times New Roman" w:hAnsi="Times New Roman" w:cs="Times New Roman"/>
+          <w:b/>
+          <w:bCs/>
+          <w:sz w:val="24"/>
+          <w:szCs w:val="24"/>
+          <w:lang w:eastAsia="en-IN"/>
+        </w:rPr>
+      </w:pPr>
+      <w:r>
+        <w:rPr>
+          <w:rFonts w:ascii="Times New Roman" w:eastAsia="Times New Roman" w:hAnsi="Times New Roman" w:cs="Times New Roman"/>
+          <w:b/>
+          <w:bCs/>
+          <w:sz w:val="24"/>
+          <w:szCs w:val="24"/>
+          <w:lang w:eastAsia="en-IN"/>
+        </w:rPr>
+        <w:t>Design for scheduling posts, handling timestamps, and triggering automatic publishing.</w:t>
+      </w:r>
+      <w:r>
+        <w:rPr>
+          <w:rFonts w:ascii="Times New Roman" w:eastAsia="Times New Roman" w:hAnsi="Times New Roman" w:cs="Times New Roman"/>
+          <w:b/>
+          <w:bCs/>
+          <w:sz w:val="24"/>
+          <w:szCs w:val="24"/>
+          <w:lang w:eastAsia="en-IN"/>
+        </w:rPr>
+        <w:br/>
+        <w:t>Maps to: SMMS-F-008, SMMS-F-009, SMMS-F-010, SMMS-F-011.</w:t>
+      </w:r>
+    </w:p>
+    <w:p>
+      <w:pPr>
+        <w:spacing w:before="100" w:beforeAutospacing="1" w:after="100" w:afterAutospacing="1" w:line="240" w:lineRule="auto"/>
+        <w:outlineLvl w:val="3"/>
+        <w:rPr>
+          <w:rFonts w:ascii="Times New Roman" w:eastAsia="Times New Roman" w:hAnsi="Times New Roman" w:cs="Times New Roman"/>
+          <w:b/>
+          <w:bCs/>
+          <w:sz w:val="24"/>
+          <w:szCs w:val="24"/>
+          <w:lang w:eastAsia="en-IN"/>
+        </w:rPr>
+      </w:pPr>
+      <w:r>
+        <w:rPr>
+          <w:rFonts w:ascii="Times New Roman" w:eastAsia="Times New Roman" w:hAnsi="Times New Roman" w:cs="Times New Roman"/>
+          <w:b/>
+          <w:bCs/>
+          <w:sz w:val="24"/>
+          <w:szCs w:val="24"/>
+          <w:lang w:eastAsia="en-IN"/>
+        </w:rPr>
+        <w:pict w14:anchorId="1B31DDEB">
+          <v:rect id="_x0000_i1075" style="width:0;height:1.5pt" o:hralign="center" o:hrstd="t" o:hr="t" fillcolor="#a0a0a0" stroked="f"/>
+        </w:pict>
+      </w:r>
+    </w:p>
+    <w:p>
+      <w:pPr>
+        <w:spacing w:before="100" w:beforeAutospacing="1" w:after="100" w:afterAutospacing="1" w:line="240" w:lineRule="auto"/>
+        <w:outlineLvl w:val="3"/>
+        <w:rPr>
+          <w:rFonts w:ascii="Times New Roman" w:eastAsia="Times New Roman" w:hAnsi="Times New Roman" w:cs="Times New Roman"/>
+          <w:b/>
+          <w:bCs/>
+          <w:sz w:val="24"/>
+          <w:szCs w:val="24"/>
+          <w:lang w:eastAsia="en-IN"/>
+        </w:rPr>
+      </w:pPr>
+      <w:r>
+        <w:rPr>
+          <w:rFonts w:ascii="Times New Roman" w:eastAsia="Times New Roman" w:hAnsi="Times New Roman" w:cs="Times New Roman"/>
+          <w:b/>
+          <w:bCs/>
+          <w:sz w:val="24"/>
+          <w:szCs w:val="24"/>
+          <w:lang w:eastAsia="en-IN"/>
+        </w:rPr>
+        <w:lastRenderedPageBreak/>
+        <w:t>4.</w:t>
+      </w:r>
+      <w:r>
+        <w:rPr>
+          <w:rFonts w:ascii="Times New Roman" w:eastAsia="Times New Roman" w:hAnsi="Times New Roman" w:cs="Times New Roman"/>
+          <w:b/>
+          <w:bCs/>
+          <w:sz w:val="24"/>
+          <w:szCs w:val="24"/>
+          <w:lang w:eastAsia="en-IN"/>
+        </w:rPr>
+        <w:t>7</w:t>
+      </w:r>
+      <w:r>
+        <w:rPr>
+          <w:rFonts w:ascii="Times New Roman" w:eastAsia="Times New Roman" w:hAnsi="Times New Roman" w:cs="Times New Roman"/>
+          <w:b/>
+          <w:bCs/>
+          <w:sz w:val="24"/>
+          <w:szCs w:val="24"/>
+          <w:lang w:eastAsia="en-IN"/>
+        </w:rPr>
+        <w:t xml:space="preserve"> Analytics Module Design (DS-Analy-01)</w:t>
+      </w:r>
+    </w:p>
+    <w:p>
+      <w:pPr>
+        <w:spacing w:before="100" w:beforeAutospacing="1" w:after="100" w:afterAutospacing="1" w:line="240" w:lineRule="auto"/>
+        <w:outlineLvl w:val="3"/>
+        <w:rPr>
+          <w:rFonts w:ascii="Times New Roman" w:eastAsia="Times New Roman" w:hAnsi="Times New Roman" w:cs="Times New Roman"/>
+          <w:b/>
+          <w:bCs/>
+          <w:sz w:val="24"/>
+          <w:szCs w:val="24"/>
+          <w:lang w:eastAsia="en-IN"/>
+        </w:rPr>
+      </w:pPr>
+      <w:r>
+        <w:rPr>
+          <w:rFonts w:ascii="Times New Roman" w:eastAsia="Times New Roman" w:hAnsi="Times New Roman" w:cs="Times New Roman"/>
+          <w:b/>
+          <w:bCs/>
+          <w:sz w:val="24"/>
+          <w:szCs w:val="24"/>
+          <w:lang w:eastAsia="en-IN"/>
+        </w:rPr>
+        <w:t>Describes calculations for total posts, scheduled posts, published posts.</w:t>
+      </w:r>
+      <w:r>
+        <w:rPr>
+          <w:rFonts w:ascii="Times New Roman" w:eastAsia="Times New Roman" w:hAnsi="Times New Roman" w:cs="Times New Roman"/>
+          <w:b/>
+          <w:bCs/>
+          <w:sz w:val="24"/>
+          <w:szCs w:val="24"/>
+          <w:lang w:eastAsia="en-IN"/>
+        </w:rPr>
+        <w:br/>
+        <w:t>Maps to: SMMS-F-013.</w:t>
+      </w:r>
+    </w:p>
+    <w:p>
+      <w:pPr>
+        <w:spacing w:before="100" w:beforeAutospacing="1" w:after="100" w:afterAutospacing="1" w:line="240" w:lineRule="auto"/>
+        <w:outlineLvl w:val="3"/>
+        <w:rPr>
+          <w:rFonts w:ascii="Times New Roman" w:eastAsia="Times New Roman" w:hAnsi="Times New Roman" w:cs="Times New Roman"/>
+          <w:b/>
+          <w:bCs/>
+          <w:sz w:val="24"/>
+          <w:szCs w:val="24"/>
+          <w:lang w:eastAsia="en-IN"/>
+        </w:rPr>
+      </w:pPr>
+      <w:r>
+        <w:rPr>
+          <w:rFonts w:ascii="Times New Roman" w:eastAsia="Times New Roman" w:hAnsi="Times New Roman" w:cs="Times New Roman"/>
+          <w:b/>
+          <w:bCs/>
+          <w:sz w:val="24"/>
+          <w:szCs w:val="24"/>
+          <w:lang w:eastAsia="en-IN"/>
+        </w:rPr>
+        <w:pict w14:anchorId="631B339F">
+          <v:rect id="_x0000_i1076" style="width:0;height:1.5pt" o:hralign="center" o:hrstd="t" o:hr="t" fillcolor="#a0a0a0" stroked="f"/>
+        </w:pict>
+      </w:r>
+    </w:p>
+    <w:p>
+      <w:pPr>
+        <w:spacing w:before="100" w:beforeAutospacing="1" w:after="100" w:afterAutospacing="1" w:line="240" w:lineRule="auto"/>
+        <w:outlineLvl w:val="3"/>
+        <w:rPr>
+          <w:rFonts w:ascii="Times New Roman" w:eastAsia="Times New Roman" w:hAnsi="Times New Roman" w:cs="Times New Roman"/>
+          <w:b/>
+          <w:bCs/>
+          <w:sz w:val="24"/>
+          <w:szCs w:val="24"/>
+          <w:lang w:eastAsia="en-IN"/>
+        </w:rPr>
+      </w:pPr>
+      <w:r>
+        <w:rPr>
+          <w:rFonts w:ascii="Times New Roman" w:eastAsia="Times New Roman" w:hAnsi="Times New Roman" w:cs="Times New Roman"/>
+          <w:b/>
+          <w:bCs/>
+          <w:sz w:val="24"/>
+          <w:szCs w:val="24"/>
+          <w:lang w:eastAsia="en-IN"/>
+        </w:rPr>
+        <w:t>4.</w:t>
+      </w:r>
+      <w:r>
+        <w:rPr>
+          <w:rFonts w:ascii="Times New Roman" w:eastAsia="Times New Roman" w:hAnsi="Times New Roman" w:cs="Times New Roman"/>
+          <w:b/>
+          <w:bCs/>
+          <w:sz w:val="24"/>
+          <w:szCs w:val="24"/>
+          <w:lang w:eastAsia="en-IN"/>
+        </w:rPr>
+        <w:t>8</w:t>
+      </w:r>
+      <w:r>
+        <w:rPr>
+          <w:rFonts w:ascii="Times New Roman" w:eastAsia="Times New Roman" w:hAnsi="Times New Roman" w:cs="Times New Roman"/>
+          <w:b/>
+          <w:bCs/>
+          <w:sz w:val="24"/>
+          <w:szCs w:val="24"/>
+          <w:lang w:eastAsia="en-IN"/>
+        </w:rPr>
+        <w:t xml:space="preserve"> Admin Management Module Design (DS-Admin-01)</w:t>
+      </w:r>
+    </w:p>
+    <w:p>
+      <w:pPr>
+        <w:spacing w:before="100" w:beforeAutospacing="1" w:after="100" w:afterAutospacing="1" w:line="240" w:lineRule="auto"/>
+        <w:outlineLvl w:val="3"/>
+        <w:rPr>
+          <w:rFonts w:ascii="Times New Roman" w:eastAsia="Times New Roman" w:hAnsi="Times New Roman" w:cs="Times New Roman"/>
+          <w:b/>
+          <w:bCs/>
+          <w:sz w:val="24"/>
+          <w:szCs w:val="24"/>
+          <w:lang w:eastAsia="en-IN"/>
+        </w:rPr>
+      </w:pPr>
+      <w:r>
+        <w:rPr>
+          <w:rFonts w:ascii="Times New Roman" w:eastAsia="Times New Roman" w:hAnsi="Times New Roman" w:cs="Times New Roman"/>
+          <w:b/>
+          <w:bCs/>
+          <w:sz w:val="24"/>
+          <w:szCs w:val="24"/>
+          <w:lang w:eastAsia="en-IN"/>
+        </w:rPr>
+        <w:t>Covers admin operations such as viewing users, deactivating users, and managing system access.</w:t>
+      </w:r>
+      <w:r>
+        <w:rPr>
+          <w:rFonts w:ascii="Times New Roman" w:eastAsia="Times New Roman" w:hAnsi="Times New Roman" w:cs="Times New Roman"/>
+          <w:b/>
+          <w:bCs/>
+          <w:sz w:val="24"/>
+          <w:szCs w:val="24"/>
+          <w:lang w:eastAsia="en-IN"/>
+        </w:rPr>
+        <w:br/>
+        <w:t>Maps to: SMMS-F-014.</w:t>
+      </w:r>
+    </w:p>
+    <w:p>
+      <w:pPr>
+        <w:spacing w:before="100" w:beforeAutospacing="1" w:after="100" w:afterAutospacing="1" w:line="240" w:lineRule="auto"/>
+        <w:outlineLvl w:val="3"/>
+        <w:rPr>
+          <w:rFonts w:ascii="Times New Roman" w:eastAsia="Times New Roman" w:hAnsi="Times New Roman" w:cs="Times New Roman"/>
+          <w:b/>
+          <w:bCs/>
+          <w:sz w:val="24"/>
+          <w:szCs w:val="24"/>
+          <w:lang w:eastAsia="en-IN"/>
+        </w:rPr>
+      </w:pPr>
+      <w:r>
+        <w:rPr>
+          <w:rFonts w:ascii="Times New Roman" w:eastAsia="Times New Roman" w:hAnsi="Times New Roman" w:cs="Times New Roman"/>
+          <w:b/>
+          <w:bCs/>
+          <w:sz w:val="24"/>
+          <w:szCs w:val="24"/>
+          <w:lang w:eastAsia="en-IN"/>
+        </w:rPr>
+        <w:pict w14:anchorId="25983DE5">
+          <v:rect id="_x0000_i1077" style="width:0;height:1.5pt" o:hralign="center" o:hrstd="t" o:hr="t" fillcolor="#a0a0a0" stroked="f"/>
+        </w:pict>
+      </w:r>
+    </w:p>
+    <w:p>
+      <w:pPr>
+        <w:spacing w:before="100" w:beforeAutospacing="1" w:after="100" w:afterAutospacing="1" w:line="240" w:lineRule="auto"/>
+        <w:outlineLvl w:val="3"/>
+        <w:rPr>
+          <w:rFonts w:ascii="Times New Roman" w:eastAsia="Times New Roman" w:hAnsi="Times New Roman" w:cs="Times New Roman"/>
+          <w:b/>
+          <w:bCs/>
+          <w:sz w:val="24"/>
+          <w:szCs w:val="24"/>
+          <w:lang w:eastAsia="en-IN"/>
+        </w:rPr>
+      </w:pPr>
+      <w:r>
+        <w:rPr>
+          <w:rFonts w:ascii="Times New Roman" w:eastAsia="Times New Roman" w:hAnsi="Times New Roman" w:cs="Times New Roman"/>
+          <w:b/>
+          <w:bCs/>
+          <w:sz w:val="24"/>
+          <w:szCs w:val="24"/>
+          <w:lang w:eastAsia="en-IN"/>
+        </w:rPr>
+        <w:t>4.</w:t>
+      </w:r>
+      <w:r>
+        <w:rPr>
+          <w:rFonts w:ascii="Times New Roman" w:eastAsia="Times New Roman" w:hAnsi="Times New Roman" w:cs="Times New Roman"/>
+          <w:b/>
+          <w:bCs/>
+          <w:sz w:val="24"/>
+          <w:szCs w:val="24"/>
+          <w:lang w:eastAsia="en-IN"/>
+        </w:rPr>
+        <w:t>9</w:t>
+      </w:r>
+      <w:r>
+        <w:rPr>
+          <w:rFonts w:ascii="Times New Roman" w:eastAsia="Times New Roman" w:hAnsi="Times New Roman" w:cs="Times New Roman"/>
+          <w:b/>
+          <w:bCs/>
+          <w:sz w:val="24"/>
+          <w:szCs w:val="24"/>
+          <w:lang w:eastAsia="en-IN"/>
+        </w:rPr>
+        <w:t xml:space="preserve"> Notification Module Design (DS-Notif-01)</w:t>
+      </w:r>
+    </w:p>
+    <w:p>
+      <w:pPr>
+        <w:spacing w:before="100" w:beforeAutospacing="1" w:after="100" w:afterAutospacing="1" w:line="240" w:lineRule="auto"/>
+        <w:outlineLvl w:val="3"/>
+        <w:rPr>
+          <w:rFonts w:ascii="Times New Roman" w:eastAsia="Times New Roman" w:hAnsi="Times New Roman" w:cs="Times New Roman"/>
+          <w:b/>
+          <w:bCs/>
+          <w:sz w:val="24"/>
+          <w:szCs w:val="24"/>
+          <w:lang w:eastAsia="en-IN"/>
+        </w:rPr>
+      </w:pPr>
+      <w:r>
+        <w:rPr>
+          <w:rFonts w:ascii="Times New Roman" w:eastAsia="Times New Roman" w:hAnsi="Times New Roman" w:cs="Times New Roman"/>
+          <w:b/>
+          <w:bCs/>
+          <w:sz w:val="24"/>
+          <w:szCs w:val="24"/>
+          <w:lang w:eastAsia="en-IN"/>
+        </w:rPr>
+        <w:t>Specifies design for success/failure messages for post creation, scheduling, updates.</w:t>
+      </w:r>
+      <w:r>
+        <w:rPr>
+          <w:rFonts w:ascii="Times New Roman" w:eastAsia="Times New Roman" w:hAnsi="Times New Roman" w:cs="Times New Roman"/>
+          <w:b/>
+          <w:bCs/>
+          <w:sz w:val="24"/>
+          <w:szCs w:val="24"/>
+          <w:lang w:eastAsia="en-IN"/>
+        </w:rPr>
+        <w:br/>
+        <w:t>Maps to: SMMS-F-015.</w:t>
+      </w:r>
+    </w:p>
+    <w:p>
+      <w:pPr>
+        <w:spacing w:before="100" w:beforeAutospacing="1" w:after="100" w:afterAutospacing="1" w:line="240" w:lineRule="auto"/>
+        <w:outlineLvl w:val="3"/>
+        <w:rPr>
+          <w:rFonts w:ascii="Times New Roman" w:eastAsia="Times New Roman" w:hAnsi="Times New Roman" w:cs="Times New Roman"/>
+          <w:b/>
+          <w:bCs/>
+          <w:sz w:val="24"/>
+          <w:szCs w:val="24"/>
+          <w:lang w:eastAsia="en-IN"/>
+        </w:rPr>
+      </w:pPr>
+      <w:r>
+        <w:rPr>
+          <w:rFonts w:ascii="Times New Roman" w:eastAsia="Times New Roman" w:hAnsi="Times New Roman" w:cs="Times New Roman"/>
+          <w:b/>
+          <w:bCs/>
+          <w:sz w:val="24"/>
+          <w:szCs w:val="24"/>
+          <w:lang w:eastAsia="en-IN"/>
+        </w:rPr>
+        <w:pict w14:anchorId="5C8B3994">
+          <v:rect id="_x0000_i1078" style="width:0;height:1.5pt" o:hralign="center" o:hrstd="t" o:hr="t" fillcolor="#a0a0a0" stroked="f"/>
+        </w:pict>
+      </w:r>
+    </w:p>
+    <w:p>
+      <w:pPr>
+        <w:spacing w:before="100" w:beforeAutospacing="1" w:after="100" w:afterAutospacing="1" w:line="240" w:lineRule="auto"/>
+        <w:outlineLvl w:val="3"/>
+        <w:rPr>
+          <w:rFonts w:ascii="Times New Roman" w:eastAsia="Times New Roman" w:hAnsi="Times New Roman" w:cs="Times New Roman"/>
+          <w:b/>
+          <w:bCs/>
+          <w:sz w:val="24"/>
+          <w:szCs w:val="24"/>
+          <w:lang w:eastAsia="en-IN"/>
+        </w:rPr>
+      </w:pPr>
+      <w:r>
+        <w:rPr>
+          <w:rFonts w:ascii="Times New Roman" w:eastAsia="Times New Roman" w:hAnsi="Times New Roman" w:cs="Times New Roman"/>
+          <w:b/>
+          <w:bCs/>
+          <w:sz w:val="24"/>
+          <w:szCs w:val="24"/>
+          <w:lang w:eastAsia="en-IN"/>
+        </w:rPr>
+        <w:t>4.</w:t>
+      </w:r>
+      <w:r>
+        <w:rPr>
+          <w:rFonts w:ascii="Times New Roman" w:eastAsia="Times New Roman" w:hAnsi="Times New Roman" w:cs="Times New Roman"/>
+          <w:b/>
+          <w:bCs/>
+          <w:sz w:val="24"/>
+          <w:szCs w:val="24"/>
+          <w:lang w:eastAsia="en-IN"/>
+        </w:rPr>
+        <w:t>10</w:t>
+      </w:r>
+      <w:r>
+        <w:rPr>
+          <w:rFonts w:ascii="Times New Roman" w:eastAsia="Times New Roman" w:hAnsi="Times New Roman" w:cs="Times New Roman"/>
+          <w:b/>
+          <w:bCs/>
+          <w:sz w:val="24"/>
+          <w:szCs w:val="24"/>
+          <w:lang w:eastAsia="en-IN"/>
+        </w:rPr>
+        <w:t xml:space="preserve"> Security Architecture Details (DS-Sec-01)</w:t>
+      </w:r>
+    </w:p>
+    <w:p>
+      <w:pPr>
+        <w:spacing w:before="100" w:beforeAutospacing="1" w:after="100" w:afterAutospacing="1" w:line="240" w:lineRule="auto"/>
+        <w:outlineLvl w:val="3"/>
+        <w:rPr>
+          <w:rFonts w:ascii="Times New Roman" w:eastAsia="Times New Roman" w:hAnsi="Times New Roman" w:cs="Times New Roman"/>
+          <w:b/>
+          <w:bCs/>
+          <w:sz w:val="24"/>
+          <w:szCs w:val="24"/>
+          <w:lang w:eastAsia="en-IN"/>
+        </w:rPr>
+      </w:pPr>
+      <w:r>
+        <w:rPr>
+          <w:rFonts w:ascii="Times New Roman" w:eastAsia="Times New Roman" w:hAnsi="Times New Roman" w:cs="Times New Roman"/>
+          <w:b/>
+          <w:bCs/>
+          <w:sz w:val="24"/>
+          <w:szCs w:val="24"/>
+          <w:lang w:eastAsia="en-IN"/>
+        </w:rPr>
+        <w:t>Expands on hashing, session timeout, input validation, HTTPS/TLS, and safe data handling.</w:t>
+      </w:r>
+      <w:r>
+        <w:rPr>
+          <w:rFonts w:ascii="Times New Roman" w:eastAsia="Times New Roman" w:hAnsi="Times New Roman" w:cs="Times New Roman"/>
+          <w:b/>
+          <w:bCs/>
+          <w:sz w:val="24"/>
+          <w:szCs w:val="24"/>
+          <w:lang w:eastAsia="en-IN"/>
+        </w:rPr>
+        <w:br/>
+        <w:t>Maps to: SMMS-SR-001, SMMS-SR-002, SMMS-SR-003, SMMS-SR-004, SMMS-SR-005.</w:t>
+      </w:r>
+    </w:p>
+    <w:p>
+      <w:pPr>
+        <w:spacing w:before="100" w:beforeAutospacing="1" w:after="100" w:afterAutospacing="1" w:line="240" w:lineRule="auto"/>
+        <w:outlineLvl w:val="3"/>
+        <w:rPr>
+          <w:rFonts w:ascii="Times New Roman" w:eastAsia="Times New Roman" w:hAnsi="Times New Roman" w:cs="Times New Roman"/>
+          <w:b/>
+          <w:bCs/>
+          <w:sz w:val="24"/>
+          <w:szCs w:val="24"/>
+          <w:lang w:eastAsia="en-IN"/>
+        </w:rPr>
+      </w:pPr>
+    </w:p>
+    <w:p>
+      <w:pPr>
+        <w:spacing w:before="100" w:beforeAutospacing="1" w:after="100" w:afterAutospacing="1" w:line="240" w:lineRule="auto"/>
+        <w:outlineLvl w:val="3"/>
+        <w:rPr>
+          <w:rFonts w:ascii="Times New Roman" w:eastAsia="Times New Roman" w:hAnsi="Times New Roman" w:cs="Times New Roman"/>
+          <w:b/>
+          <w:bCs/>
+          <w:sz w:val="24"/>
+          <w:szCs w:val="24"/>
+          <w:lang w:eastAsia="en-IN"/>
+        </w:rPr>
+      </w:pPr>
+      <w:r>
+        <w:rPr>
+          <w:rFonts w:ascii="Times New Roman" w:eastAsia="Times New Roman" w:hAnsi="Times New Roman" w:cs="Times New Roman"/>
+          <w:b/>
+          <w:bCs/>
+          <w:sz w:val="24"/>
+          <w:szCs w:val="24"/>
+          <w:lang w:eastAsia="en-IN"/>
+        </w:rPr>
+        <w:t>4.</w:t>
+      </w:r>
+      <w:r>
+        <w:rPr>
+          <w:rFonts w:ascii="Times New Roman" w:eastAsia="Times New Roman" w:hAnsi="Times New Roman" w:cs="Times New Roman"/>
+          <w:b/>
+          <w:bCs/>
+          <w:sz w:val="24"/>
+          <w:szCs w:val="24"/>
+          <w:lang w:eastAsia="en-IN"/>
+        </w:rPr>
+        <w:t>11</w:t>
+      </w:r>
+      <w:r>
+        <w:rPr>
+          <w:rFonts w:ascii="Times New Roman" w:eastAsia="Times New Roman" w:hAnsi="Times New Roman" w:cs="Times New Roman"/>
+          <w:b/>
+          <w:bCs/>
+          <w:sz w:val="24"/>
+          <w:szCs w:val="24"/>
+          <w:lang w:eastAsia="en-IN"/>
+        </w:rPr>
+        <w:t xml:space="preserve"> API Design</w:t>
       </w:r>
     </w:p>
     <w:p>
@@ -3551,16 +4343,53 @@
           <w:lang w:eastAsia="en-IN"/>
         </w:rPr>
       </w:pPr>
-      <w:r>
-        <w:rPr>
-          <w:rFonts w:ascii="Times New Roman" w:eastAsia="Times New Roman" w:hAnsi="Times New Roman" w:cs="Times New Roman"/>
-          <w:b/>
-          <w:bCs/>
-          <w:sz w:val="24"/>
-          <w:szCs w:val="24"/>
-          <w:lang w:eastAsia="en-IN"/>
-        </w:rPr>
-        <w:t>4.4 Error Handling, Logging &amp; Monitoring</w:t>
+    </w:p>
+    <w:p>
+      <w:pPr>
+        <w:spacing w:before="100" w:beforeAutospacing="1" w:after="100" w:afterAutospacing="1" w:line="240" w:lineRule="auto"/>
+        <w:outlineLvl w:val="3"/>
+        <w:rPr>
+          <w:rFonts w:ascii="Times New Roman" w:eastAsia="Times New Roman" w:hAnsi="Times New Roman" w:cs="Times New Roman"/>
+          <w:b/>
+          <w:bCs/>
+          <w:sz w:val="24"/>
+          <w:szCs w:val="24"/>
+          <w:lang w:eastAsia="en-IN"/>
+        </w:rPr>
+      </w:pPr>
+      <w:r>
+        <w:rPr>
+          <w:rFonts w:ascii="Times New Roman" w:eastAsia="Times New Roman" w:hAnsi="Times New Roman" w:cs="Times New Roman"/>
+          <w:b/>
+          <w:bCs/>
+          <w:sz w:val="24"/>
+          <w:szCs w:val="24"/>
+          <w:lang w:eastAsia="en-IN"/>
+        </w:rPr>
+        <w:lastRenderedPageBreak/>
+        <w:t>4.</w:t>
+      </w:r>
+      <w:r>
+        <w:rPr>
+          <w:rFonts w:ascii="Times New Roman" w:eastAsia="Times New Roman" w:hAnsi="Times New Roman" w:cs="Times New Roman"/>
+          <w:b/>
+          <w:bCs/>
+          <w:sz w:val="24"/>
+          <w:szCs w:val="24"/>
+          <w:lang w:eastAsia="en-IN"/>
+        </w:rPr>
+        <w:t>12</w:t>
+      </w:r>
+      <w:r>
+        <w:rPr>
+          <w:rFonts w:ascii="Times New Roman" w:eastAsia="Times New Roman" w:hAnsi="Times New Roman" w:cs="Times New Roman"/>
+          <w:b/>
+          <w:bCs/>
+          <w:sz w:val="24"/>
+          <w:szCs w:val="24"/>
+          <w:lang w:eastAsia="en-IN"/>
+        </w:rPr>
+        <w:t xml:space="preserve"> Error Handling, Logging &amp; Monitoring</w:t>
       </w:r>
     </w:p>
     <w:p>
@@ -3635,6 +4464,331 @@
     </w:p>
     <w:p>
       <w:pPr>
+        <w:pStyle w:val="Heading3"/>
+      </w:pPr>
+      <w:r>
+        <w:rPr>
+          <w:rStyle w:val="Strong"/>
+          <w:b/>
+          <w:bCs/>
+        </w:rPr>
+        <w:t>4.</w:t>
+      </w:r>
+      <w:r>
+        <w:rPr>
+          <w:rStyle w:val="Strong"/>
+          <w:b/>
+          <w:bCs/>
+        </w:rPr>
+        <w:t>13</w:t>
+      </w:r>
+      <w:r>
+        <w:rPr>
+          <w:rStyle w:val="Strong"/>
+          <w:b/>
+          <w:bCs/>
+        </w:rPr>
+        <w:t xml:space="preserve"> Performance Design (DS-Perf-01)</w:t>
+      </w:r>
+    </w:p>
+    <w:p>
+      <w:pPr>
+        <w:pStyle w:val="NormalWeb"/>
+      </w:pPr>
+      <w:r>
+        <w:t>Defines performance considerations needed to meet a ≤2s system response time.</w:t>
+      </w:r>
+    </w:p>
+    <w:p>
+      <w:pPr>
+        <w:spacing w:before="100" w:beforeAutospacing="1" w:after="100" w:afterAutospacing="1" w:line="240" w:lineRule="auto"/>
+        <w:outlineLvl w:val="2"/>
+        <w:rPr>
+          <w:rFonts w:ascii="Times New Roman" w:eastAsia="Times New Roman" w:hAnsi="Times New Roman" w:cs="Times New Roman"/>
+          <w:b/>
+          <w:bCs/>
+          <w:sz w:val="27"/>
+          <w:szCs w:val="27"/>
+          <w:lang w:eastAsia="en-IN"/>
+        </w:rPr>
+      </w:pPr>
+      <w:r>
+        <w:rPr>
+          <w:rFonts w:ascii="Times New Roman" w:eastAsia="Times New Roman" w:hAnsi="Times New Roman" w:cs="Times New Roman"/>
+          <w:b/>
+          <w:bCs/>
+          <w:sz w:val="27"/>
+          <w:szCs w:val="27"/>
+          <w:lang w:eastAsia="en-IN"/>
+        </w:rPr>
+        <w:t>4.</w:t>
+      </w:r>
+      <w:r>
+        <w:rPr>
+          <w:rFonts w:ascii="Times New Roman" w:eastAsia="Times New Roman" w:hAnsi="Times New Roman" w:cs="Times New Roman"/>
+          <w:b/>
+          <w:bCs/>
+          <w:sz w:val="27"/>
+          <w:szCs w:val="27"/>
+          <w:lang w:eastAsia="en-IN"/>
+        </w:rPr>
+        <w:t>14</w:t>
+      </w:r>
+      <w:r>
+        <w:rPr>
+          <w:rFonts w:ascii="Times New Roman" w:eastAsia="Times New Roman" w:hAnsi="Times New Roman" w:cs="Times New Roman"/>
+          <w:b/>
+          <w:bCs/>
+          <w:sz w:val="27"/>
+          <w:szCs w:val="27"/>
+          <w:lang w:eastAsia="en-IN"/>
+        </w:rPr>
+        <w:t xml:space="preserve"> Reliability Design (DS-Rel-01)</w:t>
+      </w:r>
+    </w:p>
+    <w:p>
+      <w:pPr>
+        <w:pStyle w:val="ListParagraph"/>
+        <w:numPr>
+          <w:ilvl w:val="0"/>
+          <w:numId w:val="12"/>
+        </w:numPr>
+        <w:spacing w:before="100" w:beforeAutospacing="1" w:after="100" w:afterAutospacing="1" w:line="240" w:lineRule="auto"/>
+        <w:rPr>
+          <w:rFonts w:ascii="Times New Roman" w:eastAsia="Times New Roman" w:hAnsi="Times New Roman" w:cs="Times New Roman"/>
+          <w:sz w:val="24"/>
+          <w:szCs w:val="24"/>
+          <w:lang w:eastAsia="en-IN"/>
+        </w:rPr>
+      </w:pPr>
+      <w:r>
+        <w:rPr>
+          <w:rFonts w:ascii="Times New Roman" w:eastAsia="Times New Roman" w:hAnsi="Times New Roman" w:cs="Times New Roman"/>
+          <w:sz w:val="24"/>
+          <w:szCs w:val="24"/>
+          <w:lang w:eastAsia="en-IN"/>
+        </w:rPr>
+        <w:t>Defines design elements required to support ~50 concurrent users and basic uptime targets.</w:t>
+      </w:r>
+    </w:p>
+    <w:p>
+      <w:pPr>
+        <w:spacing w:before="100" w:beforeAutospacing="1" w:after="100" w:afterAutospacing="1" w:line="240" w:lineRule="auto"/>
+        <w:outlineLvl w:val="2"/>
+        <w:rPr>
+          <w:rFonts w:ascii="Times New Roman" w:eastAsia="Times New Roman" w:hAnsi="Times New Roman" w:cs="Times New Roman"/>
+          <w:b/>
+          <w:bCs/>
+          <w:sz w:val="27"/>
+          <w:szCs w:val="27"/>
+          <w:lang w:eastAsia="en-IN"/>
+        </w:rPr>
+      </w:pPr>
+      <w:r>
+        <w:rPr>
+          <w:rFonts w:ascii="Times New Roman" w:eastAsia="Times New Roman" w:hAnsi="Times New Roman" w:cs="Times New Roman"/>
+          <w:b/>
+          <w:bCs/>
+          <w:sz w:val="27"/>
+          <w:szCs w:val="27"/>
+          <w:lang w:eastAsia="en-IN"/>
+        </w:rPr>
+        <w:t>4.</w:t>
+      </w:r>
+      <w:r>
+        <w:rPr>
+          <w:rFonts w:ascii="Times New Roman" w:eastAsia="Times New Roman" w:hAnsi="Times New Roman" w:cs="Times New Roman"/>
+          <w:b/>
+          <w:bCs/>
+          <w:sz w:val="27"/>
+          <w:szCs w:val="27"/>
+          <w:lang w:eastAsia="en-IN"/>
+        </w:rPr>
+        <w:t>15</w:t>
+      </w:r>
+      <w:r>
+        <w:rPr>
+          <w:rFonts w:ascii="Times New Roman" w:eastAsia="Times New Roman" w:hAnsi="Times New Roman" w:cs="Times New Roman"/>
+          <w:b/>
+          <w:bCs/>
+          <w:sz w:val="27"/>
+          <w:szCs w:val="27"/>
+          <w:lang w:eastAsia="en-IN"/>
+        </w:rPr>
+        <w:t xml:space="preserve"> UI/Usability Design (DS-UI-01)</w:t>
+      </w:r>
+    </w:p>
+    <w:p>
+      <w:pPr>
+        <w:pStyle w:val="ListParagraph"/>
+        <w:numPr>
+          <w:ilvl w:val="0"/>
+          <w:numId w:val="12"/>
+        </w:numPr>
+        <w:spacing w:before="100" w:beforeAutospacing="1" w:after="100" w:afterAutospacing="1" w:line="240" w:lineRule="auto"/>
+        <w:rPr>
+          <w:rFonts w:ascii="Times New Roman" w:eastAsia="Times New Roman" w:hAnsi="Times New Roman" w:cs="Times New Roman"/>
+          <w:sz w:val="24"/>
+          <w:szCs w:val="24"/>
+          <w:lang w:eastAsia="en-IN"/>
+        </w:rPr>
+      </w:pPr>
+      <w:r>
+        <w:rPr>
+          <w:rFonts w:ascii="Times New Roman" w:eastAsia="Times New Roman" w:hAnsi="Times New Roman" w:cs="Times New Roman"/>
+          <w:sz w:val="24"/>
+          <w:szCs w:val="24"/>
+          <w:lang w:eastAsia="en-IN"/>
+        </w:rPr>
+        <w:t>Defines responsive UI layout, browser compatibility, and usability considerations.</w:t>
+      </w:r>
+    </w:p>
+    <w:p>
+      <w:pPr>
+        <w:spacing w:before="100" w:beforeAutospacing="1" w:after="100" w:afterAutospacing="1" w:line="240" w:lineRule="auto"/>
+        <w:outlineLvl w:val="2"/>
+        <w:rPr>
+          <w:rFonts w:ascii="Times New Roman" w:eastAsia="Times New Roman" w:hAnsi="Times New Roman" w:cs="Times New Roman"/>
+          <w:b/>
+          <w:bCs/>
+          <w:sz w:val="27"/>
+          <w:szCs w:val="27"/>
+          <w:lang w:eastAsia="en-IN"/>
+        </w:rPr>
+      </w:pPr>
+      <w:r>
+        <w:rPr>
+          <w:rFonts w:ascii="Times New Roman" w:eastAsia="Times New Roman" w:hAnsi="Times New Roman" w:cs="Times New Roman"/>
+          <w:b/>
+          <w:bCs/>
+          <w:sz w:val="27"/>
+          <w:szCs w:val="27"/>
+          <w:lang w:eastAsia="en-IN"/>
+        </w:rPr>
+        <w:t>4.</w:t>
+      </w:r>
+      <w:r>
+        <w:rPr>
+          <w:rFonts w:ascii="Times New Roman" w:eastAsia="Times New Roman" w:hAnsi="Times New Roman" w:cs="Times New Roman"/>
+          <w:b/>
+          <w:bCs/>
+          <w:sz w:val="27"/>
+          <w:szCs w:val="27"/>
+          <w:lang w:eastAsia="en-IN"/>
+        </w:rPr>
+        <w:t>16</w:t>
+      </w:r>
+      <w:r>
+        <w:rPr>
+          <w:rFonts w:ascii="Times New Roman" w:eastAsia="Times New Roman" w:hAnsi="Times New Roman" w:cs="Times New Roman"/>
+          <w:b/>
+          <w:bCs/>
+          <w:sz w:val="27"/>
+          <w:szCs w:val="27"/>
+          <w:lang w:eastAsia="en-IN"/>
+        </w:rPr>
+        <w:t xml:space="preserve"> Database Scalability Design (DS-DB-01)</w:t>
+      </w:r>
+    </w:p>
+    <w:p>
+      <w:pPr>
+        <w:pStyle w:val="ListParagraph"/>
+        <w:numPr>
+          <w:ilvl w:val="0"/>
+          <w:numId w:val="12"/>
+        </w:numPr>
+        <w:spacing w:before="100" w:beforeAutospacing="1" w:after="100" w:afterAutospacing="1" w:line="240" w:lineRule="auto"/>
+        <w:rPr>
+          <w:rFonts w:ascii="Times New Roman" w:eastAsia="Times New Roman" w:hAnsi="Times New Roman" w:cs="Times New Roman"/>
+          <w:sz w:val="24"/>
+          <w:szCs w:val="24"/>
+          <w:lang w:eastAsia="en-IN"/>
+        </w:rPr>
+      </w:pPr>
+      <w:r>
+        <w:rPr>
+          <w:rFonts w:ascii="Times New Roman" w:eastAsia="Times New Roman" w:hAnsi="Times New Roman" w:cs="Times New Roman"/>
+          <w:sz w:val="24"/>
+          <w:szCs w:val="24"/>
+          <w:lang w:eastAsia="en-IN"/>
+        </w:rPr>
+        <w:t>Defines database capacity, indexing, and storage considerations to support ≥1000 posts.</w:t>
+      </w:r>
+    </w:p>
+    <w:p>
+      <w:pPr>
+        <w:spacing w:before="100" w:beforeAutospacing="1" w:after="100" w:afterAutospacing="1" w:line="240" w:lineRule="auto"/>
+        <w:outlineLvl w:val="2"/>
+        <w:rPr>
+          <w:rFonts w:ascii="Times New Roman" w:eastAsia="Times New Roman" w:hAnsi="Times New Roman" w:cs="Times New Roman"/>
+          <w:b/>
+          <w:bCs/>
+          <w:sz w:val="27"/>
+          <w:szCs w:val="27"/>
+          <w:lang w:eastAsia="en-IN"/>
+        </w:rPr>
+      </w:pPr>
+      <w:r>
+        <w:rPr>
+          <w:rFonts w:ascii="Times New Roman" w:eastAsia="Times New Roman" w:hAnsi="Times New Roman" w:cs="Times New Roman"/>
+          <w:b/>
+          <w:bCs/>
+          <w:sz w:val="27"/>
+          <w:szCs w:val="27"/>
+          <w:lang w:eastAsia="en-IN"/>
+        </w:rPr>
+        <w:t>4.</w:t>
+      </w:r>
+      <w:r>
+        <w:rPr>
+          <w:rFonts w:ascii="Times New Roman" w:eastAsia="Times New Roman" w:hAnsi="Times New Roman" w:cs="Times New Roman"/>
+          <w:b/>
+          <w:bCs/>
+          <w:sz w:val="27"/>
+          <w:szCs w:val="27"/>
+          <w:lang w:eastAsia="en-IN"/>
+        </w:rPr>
+        <w:t>17</w:t>
+      </w:r>
+      <w:r>
+        <w:rPr>
+          <w:rFonts w:ascii="Times New Roman" w:eastAsia="Times New Roman" w:hAnsi="Times New Roman" w:cs="Times New Roman"/>
+          <w:b/>
+          <w:bCs/>
+          <w:sz w:val="27"/>
+          <w:szCs w:val="27"/>
+          <w:lang w:eastAsia="en-IN"/>
+        </w:rPr>
+        <w:t xml:space="preserve"> Maintainability &amp; Backup Design (DS-Maint-01)</w:t>
+      </w:r>
+    </w:p>
+    <w:p>
+      <w:pPr>
+        <w:pStyle w:val="ListParagraph"/>
+        <w:numPr>
+          <w:ilvl w:val="0"/>
+          <w:numId w:val="12"/>
+        </w:numPr>
+        <w:spacing w:before="100" w:beforeAutospacing="1" w:after="100" w:afterAutospacing="1" w:line="240" w:lineRule="auto"/>
+        <w:rPr>
+          <w:rFonts w:ascii="Times New Roman" w:eastAsia="Times New Roman" w:hAnsi="Times New Roman" w:cs="Times New Roman"/>
+          <w:sz w:val="24"/>
+          <w:szCs w:val="24"/>
+          <w:lang w:eastAsia="en-IN"/>
+        </w:rPr>
+      </w:pPr>
+      <w:r>
+        <w:rPr>
+          <w:rFonts w:ascii="Times New Roman" w:eastAsia="Times New Roman" w:hAnsi="Times New Roman" w:cs="Times New Roman"/>
+          <w:sz w:val="24"/>
+          <w:szCs w:val="24"/>
+          <w:lang w:eastAsia="en-IN"/>
+        </w:rPr>
+        <w:t>Defines manual backup approach and admin-level backup capabilities.</w:t>
+      </w:r>
+    </w:p>
+    <w:p>
+      <w:pPr>
         <w:spacing w:before="100" w:beforeAutospacing="1" w:after="100" w:afterAutospacing="1" w:line="240" w:lineRule="auto"/>
         <w:outlineLvl w:val="3"/>
         <w:rPr>
@@ -3655,27 +4809,48 @@
           <w:szCs w:val="24"/>
           <w:lang w:eastAsia="en-IN"/>
         </w:rPr>
-        <w:t>4.5 UX Design</w:t>
-      </w:r>
-    </w:p>
-    <w:p>
-      <w:pPr>
-        <w:spacing w:before="100" w:beforeAutospacing="1" w:after="100" w:afterAutospacing="1" w:line="240" w:lineRule="auto"/>
-        <w:rPr>
-          <w:rFonts w:ascii="Times New Roman" w:eastAsia="Times New Roman" w:hAnsi="Times New Roman" w:cs="Times New Roman"/>
-          <w:sz w:val="24"/>
-          <w:szCs w:val="24"/>
-          <w:lang w:eastAsia="en-IN"/>
-        </w:rPr>
-      </w:pPr>
-      <w:r>
-        <w:rPr>
-          <w:rFonts w:ascii="Times New Roman" w:eastAsia="Times New Roman" w:hAnsi="Times New Roman" w:cs="Times New Roman"/>
-          <w:sz w:val="24"/>
-          <w:szCs w:val="24"/>
-          <w:lang w:eastAsia="en-IN"/>
-        </w:rPr>
-        <w:lastRenderedPageBreak/>
+        <w:t>4.</w:t>
+      </w:r>
+      <w:r>
+        <w:rPr>
+          <w:rFonts w:ascii="Times New Roman" w:eastAsia="Times New Roman" w:hAnsi="Times New Roman" w:cs="Times New Roman"/>
+          <w:b/>
+          <w:bCs/>
+          <w:sz w:val="24"/>
+          <w:szCs w:val="24"/>
+          <w:lang w:eastAsia="en-IN"/>
+        </w:rPr>
+        <w:t>18</w:t>
+      </w:r>
+      <w:r>
+        <w:rPr>
+          <w:rFonts w:ascii="Times New Roman" w:eastAsia="Times New Roman" w:hAnsi="Times New Roman" w:cs="Times New Roman"/>
+          <w:b/>
+          <w:bCs/>
+          <w:sz w:val="24"/>
+          <w:szCs w:val="24"/>
+          <w:lang w:eastAsia="en-IN"/>
+        </w:rPr>
+        <w:t xml:space="preserve"> UX Design</w:t>
+      </w:r>
+    </w:p>
+    <w:p>
+      <w:pPr>
+        <w:spacing w:before="100" w:beforeAutospacing="1" w:after="100" w:afterAutospacing="1" w:line="240" w:lineRule="auto"/>
+        <w:rPr>
+          <w:rFonts w:ascii="Times New Roman" w:eastAsia="Times New Roman" w:hAnsi="Times New Roman" w:cs="Times New Roman"/>
+          <w:sz w:val="24"/>
+          <w:szCs w:val="24"/>
+          <w:lang w:eastAsia="en-IN"/>
+        </w:rPr>
+      </w:pPr>
+      <w:r>
+        <w:rPr>
+          <w:rFonts w:ascii="Times New Roman" w:eastAsia="Times New Roman" w:hAnsi="Times New Roman" w:cs="Times New Roman"/>
+          <w:sz w:val="24"/>
+          <w:szCs w:val="24"/>
+          <w:lang w:eastAsia="en-IN"/>
+        </w:rPr>
         <w:t>The system will be designed with a user-friendly interface. Based on the Use Case Diagram, the UX will be tailored for both User and Admin roles, providing clear flows for tasks such as creating posts, viewing analytics, and managing users.</w:t>
       </w:r>
     </w:p>
@@ -3701,7 +4876,29 @@
           <w:szCs w:val="24"/>
           <w:lang w:eastAsia="en-IN"/>
         </w:rPr>
-        <w:t>4.6 Open Issues &amp; Next Steps</w:t>
+        <w:t>4.</w:t>
+      </w:r>
+      <w:r>
+        <w:rPr>
+          <w:rFonts w:ascii="Times New Roman" w:eastAsia="Times New Roman" w:hAnsi="Times New Roman" w:cs="Times New Roman"/>
+          <w:b/>
+          <w:bCs/>
+          <w:sz w:val="24"/>
+          <w:szCs w:val="24"/>
+          <w:lang w:eastAsia="en-IN"/>
+        </w:rPr>
+        <w:t>19</w:t>
+      </w:r>
+      <w:r>
+        <w:rPr>
+          <w:rFonts w:ascii="Times New Roman" w:eastAsia="Times New Roman" w:hAnsi="Times New Roman" w:cs="Times New Roman"/>
+          <w:b/>
+          <w:bCs/>
+          <w:sz w:val="24"/>
+          <w:szCs w:val="24"/>
+          <w:lang w:eastAsia="en-IN"/>
+        </w:rPr>
+        <w:t xml:space="preserve"> Open Issues &amp; Next Steps</w:t>
       </w:r>
     </w:p>
     <w:p>
@@ -3771,27 +4968,7 @@
           <w:szCs w:val="24"/>
           <w:lang w:eastAsia="en-IN"/>
         </w:rPr>
-        <w:t xml:space="preserve"> Proceed with detailed design of each </w:t>
-      </w:r>
-      <w:proofErr w:type="spellStart"/>
-      <w:r>
-        <w:rPr>
-          <w:rFonts w:ascii="Times New Roman" w:eastAsia="Times New Roman" w:hAnsi="Times New Roman" w:cs="Times New Roman"/>
-          <w:sz w:val="24"/>
-          <w:szCs w:val="24"/>
-          <w:lang w:eastAsia="en-IN"/>
-        </w:rPr>
-        <w:t>microservice</w:t>
-      </w:r>
-      <w:proofErr w:type="spellEnd"/>
-      <w:r>
-        <w:rPr>
-          <w:rFonts w:ascii="Times New Roman" w:eastAsia="Times New Roman" w:hAnsi="Times New Roman" w:cs="Times New Roman"/>
-          <w:sz w:val="24"/>
-          <w:szCs w:val="24"/>
-          <w:lang w:eastAsia="en-IN"/>
-        </w:rPr>
-        <w:t xml:space="preserve"> and finalize the API specifications.</w:t>
+        <w:t xml:space="preserve"> Proceed with detailed design of each microservice and finalize the API specifications.</w:t>
       </w:r>
     </w:p>
     <w:p/>
@@ -3806,8 +4983,8 @@
 </file>
 
 <file path=word/numbering.xml><?xml version="1.0" encoding="utf-8"?>
-<w:numbering xmlns:wpc="http://schemas.microsoft.com/office/word/2010/wordprocessingCanvas" xmlns:mc="http://schemas.openxmlformats.org/markup-compatibility/2006" xmlns:o="urn:schemas-microsoft-com:office:office" xmlns:r="http://schemas.openxmlformats.org/officeDocument/2006/relationships" xmlns:m="http://schemas.openxmlformats.org/officeDocument/2006/math" xmlns:v="urn:schemas-microsoft-com:vml" xmlns:wp14="http://schemas.microsoft.com/office/word/2010/wordprocessingDrawing" xmlns:wp="http://schemas.openxmlformats.org/drawingml/2006/wordprocessingDrawing" xmlns:w10="urn:schemas-microsoft-com:office:word" xmlns:w="http://schemas.openxmlformats.org/wordprocessingml/2006/main" xmlns:w14="http://schemas.microsoft.com/office/word/2010/wordml" xmlns:wpg="http://schemas.microsoft.com/office/word/2010/wordprocessingGroup" xmlns:wpi="http://schemas.microsoft.com/office/word/2010/wordprocessingInk" xmlns:wne="http://schemas.microsoft.com/office/word/2006/wordml" xmlns:wps="http://schemas.microsoft.com/office/word/2010/wordprocessingShape" mc:Ignorable="w14 wp14">
-  <w:abstractNum w:abstractNumId="0">
+<w:numbering xmlns:wpc="http://schemas.microsoft.com/office/word/2010/wordprocessingCanvas" xmlns:cx="http://schemas.microsoft.com/office/drawing/2014/chartex" xmlns:cx1="http://schemas.microsoft.com/office/drawing/2015/9/8/chartex" xmlns:cx2="http://schemas.microsoft.com/office/drawing/2015/10/21/chartex" xmlns:cx3="http://schemas.microsoft.com/office/drawing/2016/5/9/chartex" xmlns:cx4="http://schemas.microsoft.com/office/drawing/2016/5/10/chartex" xmlns:cx5="http://schemas.microsoft.com/office/drawing/2016/5/11/chartex" xmlns:cx6="http://schemas.microsoft.com/office/drawing/2016/5/12/chartex" xmlns:cx7="http://schemas.microsoft.com/office/drawing/2016/5/13/chartex" xmlns:cx8="http://schemas.microsoft.com/office/drawing/2016/5/14/chartex" xmlns:mc="http://schemas.openxmlformats.org/markup-compatibility/2006" xmlns:aink="http://schemas.microsoft.com/office/drawing/2016/ink" xmlns:am3d="http://schemas.microsoft.com/office/drawing/2017/model3d" xmlns:o="urn:schemas-microsoft-com:office:office" xmlns:oel="http://schemas.microsoft.com/office/2019/extlst" xmlns:r="http://schemas.openxmlformats.org/officeDocument/2006/relationships" xmlns:m="http://schemas.openxmlformats.org/officeDocument/2006/math" xmlns:v="urn:schemas-microsoft-com:vml" xmlns:wp14="http://schemas.microsoft.com/office/word/2010/wordprocessingDrawing" xmlns:wp="http://schemas.openxmlformats.org/drawingml/2006/wordprocessingDrawing" xmlns:w10="urn:schemas-microsoft-com:office:word" xmlns:w="http://schemas.openxmlformats.org/wordprocessingml/2006/main" xmlns:w14="http://schemas.microsoft.com/office/word/2010/wordml" xmlns:w15="http://schemas.microsoft.com/office/word/2012/wordml" xmlns:w16cex="http://schemas.microsoft.com/office/word/2018/wordml/cex" xmlns:w16cid="http://schemas.microsoft.com/office/word/2016/wordml/cid" xmlns:w16="http://schemas.microsoft.com/office/word/2018/wordml" xmlns:w16du="http://schemas.microsoft.com/office/word/2023/wordml/word16du" xmlns:w16sdtdh="http://schemas.microsoft.com/office/word/2020/wordml/sdtdatahash" xmlns:w16sdtfl="http://schemas.microsoft.com/office/word/2024/wordml/sdtformatlock" xmlns:w16se="http://schemas.microsoft.com/office/word/2015/wordml/symex" xmlns:wpg="http://schemas.microsoft.com/office/word/2010/wordprocessingGroup" xmlns:wpi="http://schemas.microsoft.com/office/word/2010/wordprocessingInk" xmlns:wne="http://schemas.microsoft.com/office/word/2006/wordml" xmlns:wps="http://schemas.microsoft.com/office/word/2010/wordprocessingShape" mc:Ignorable="w14 w15 w16se w16cid w16 w16cex w16sdtdh w16sdtfl w16du wp14">
+  <w:abstractNum w:abstractNumId="0" w15:restartNumberingAfterBreak="0">
     <w:nsid w:val="00020788"/>
     <w:multiLevelType w:val="multilevel"/>
     <w:tmpl w:val="56045266"/>
@@ -3956,7 +5133,7 @@
       </w:rPr>
     </w:lvl>
   </w:abstractNum>
-  <w:abstractNum w:abstractNumId="1">
+  <w:abstractNum w:abstractNumId="1" w15:restartNumberingAfterBreak="0">
     <w:nsid w:val="12CC5669"/>
     <w:multiLevelType w:val="multilevel"/>
     <w:tmpl w:val="6F300F22"/>
@@ -4105,7 +5282,7 @@
       </w:rPr>
     </w:lvl>
   </w:abstractNum>
-  <w:abstractNum w:abstractNumId="2">
+  <w:abstractNum w:abstractNumId="2" w15:restartNumberingAfterBreak="0">
     <w:nsid w:val="19B01954"/>
     <w:multiLevelType w:val="multilevel"/>
     <w:tmpl w:val="C91CD958"/>
@@ -4254,7 +5431,7 @@
       </w:rPr>
     </w:lvl>
   </w:abstractNum>
-  <w:abstractNum w:abstractNumId="3">
+  <w:abstractNum w:abstractNumId="3" w15:restartNumberingAfterBreak="0">
     <w:nsid w:val="4964572B"/>
     <w:multiLevelType w:val="multilevel"/>
     <w:tmpl w:val="8DB6ED3E"/>
@@ -4403,7 +5580,7 @@
       </w:rPr>
     </w:lvl>
   </w:abstractNum>
-  <w:abstractNum w:abstractNumId="4">
+  <w:abstractNum w:abstractNumId="4" w15:restartNumberingAfterBreak="0">
     <w:nsid w:val="4C7912AC"/>
     <w:multiLevelType w:val="multilevel"/>
     <w:tmpl w:val="2A2AF170"/>
@@ -4552,7 +5729,7 @@
       </w:rPr>
     </w:lvl>
   </w:abstractNum>
-  <w:abstractNum w:abstractNumId="5">
+  <w:abstractNum w:abstractNumId="5" w15:restartNumberingAfterBreak="0">
     <w:nsid w:val="50F51612"/>
     <w:multiLevelType w:val="multilevel"/>
     <w:tmpl w:val="C8AC22D8"/>
@@ -4701,7 +5878,7 @@
       </w:rPr>
     </w:lvl>
   </w:abstractNum>
-  <w:abstractNum w:abstractNumId="6">
+  <w:abstractNum w:abstractNumId="6" w15:restartNumberingAfterBreak="0">
     <w:nsid w:val="5257199D"/>
     <w:multiLevelType w:val="multilevel"/>
     <w:tmpl w:val="97CAB8C2"/>
@@ -4850,7 +6027,7 @@
       </w:rPr>
     </w:lvl>
   </w:abstractNum>
-  <w:abstractNum w:abstractNumId="7">
+  <w:abstractNum w:abstractNumId="7" w15:restartNumberingAfterBreak="0">
     <w:nsid w:val="67B43EA0"/>
     <w:multiLevelType w:val="multilevel"/>
     <w:tmpl w:val="A2AE5924"/>
@@ -4999,7 +6176,7 @@
       </w:rPr>
     </w:lvl>
   </w:abstractNum>
-  <w:abstractNum w:abstractNumId="8">
+  <w:abstractNum w:abstractNumId="8" w15:restartNumberingAfterBreak="0">
     <w:nsid w:val="692B5469"/>
     <w:multiLevelType w:val="multilevel"/>
     <w:tmpl w:val="2D384CB2"/>
@@ -5148,7 +6325,7 @@
       </w:rPr>
     </w:lvl>
   </w:abstractNum>
-  <w:abstractNum w:abstractNumId="9">
+  <w:abstractNum w:abstractNumId="9" w15:restartNumberingAfterBreak="0">
     <w:nsid w:val="73EF6060"/>
     <w:multiLevelType w:val="multilevel"/>
     <w:tmpl w:val="369E9B06"/>
@@ -5297,7 +6474,7 @@
       </w:rPr>
     </w:lvl>
   </w:abstractNum>
-  <w:abstractNum w:abstractNumId="10">
+  <w:abstractNum w:abstractNumId="10" w15:restartNumberingAfterBreak="0">
     <w:nsid w:val="774556EF"/>
     <w:multiLevelType w:val="multilevel"/>
     <w:tmpl w:val="A18867A0"/>
@@ -5446,7 +6623,7 @@
       </w:rPr>
     </w:lvl>
   </w:abstractNum>
-  <w:abstractNum w:abstractNumId="11">
+  <w:abstractNum w:abstractNumId="11" w15:restartNumberingAfterBreak="0">
     <w:nsid w:val="779E495E"/>
     <w:multiLevelType w:val="multilevel"/>
     <w:tmpl w:val="D17E5B10"/>
@@ -5595,7 +6772,7 @@
       </w:rPr>
     </w:lvl>
   </w:abstractNum>
-  <w:abstractNum w:abstractNumId="12">
+  <w:abstractNum w:abstractNumId="12" w15:restartNumberingAfterBreak="0">
     <w:nsid w:val="7CEE1470"/>
     <w:multiLevelType w:val="multilevel"/>
     <w:tmpl w:val="92404B08"/>
@@ -5744,50 +6921,50 @@
       </w:rPr>
     </w:lvl>
   </w:abstractNum>
-  <w:num w:numId="1">
+  <w:num w:numId="1" w16cid:durableId="1187788000">
     <w:abstractNumId w:val="7"/>
   </w:num>
-  <w:num w:numId="2">
+  <w:num w:numId="2" w16cid:durableId="119228614">
     <w:abstractNumId w:val="2"/>
   </w:num>
-  <w:num w:numId="3">
+  <w:num w:numId="3" w16cid:durableId="1496530014">
     <w:abstractNumId w:val="5"/>
   </w:num>
-  <w:num w:numId="4">
+  <w:num w:numId="4" w16cid:durableId="1317300527">
     <w:abstractNumId w:val="1"/>
   </w:num>
-  <w:num w:numId="5">
+  <w:num w:numId="5" w16cid:durableId="747575906">
     <w:abstractNumId w:val="8"/>
   </w:num>
-  <w:num w:numId="6">
+  <w:num w:numId="6" w16cid:durableId="540215797">
     <w:abstractNumId w:val="4"/>
   </w:num>
-  <w:num w:numId="7">
+  <w:num w:numId="7" w16cid:durableId="696662405">
     <w:abstractNumId w:val="0"/>
   </w:num>
-  <w:num w:numId="8">
+  <w:num w:numId="8" w16cid:durableId="1011418236">
     <w:abstractNumId w:val="3"/>
   </w:num>
-  <w:num w:numId="9">
+  <w:num w:numId="9" w16cid:durableId="878663038">
     <w:abstractNumId w:val="10"/>
   </w:num>
-  <w:num w:numId="10">
+  <w:num w:numId="10" w16cid:durableId="1742606306">
     <w:abstractNumId w:val="12"/>
   </w:num>
-  <w:num w:numId="11">
+  <w:num w:numId="11" w16cid:durableId="969290240">
     <w:abstractNumId w:val="11"/>
   </w:num>
-  <w:num w:numId="12">
+  <w:num w:numId="12" w16cid:durableId="812672442">
     <w:abstractNumId w:val="9"/>
   </w:num>
-  <w:num w:numId="13">
+  <w:num w:numId="13" w16cid:durableId="1794978734">
     <w:abstractNumId w:val="6"/>
   </w:num>
 </w:numbering>
 </file>
 
 <file path=word/styles.xml><?xml version="1.0" encoding="utf-8"?>
-<w:styles xmlns:mc="http://schemas.openxmlformats.org/markup-compatibility/2006" xmlns:r="http://schemas.openxmlformats.org/officeDocument/2006/relationships" xmlns:w="http://schemas.openxmlformats.org/wordprocessingml/2006/main" xmlns:w14="http://schemas.microsoft.com/office/word/2010/wordml" mc:Ignorable="w14">
+<w:styles xmlns:mc="http://schemas.openxmlformats.org/markup-compatibility/2006" xmlns:r="http://schemas.openxmlformats.org/officeDocument/2006/relationships" xmlns:w="http://schemas.openxmlformats.org/wordprocessingml/2006/main" xmlns:w14="http://schemas.microsoft.com/office/word/2010/wordml" xmlns:w15="http://schemas.microsoft.com/office/word/2012/wordml" xmlns:w16cex="http://schemas.microsoft.com/office/word/2018/wordml/cex" xmlns:w16cid="http://schemas.microsoft.com/office/word/2016/wordml/cid" xmlns:w16="http://schemas.microsoft.com/office/word/2018/wordml" xmlns:w16du="http://schemas.microsoft.com/office/word/2023/wordml/word16du" xmlns:w16sdtdh="http://schemas.microsoft.com/office/word/2020/wordml/sdtdatahash" xmlns:w16sdtfl="http://schemas.microsoft.com/office/word/2024/wordml/sdtformatlock" xmlns:w16se="http://schemas.microsoft.com/office/word/2015/wordml/symex" mc:Ignorable="w14 w15 w16se w16cid w16 w16cex w16sdtdh w16sdtfl w16du">
   <w:docDefaults>
     <w:rPrDefault>
       <w:rPr>
@@ -5803,148 +6980,410 @@
       </w:pPr>
     </w:pPrDefault>
   </w:docDefaults>
-  <w:latentStyles w:defLockedState="0" w:defUIPriority="99" w:defSemiHidden="1" w:defUnhideWhenUsed="1" w:defQFormat="0" w:count="267">
-    <w:lsdException w:name="Normal" w:semiHidden="0" w:uiPriority="0" w:unhideWhenUsed="0" w:qFormat="1"/>
-    <w:lsdException w:name="heading 1" w:semiHidden="0" w:uiPriority="9" w:unhideWhenUsed="0" w:qFormat="1"/>
-    <w:lsdException w:name="heading 2" w:uiPriority="9" w:qFormat="1"/>
-    <w:lsdException w:name="heading 3" w:uiPriority="9" w:qFormat="1"/>
-    <w:lsdException w:name="heading 4" w:uiPriority="9" w:qFormat="1"/>
-    <w:lsdException w:name="heading 5" w:uiPriority="9" w:qFormat="1"/>
-    <w:lsdException w:name="heading 6" w:uiPriority="9" w:qFormat="1"/>
-    <w:lsdException w:name="heading 7" w:uiPriority="9" w:qFormat="1"/>
-    <w:lsdException w:name="heading 8" w:uiPriority="9" w:qFormat="1"/>
-    <w:lsdException w:name="heading 9" w:uiPriority="9" w:qFormat="1"/>
-    <w:lsdException w:name="toc 1" w:uiPriority="39"/>
-    <w:lsdException w:name="toc 2" w:uiPriority="39"/>
-    <w:lsdException w:name="toc 3" w:uiPriority="39"/>
-    <w:lsdException w:name="toc 4" w:uiPriority="39"/>
-    <w:lsdException w:name="toc 5" w:uiPriority="39"/>
-    <w:lsdException w:name="toc 6" w:uiPriority="39"/>
-    <w:lsdException w:name="toc 7" w:uiPriority="39"/>
-    <w:lsdException w:name="toc 8" w:uiPriority="39"/>
-    <w:lsdException w:name="toc 9" w:uiPriority="39"/>
-    <w:lsdException w:name="caption" w:uiPriority="35" w:qFormat="1"/>
-    <w:lsdException w:name="Title" w:semiHidden="0" w:uiPriority="10" w:unhideWhenUsed="0" w:qFormat="1"/>
-    <w:lsdException w:name="Default Paragraph Font" w:uiPriority="1"/>
-    <w:lsdException w:name="Subtitle" w:semiHidden="0" w:uiPriority="11" w:unhideWhenUsed="0" w:qFormat="1"/>
-    <w:lsdException w:name="Strong" w:semiHidden="0" w:uiPriority="22" w:unhideWhenUsed="0" w:qFormat="1"/>
-    <w:lsdException w:name="Emphasis" w:semiHidden="0" w:uiPriority="20" w:unhideWhenUsed="0" w:qFormat="1"/>
-    <w:lsdException w:name="Table Grid" w:semiHidden="0" w:uiPriority="59" w:unhideWhenUsed="0"/>
-    <w:lsdException w:name="Placeholder Text" w:unhideWhenUsed="0"/>
-    <w:lsdException w:name="No Spacing" w:semiHidden="0" w:uiPriority="1" w:unhideWhenUsed="0" w:qFormat="1"/>
-    <w:lsdException w:name="Light Shading" w:semiHidden="0" w:uiPriority="60" w:unhideWhenUsed="0"/>
-    <w:lsdException w:name="Light List" w:semiHidden="0" w:uiPriority="61" w:unhideWhenUsed="0"/>
-    <w:lsdException w:name="Light Grid" w:semiHidden="0" w:uiPriority="62" w:unhideWhenUsed="0"/>
-    <w:lsdException w:name="Medium Shading 1" w:semiHidden="0" w:uiPriority="63" w:unhideWhenUsed="0"/>
-    <w:lsdException w:name="Medium Shading 2" w:semiHidden="0" w:uiPriority="64" w:unhideWhenUsed="0"/>
-    <w:lsdException w:name="Medium List 1" w:semiHidden="0" w:uiPriority="65" w:unhideWhenUsed="0"/>
-    <w:lsdException w:name="Medium List 2" w:semiHidden="0" w:uiPriority="66" w:unhideWhenUsed="0"/>
-    <w:lsdException w:name="Medium Grid 1" w:semiHidden="0" w:uiPriority="67" w:unhideWhenUsed="0"/>
-    <w:lsdException w:name="Medium Grid 2" w:semiHidden="0" w:uiPriority="68" w:unhideWhenUsed="0"/>
-    <w:lsdException w:name="Medium Grid 3" w:semiHidden="0" w:uiPriority="69" w:unhideWhenUsed="0"/>
-    <w:lsdException w:name="Dark List" w:semiHidden="0" w:uiPriority="70" w:unhideWhenUsed="0"/>
-    <w:lsdException w:name="Colorful Shading" w:semiHidden="0" w:uiPriority="71" w:unhideWhenUsed="0"/>
-    <w:lsdException w:name="Colorful List" w:semiHidden="0" w:uiPriority="72" w:unhideWhenUsed="0"/>
-    <w:lsdException w:name="Colorful Grid" w:semiHidden="0" w:uiPriority="73" w:unhideWhenUsed="0"/>
-    <w:lsdException w:name="Light Shading Accent 1" w:semiHidden="0" w:uiPriority="60" w:unhideWhenUsed="0"/>
-    <w:lsdException w:name="Light List Accent 1" w:semiHidden="0" w:uiPriority="61" w:unhideWhenUsed="0"/>
-    <w:lsdException w:name="Light Grid Accent 1" w:semiHidden="0" w:uiPriority="62" w:unhideWhenUsed="0"/>
-    <w:lsdException w:name="Medium Shading 1 Accent 1" w:semiHidden="0" w:uiPriority="63" w:unhideWhenUsed="0"/>
-    <w:lsdException w:name="Medium Shading 2 Accent 1" w:semiHidden="0" w:uiPriority="64" w:unhideWhenUsed="0"/>
-    <w:lsdException w:name="Medium List 1 Accent 1" w:semiHidden="0" w:uiPriority="65" w:unhideWhenUsed="0"/>
-    <w:lsdException w:name="Revision" w:unhideWhenUsed="0"/>
-    <w:lsdException w:name="List Paragraph" w:semiHidden="0" w:uiPriority="34" w:unhideWhenUsed="0" w:qFormat="1"/>
-    <w:lsdException w:name="Quote" w:semiHidden="0" w:uiPriority="29" w:unhideWhenUsed="0" w:qFormat="1"/>
-    <w:lsdException w:name="Intense Quote" w:semiHidden="0" w:uiPriority="30" w:unhideWhenUsed="0" w:qFormat="1"/>
-    <w:lsdException w:name="Medium List 2 Accent 1" w:semiHidden="0" w:uiPriority="66" w:unhideWhenUsed="0"/>
-    <w:lsdException w:name="Medium Grid 1 Accent 1" w:semiHidden="0" w:uiPriority="67" w:unhideWhenUsed="0"/>
-    <w:lsdException w:name="Medium Grid 2 Accent 1" w:semiHidden="0" w:uiPriority="68" w:unhideWhenUsed="0"/>
-    <w:lsdException w:name="Medium Grid 3 Accent 1" w:semiHidden="0" w:uiPriority="69" w:unhideWhenUsed="0"/>
-    <w:lsdException w:name="Dark List Accent 1" w:semiHidden="0" w:uiPriority="70" w:unhideWhenUsed="0"/>
-    <w:lsdException w:name="Colorful Shading Accent 1" w:semiHidden="0" w:uiPriority="71" w:unhideWhenUsed="0"/>
-    <w:lsdException w:name="Colorful List Accent 1" w:semiHidden="0" w:uiPriority="72" w:unhideWhenUsed="0"/>
-    <w:lsdException w:name="Colorful Grid Accent 1" w:semiHidden="0" w:uiPriority="73" w:unhideWhenUsed="0"/>
-    <w:lsdException w:name="Light Shading Accent 2" w:semiHidden="0" w:uiPriority="60" w:unhideWhenUsed="0"/>
-    <w:lsdException w:name="Light List Accent 2" w:semiHidden="0" w:uiPriority="61" w:unhideWhenUsed="0"/>
-    <w:lsdException w:name="Light Grid Accent 2" w:semiHidden="0" w:uiPriority="62" w:unhideWhenUsed="0"/>
-    <w:lsdException w:name="Medium Shading 1 Accent 2" w:semiHidden="0" w:uiPriority="63" w:unhideWhenUsed="0"/>
-    <w:lsdException w:name="Medium Shading 2 Accent 2" w:semiHidden="0" w:uiPriority="64" w:unhideWhenUsed="0"/>
-    <w:lsdException w:name="Medium List 1 Accent 2" w:semiHidden="0" w:uiPriority="65" w:unhideWhenUsed="0"/>
-    <w:lsdException w:name="Medium List 2 Accent 2" w:semiHidden="0" w:uiPriority="66" w:unhideWhenUsed="0"/>
-    <w:lsdException w:name="Medium Grid 1 Accent 2" w:semiHidden="0" w:uiPriority="67" w:unhideWhenUsed="0"/>
-    <w:lsdException w:name="Medium Grid 2 Accent 2" w:semiHidden="0" w:uiPriority="68" w:unhideWhenUsed="0"/>
-    <w:lsdException w:name="Medium Grid 3 Accent 2" w:semiHidden="0" w:uiPriority="69" w:unhideWhenUsed="0"/>
-    <w:lsdException w:name="Dark List Accent 2" w:semiHidden="0" w:uiPriority="70" w:unhideWhenUsed="0"/>
-    <w:lsdException w:name="Colorful Shading Accent 2" w:semiHidden="0" w:uiPriority="71" w:unhideWhenUsed="0"/>
-    <w:lsdException w:name="Colorful List Accent 2" w:semiHidden="0" w:uiPriority="72" w:unhideWhenUsed="0"/>
-    <w:lsdException w:name="Colorful Grid Accent 2" w:semiHidden="0" w:uiPriority="73" w:unhideWhenUsed="0"/>
-    <w:lsdException w:name="Light Shading Accent 3" w:semiHidden="0" w:uiPriority="60" w:unhideWhenUsed="0"/>
-    <w:lsdException w:name="Light List Accent 3" w:semiHidden="0" w:uiPriority="61" w:unhideWhenUsed="0"/>
-    <w:lsdException w:name="Light Grid Accent 3" w:semiHidden="0" w:uiPriority="62" w:unhideWhenUsed="0"/>
-    <w:lsdException w:name="Medium Shading 1 Accent 3" w:semiHidden="0" w:uiPriority="63" w:unhideWhenUsed="0"/>
-    <w:lsdException w:name="Medium Shading 2 Accent 3" w:semiHidden="0" w:uiPriority="64" w:unhideWhenUsed="0"/>
-    <w:lsdException w:name="Medium List 1 Accent 3" w:semiHidden="0" w:uiPriority="65" w:unhideWhenUsed="0"/>
-    <w:lsdException w:name="Medium List 2 Accent 3" w:semiHidden="0" w:uiPriority="66" w:unhideWhenUsed="0"/>
-    <w:lsdException w:name="Medium Grid 1 Accent 3" w:semiHidden="0" w:uiPriority="67" w:unhideWhenUsed="0"/>
-    <w:lsdException w:name="Medium Grid 2 Accent 3" w:semiHidden="0" w:uiPriority="68" w:unhideWhenUsed="0"/>
-    <w:lsdException w:name="Medium Grid 3 Accent 3" w:semiHidden="0" w:uiPriority="69" w:unhideWhenUsed="0"/>
-    <w:lsdException w:name="Dark List Accent 3" w:semiHidden="0" w:uiPriority="70" w:unhideWhenUsed="0"/>
-    <w:lsdException w:name="Colorful Shading Accent 3" w:semiHidden="0" w:uiPriority="71" w:unhideWhenUsed="0"/>
-    <w:lsdException w:name="Colorful List Accent 3" w:semiHidden="0" w:uiPriority="72" w:unhideWhenUsed="0"/>
-    <w:lsdException w:name="Colorful Grid Accent 3" w:semiHidden="0" w:uiPriority="73" w:unhideWhenUsed="0"/>
-    <w:lsdException w:name="Light Shading Accent 4" w:semiHidden="0" w:uiPriority="60" w:unhideWhenUsed="0"/>
-    <w:lsdException w:name="Light List Accent 4" w:semiHidden="0" w:uiPriority="61" w:unhideWhenUsed="0"/>
-    <w:lsdException w:name="Light Grid Accent 4" w:semiHidden="0" w:uiPriority="62" w:unhideWhenUsed="0"/>
-    <w:lsdException w:name="Medium Shading 1 Accent 4" w:semiHidden="0" w:uiPriority="63" w:unhideWhenUsed="0"/>
-    <w:lsdException w:name="Medium Shading 2 Accent 4" w:semiHidden="0" w:uiPriority="64" w:unhideWhenUsed="0"/>
-    <w:lsdException w:name="Medium List 1 Accent 4" w:semiHidden="0" w:uiPriority="65" w:unhideWhenUsed="0"/>
-    <w:lsdException w:name="Medium List 2 Accent 4" w:semiHidden="0" w:uiPriority="66" w:unhideWhenUsed="0"/>
-    <w:lsdException w:name="Medium Grid 1 Accent 4" w:semiHidden="0" w:uiPriority="67" w:unhideWhenUsed="0"/>
-    <w:lsdException w:name="Medium Grid 2 Accent 4" w:semiHidden="0" w:uiPriority="68" w:unhideWhenUsed="0"/>
-    <w:lsdException w:name="Medium Grid 3 Accent 4" w:semiHidden="0" w:uiPriority="69" w:unhideWhenUsed="0"/>
-    <w:lsdException w:name="Dark List Accent 4" w:semiHidden="0" w:uiPriority="70" w:unhideWhenUsed="0"/>
-    <w:lsdException w:name="Colorful Shading Accent 4" w:semiHidden="0" w:uiPriority="71" w:unhideWhenUsed="0"/>
-    <w:lsdException w:name="Colorful List Accent 4" w:semiHidden="0" w:uiPriority="72" w:unhideWhenUsed="0"/>
-    <w:lsdException w:name="Colorful Grid Accent 4" w:semiHidden="0" w:uiPriority="73" w:unhideWhenUsed="0"/>
-    <w:lsdException w:name="Light Shading Accent 5" w:semiHidden="0" w:uiPriority="60" w:unhideWhenUsed="0"/>
-    <w:lsdException w:name="Light List Accent 5" w:semiHidden="0" w:uiPriority="61" w:unhideWhenUsed="0"/>
-    <w:lsdException w:name="Light Grid Accent 5" w:semiHidden="0" w:uiPriority="62" w:unhideWhenUsed="0"/>
-    <w:lsdException w:name="Medium Shading 1 Accent 5" w:semiHidden="0" w:uiPriority="63" w:unhideWhenUsed="0"/>
-    <w:lsdException w:name="Medium Shading 2 Accent 5" w:semiHidden="0" w:uiPriority="64" w:unhideWhenUsed="0"/>
-    <w:lsdException w:name="Medium List 1 Accent 5" w:semiHidden="0" w:uiPriority="65" w:unhideWhenUsed="0"/>
-    <w:lsdException w:name="Medium List 2 Accent 5" w:semiHidden="0" w:uiPriority="66" w:unhideWhenUsed="0"/>
-    <w:lsdException w:name="Medium Grid 1 Accent 5" w:semiHidden="0" w:uiPriority="67" w:unhideWhenUsed="0"/>
-    <w:lsdException w:name="Medium Grid 2 Accent 5" w:semiHidden="0" w:uiPriority="68" w:unhideWhenUsed="0"/>
-    <w:lsdException w:name="Medium Grid 3 Accent 5" w:semiHidden="0" w:uiPriority="69" w:unhideWhenUsed="0"/>
-    <w:lsdException w:name="Dark List Accent 5" w:semiHidden="0" w:uiPriority="70" w:unhideWhenUsed="0"/>
-    <w:lsdException w:name="Colorful Shading Accent 5" w:semiHidden="0" w:uiPriority="71" w:unhideWhenUsed="0"/>
-    <w:lsdException w:name="Colorful List Accent 5" w:semiHidden="0" w:uiPriority="72" w:unhideWhenUsed="0"/>
-    <w:lsdException w:name="Colorful Grid Accent 5" w:semiHidden="0" w:uiPriority="73" w:unhideWhenUsed="0"/>
-    <w:lsdException w:name="Light Shading Accent 6" w:semiHidden="0" w:uiPriority="60" w:unhideWhenUsed="0"/>
-    <w:lsdException w:name="Light List Accent 6" w:semiHidden="0" w:uiPriority="61" w:unhideWhenUsed="0"/>
-    <w:lsdException w:name="Light Grid Accent 6" w:semiHidden="0" w:uiPriority="62" w:unhideWhenUsed="0"/>
-    <w:lsdException w:name="Medium Shading 1 Accent 6" w:semiHidden="0" w:uiPriority="63" w:unhideWhenUsed="0"/>
-    <w:lsdException w:name="Medium Shading 2 Accent 6" w:semiHidden="0" w:uiPriority="64" w:unhideWhenUsed="0"/>
-    <w:lsdException w:name="Medium List 1 Accent 6" w:semiHidden="0" w:uiPriority="65" w:unhideWhenUsed="0"/>
-    <w:lsdException w:name="Medium List 2 Accent 6" w:semiHidden="0" w:uiPriority="66" w:unhideWhenUsed="0"/>
-    <w:lsdException w:name="Medium Grid 1 Accent 6" w:semiHidden="0" w:uiPriority="67" w:unhideWhenUsed="0"/>
-    <w:lsdException w:name="Medium Grid 2 Accent 6" w:semiHidden="0" w:uiPriority="68" w:unhideWhenUsed="0"/>
-    <w:lsdException w:name="Medium Grid 3 Accent 6" w:semiHidden="0" w:uiPriority="69" w:unhideWhenUsed="0"/>
-    <w:lsdException w:name="Dark List Accent 6" w:semiHidden="0" w:uiPriority="70" w:unhideWhenUsed="0"/>
-    <w:lsdException w:name="Colorful Shading Accent 6" w:semiHidden="0" w:uiPriority="71" w:unhideWhenUsed="0"/>
-    <w:lsdException w:name="Colorful List Accent 6" w:semiHidden="0" w:uiPriority="72" w:unhideWhenUsed="0"/>
-    <w:lsdException w:name="Colorful Grid Accent 6" w:semiHidden="0" w:uiPriority="73" w:unhideWhenUsed="0"/>
-    <w:lsdException w:name="Subtle Emphasis" w:semiHidden="0" w:uiPriority="19" w:unhideWhenUsed="0" w:qFormat="1"/>
-    <w:lsdException w:name="Intense Emphasis" w:semiHidden="0" w:uiPriority="21" w:unhideWhenUsed="0" w:qFormat="1"/>
-    <w:lsdException w:name="Subtle Reference" w:semiHidden="0" w:uiPriority="31" w:unhideWhenUsed="0" w:qFormat="1"/>
-    <w:lsdException w:name="Intense Reference" w:semiHidden="0" w:uiPriority="32" w:unhideWhenUsed="0" w:qFormat="1"/>
-    <w:lsdException w:name="Book Title" w:semiHidden="0" w:uiPriority="33" w:unhideWhenUsed="0" w:qFormat="1"/>
-    <w:lsdException w:name="Bibliography" w:uiPriority="37"/>
-    <w:lsdException w:name="TOC Heading" w:uiPriority="39" w:qFormat="1"/>
+  <w:latentStyles w:defLockedState="0" w:defUIPriority="99" w:defSemiHidden="0" w:defUnhideWhenUsed="0" w:defQFormat="0" w:count="376">
+    <w:lsdException w:name="Normal" w:uiPriority="0" w:qFormat="1"/>
+    <w:lsdException w:name="heading 1" w:uiPriority="9" w:qFormat="1"/>
+    <w:lsdException w:name="heading 2" w:semiHidden="1" w:uiPriority="9" w:unhideWhenUsed="1" w:qFormat="1"/>
+    <w:lsdException w:name="heading 3" w:semiHidden="1" w:uiPriority="9" w:unhideWhenUsed="1" w:qFormat="1"/>
+    <w:lsdException w:name="heading 4" w:semiHidden="1" w:uiPriority="9" w:unhideWhenUsed="1" w:qFormat="1"/>
+    <w:lsdException w:name="heading 5" w:semiHidden="1" w:uiPriority="9" w:unhideWhenUsed="1" w:qFormat="1"/>
+    <w:lsdException w:name="heading 6" w:semiHidden="1" w:uiPriority="9" w:unhideWhenUsed="1" w:qFormat="1"/>
+    <w:lsdException w:name="heading 7" w:semiHidden="1" w:uiPriority="9" w:unhideWhenUsed="1" w:qFormat="1"/>
+    <w:lsdException w:name="heading 8" w:semiHidden="1" w:uiPriority="9" w:unhideWhenUsed="1" w:qFormat="1"/>
+    <w:lsdException w:name="heading 9" w:semiHidden="1" w:uiPriority="9" w:unhideWhenUsed="1" w:qFormat="1"/>
+    <w:lsdException w:name="index 1" w:semiHidden="1" w:unhideWhenUsed="1"/>
+    <w:lsdException w:name="index 2" w:semiHidden="1" w:unhideWhenUsed="1"/>
+    <w:lsdException w:name="index 3" w:semiHidden="1" w:unhideWhenUsed="1"/>
+    <w:lsdException w:name="index 4" w:semiHidden="1" w:unhideWhenUsed="1"/>
+    <w:lsdException w:name="index 5" w:semiHidden="1" w:unhideWhenUsed="1"/>
+    <w:lsdException w:name="index 6" w:semiHidden="1" w:unhideWhenUsed="1"/>
+    <w:lsdException w:name="index 7" w:semiHidden="1" w:unhideWhenUsed="1"/>
+    <w:lsdException w:name="index 8" w:semiHidden="1" w:unhideWhenUsed="1"/>
+    <w:lsdException w:name="index 9" w:semiHidden="1" w:unhideWhenUsed="1"/>
+    <w:lsdException w:name="toc 1" w:semiHidden="1" w:uiPriority="39" w:unhideWhenUsed="1"/>
+    <w:lsdException w:name="toc 2" w:semiHidden="1" w:uiPriority="39" w:unhideWhenUsed="1"/>
+    <w:lsdException w:name="toc 3" w:semiHidden="1" w:uiPriority="39" w:unhideWhenUsed="1"/>
+    <w:lsdException w:name="toc 4" w:semiHidden="1" w:uiPriority="39" w:unhideWhenUsed="1"/>
+    <w:lsdException w:name="toc 5" w:semiHidden="1" w:uiPriority="39" w:unhideWhenUsed="1"/>
+    <w:lsdException w:name="toc 6" w:semiHidden="1" w:uiPriority="39" w:unhideWhenUsed="1"/>
+    <w:lsdException w:name="toc 7" w:semiHidden="1" w:uiPriority="39" w:unhideWhenUsed="1"/>
+    <w:lsdException w:name="toc 8" w:semiHidden="1" w:uiPriority="39" w:unhideWhenUsed="1"/>
+    <w:lsdException w:name="toc 9" w:semiHidden="1" w:uiPriority="39" w:unhideWhenUsed="1"/>
+    <w:lsdException w:name="Normal Indent" w:semiHidden="1" w:unhideWhenUsed="1"/>
+    <w:lsdException w:name="footnote text" w:semiHidden="1" w:unhideWhenUsed="1"/>
+    <w:lsdException w:name="annotation text" w:semiHidden="1" w:unhideWhenUsed="1"/>
+    <w:lsdException w:name="header" w:semiHidden="1" w:unhideWhenUsed="1"/>
+    <w:lsdException w:name="footer" w:semiHidden="1" w:unhideWhenUsed="1"/>
+    <w:lsdException w:name="index heading" w:semiHidden="1" w:unhideWhenUsed="1"/>
+    <w:lsdException w:name="caption" w:semiHidden="1" w:uiPriority="35" w:unhideWhenUsed="1" w:qFormat="1"/>
+    <w:lsdException w:name="table of figures" w:semiHidden="1" w:unhideWhenUsed="1"/>
+    <w:lsdException w:name="envelope address" w:semiHidden="1" w:unhideWhenUsed="1"/>
+    <w:lsdException w:name="envelope return" w:semiHidden="1" w:unhideWhenUsed="1"/>
+    <w:lsdException w:name="footnote reference" w:semiHidden="1" w:unhideWhenUsed="1"/>
+    <w:lsdException w:name="annotation reference" w:semiHidden="1" w:unhideWhenUsed="1"/>
+    <w:lsdException w:name="line number" w:semiHidden="1" w:unhideWhenUsed="1"/>
+    <w:lsdException w:name="page number" w:semiHidden="1" w:unhideWhenUsed="1"/>
+    <w:lsdException w:name="endnote reference" w:semiHidden="1" w:unhideWhenUsed="1"/>
+    <w:lsdException w:name="endnote text" w:semiHidden="1" w:unhideWhenUsed="1"/>
+    <w:lsdException w:name="table of authorities" w:semiHidden="1" w:unhideWhenUsed="1"/>
+    <w:lsdException w:name="macro" w:semiHidden="1" w:unhideWhenUsed="1"/>
+    <w:lsdException w:name="toa heading" w:semiHidden="1" w:unhideWhenUsed="1"/>
+    <w:lsdException w:name="List" w:semiHidden="1" w:unhideWhenUsed="1"/>
+    <w:lsdException w:name="List Bullet" w:semiHidden="1" w:unhideWhenUsed="1"/>
+    <w:lsdException w:name="List Number" w:semiHidden="1" w:unhideWhenUsed="1"/>
+    <w:lsdException w:name="List 2" w:semiHidden="1" w:unhideWhenUsed="1"/>
+    <w:lsdException w:name="List 3" w:semiHidden="1" w:unhideWhenUsed="1"/>
+    <w:lsdException w:name="List 4" w:semiHidden="1" w:unhideWhenUsed="1"/>
+    <w:lsdException w:name="List 5" w:semiHidden="1" w:unhideWhenUsed="1"/>
+    <w:lsdException w:name="List Bullet 2" w:semiHidden="1" w:unhideWhenUsed="1"/>
+    <w:lsdException w:name="List Bullet 3" w:semiHidden="1" w:unhideWhenUsed="1"/>
+    <w:lsdException w:name="List Bullet 4" w:semiHidden="1" w:unhideWhenUsed="1"/>
+    <w:lsdException w:name="List Bullet 5" w:semiHidden="1" w:unhideWhenUsed="1"/>
+    <w:lsdException w:name="List Number 2" w:semiHidden="1" w:unhideWhenUsed="1"/>
+    <w:lsdException w:name="List Number 3" w:semiHidden="1" w:unhideWhenUsed="1"/>
+    <w:lsdException w:name="List Number 4" w:semiHidden="1" w:unhideWhenUsed="1"/>
+    <w:lsdException w:name="List Number 5" w:semiHidden="1" w:unhideWhenUsed="1"/>
+    <w:lsdException w:name="Title" w:uiPriority="10" w:qFormat="1"/>
+    <w:lsdException w:name="Closing" w:semiHidden="1" w:unhideWhenUsed="1"/>
+    <w:lsdException w:name="Signature" w:semiHidden="1" w:unhideWhenUsed="1"/>
+    <w:lsdException w:name="Default Paragraph Font" w:semiHidden="1" w:uiPriority="1" w:unhideWhenUsed="1"/>
+    <w:lsdException w:name="Body Text" w:semiHidden="1" w:unhideWhenUsed="1"/>
+    <w:lsdException w:name="Body Text Indent" w:semiHidden="1" w:unhideWhenUsed="1"/>
+    <w:lsdException w:name="List Continue" w:semiHidden="1" w:unhideWhenUsed="1"/>
+    <w:lsdException w:name="List Continue 2" w:semiHidden="1" w:unhideWhenUsed="1"/>
+    <w:lsdException w:name="List Continue 3" w:semiHidden="1" w:unhideWhenUsed="1"/>
+    <w:lsdException w:name="List Continue 4" w:semiHidden="1" w:unhideWhenUsed="1"/>
+    <w:lsdException w:name="List Continue 5" w:semiHidden="1" w:unhideWhenUsed="1"/>
+    <w:lsdException w:name="Message Header" w:semiHidden="1" w:unhideWhenUsed="1"/>
+    <w:lsdException w:name="Subtitle" w:uiPriority="11" w:qFormat="1"/>
+    <w:lsdException w:name="Salutation" w:semiHidden="1" w:unhideWhenUsed="1"/>
+    <w:lsdException w:name="Date" w:semiHidden="1" w:unhideWhenUsed="1"/>
+    <w:lsdException w:name="Body Text First Indent" w:semiHidden="1" w:unhideWhenUsed="1"/>
+    <w:lsdException w:name="Body Text First Indent 2" w:semiHidden="1" w:unhideWhenUsed="1"/>
+    <w:lsdException w:name="Note Heading" w:semiHidden="1" w:unhideWhenUsed="1"/>
+    <w:lsdException w:name="Body Text 2" w:semiHidden="1" w:unhideWhenUsed="1"/>
+    <w:lsdException w:name="Body Text 3" w:semiHidden="1" w:unhideWhenUsed="1"/>
+    <w:lsdException w:name="Body Text Indent 2" w:semiHidden="1" w:unhideWhenUsed="1"/>
+    <w:lsdException w:name="Body Text Indent 3" w:semiHidden="1" w:unhideWhenUsed="1"/>
+    <w:lsdException w:name="Block Text" w:semiHidden="1" w:unhideWhenUsed="1"/>
+    <w:lsdException w:name="Hyperlink" w:semiHidden="1" w:unhideWhenUsed="1"/>
+    <w:lsdException w:name="FollowedHyperlink" w:semiHidden="1" w:unhideWhenUsed="1"/>
+    <w:lsdException w:name="Strong" w:uiPriority="22" w:qFormat="1"/>
+    <w:lsdException w:name="Emphasis" w:uiPriority="20" w:qFormat="1"/>
+    <w:lsdException w:name="Document Map" w:semiHidden="1" w:unhideWhenUsed="1"/>
+    <w:lsdException w:name="Plain Text" w:semiHidden="1" w:unhideWhenUsed="1"/>
+    <w:lsdException w:name="E-mail Signature" w:semiHidden="1" w:unhideWhenUsed="1"/>
+    <w:lsdException w:name="HTML Top of Form" w:semiHidden="1" w:unhideWhenUsed="1"/>
+    <w:lsdException w:name="HTML Bottom of Form" w:semiHidden="1" w:unhideWhenUsed="1"/>
+    <w:lsdException w:name="Normal (Web)" w:semiHidden="1" w:unhideWhenUsed="1"/>
+    <w:lsdException w:name="HTML Acronym" w:semiHidden="1" w:unhideWhenUsed="1"/>
+    <w:lsdException w:name="HTML Address" w:semiHidden="1" w:unhideWhenUsed="1"/>
+    <w:lsdException w:name="HTML Cite" w:semiHidden="1" w:unhideWhenUsed="1"/>
+    <w:lsdException w:name="HTML Code" w:semiHidden="1" w:unhideWhenUsed="1"/>
+    <w:lsdException w:name="HTML Definition" w:semiHidden="1" w:unhideWhenUsed="1"/>
+    <w:lsdException w:name="HTML Keyboard" w:semiHidden="1" w:unhideWhenUsed="1"/>
+    <w:lsdException w:name="HTML Preformatted" w:semiHidden="1" w:unhideWhenUsed="1"/>
+    <w:lsdException w:name="HTML Sample" w:semiHidden="1" w:unhideWhenUsed="1"/>
+    <w:lsdException w:name="HTML Typewriter" w:semiHidden="1" w:unhideWhenUsed="1"/>
+    <w:lsdException w:name="HTML Variable" w:semiHidden="1" w:unhideWhenUsed="1"/>
+    <w:lsdException w:name="Normal Table" w:semiHidden="1" w:unhideWhenUsed="1"/>
+    <w:lsdException w:name="annotation subject" w:semiHidden="1" w:unhideWhenUsed="1"/>
+    <w:lsdException w:name="No List" w:semiHidden="1" w:unhideWhenUsed="1"/>
+    <w:lsdException w:name="Outline List 1" w:semiHidden="1" w:unhideWhenUsed="1"/>
+    <w:lsdException w:name="Outline List 2" w:semiHidden="1" w:unhideWhenUsed="1"/>
+    <w:lsdException w:name="Outline List 3" w:semiHidden="1" w:unhideWhenUsed="1"/>
+    <w:lsdException w:name="Table Simple 1" w:semiHidden="1" w:unhideWhenUsed="1"/>
+    <w:lsdException w:name="Table Simple 2" w:semiHidden="1" w:unhideWhenUsed="1"/>
+    <w:lsdException w:name="Table Simple 3" w:semiHidden="1" w:unhideWhenUsed="1"/>
+    <w:lsdException w:name="Table Classic 1" w:semiHidden="1" w:unhideWhenUsed="1"/>
+    <w:lsdException w:name="Table Classic 2" w:semiHidden="1" w:unhideWhenUsed="1"/>
+    <w:lsdException w:name="Table Classic 3" w:semiHidden="1" w:unhideWhenUsed="1"/>
+    <w:lsdException w:name="Table Classic 4" w:semiHidden="1" w:unhideWhenUsed="1"/>
+    <w:lsdException w:name="Table Colorful 1" w:semiHidden="1" w:unhideWhenUsed="1"/>
+    <w:lsdException w:name="Table Colorful 2" w:semiHidden="1" w:unhideWhenUsed="1"/>
+    <w:lsdException w:name="Table Colorful 3" w:semiHidden="1" w:unhideWhenUsed="1"/>
+    <w:lsdException w:name="Table Columns 1" w:semiHidden="1" w:unhideWhenUsed="1"/>
+    <w:lsdException w:name="Table Columns 2" w:semiHidden="1" w:unhideWhenUsed="1"/>
+    <w:lsdException w:name="Table Columns 3" w:semiHidden="1" w:unhideWhenUsed="1"/>
+    <w:lsdException w:name="Table Columns 4" w:semiHidden="1" w:unhideWhenUsed="1"/>
+    <w:lsdException w:name="Table Columns 5" w:semiHidden="1" w:unhideWhenUsed="1"/>
+    <w:lsdException w:name="Table Grid 1" w:semiHidden="1" w:unhideWhenUsed="1"/>
+    <w:lsdException w:name="Table Grid 2" w:semiHidden="1" w:unhideWhenUsed="1"/>
+    <w:lsdException w:name="Table Grid 3" w:semiHidden="1" w:unhideWhenUsed="1"/>
+    <w:lsdException w:name="Table Grid 4" w:semiHidden="1" w:unhideWhenUsed="1"/>
+    <w:lsdException w:name="Table Grid 5" w:semiHidden="1" w:unhideWhenUsed="1"/>
+    <w:lsdException w:name="Table Grid 6" w:semiHidden="1" w:unhideWhenUsed="1"/>
+    <w:lsdException w:name="Table Grid 7" w:semiHidden="1" w:unhideWhenUsed="1"/>
+    <w:lsdException w:name="Table Grid 8" w:semiHidden="1" w:unhideWhenUsed="1"/>
+    <w:lsdException w:name="Table List 1" w:semiHidden="1" w:unhideWhenUsed="1"/>
+    <w:lsdException w:name="Table List 2" w:semiHidden="1" w:unhideWhenUsed="1"/>
+    <w:lsdException w:name="Table List 3" w:semiHidden="1" w:unhideWhenUsed="1"/>
+    <w:lsdException w:name="Table List 4" w:semiHidden="1" w:unhideWhenUsed="1"/>
+    <w:lsdException w:name="Table List 5" w:semiHidden="1" w:unhideWhenUsed="1"/>
+    <w:lsdException w:name="Table List 6" w:semiHidden="1" w:unhideWhenUsed="1"/>
+    <w:lsdException w:name="Table List 7" w:semiHidden="1" w:unhideWhenUsed="1"/>
+    <w:lsdException w:name="Table List 8" w:semiHidden="1" w:unhideWhenUsed="1"/>
+    <w:lsdException w:name="Table 3D effects 1" w:semiHidden="1" w:unhideWhenUsed="1"/>
+    <w:lsdException w:name="Table 3D effects 2" w:semiHidden="1" w:unhideWhenUsed="1"/>
+    <w:lsdException w:name="Table 3D effects 3" w:semiHidden="1" w:unhideWhenUsed="1"/>
+    <w:lsdException w:name="Table Contemporary" w:semiHidden="1" w:unhideWhenUsed="1"/>
+    <w:lsdException w:name="Table Elegant" w:semiHidden="1" w:unhideWhenUsed="1"/>
+    <w:lsdException w:name="Table Professional" w:semiHidden="1" w:unhideWhenUsed="1"/>
+    <w:lsdException w:name="Table Subtle 1" w:semiHidden="1" w:unhideWhenUsed="1"/>
+    <w:lsdException w:name="Table Subtle 2" w:semiHidden="1" w:unhideWhenUsed="1"/>
+    <w:lsdException w:name="Table Web 1" w:semiHidden="1" w:unhideWhenUsed="1"/>
+    <w:lsdException w:name="Table Web 2" w:semiHidden="1" w:unhideWhenUsed="1"/>
+    <w:lsdException w:name="Table Web 3" w:semiHidden="1" w:unhideWhenUsed="1"/>
+    <w:lsdException w:name="Balloon Text" w:semiHidden="1" w:unhideWhenUsed="1"/>
+    <w:lsdException w:name="Table Grid" w:uiPriority="59"/>
+    <w:lsdException w:name="Table Theme" w:semiHidden="1" w:unhideWhenUsed="1"/>
+    <w:lsdException w:name="Placeholder Text" w:semiHidden="1"/>
+    <w:lsdException w:name="No Spacing" w:uiPriority="1" w:qFormat="1"/>
+    <w:lsdException w:name="Light Shading" w:uiPriority="60"/>
+    <w:lsdException w:name="Light List" w:uiPriority="61"/>
+    <w:lsdException w:name="Light Grid" w:uiPriority="62"/>
+    <w:lsdException w:name="Medium Shading 1" w:uiPriority="63"/>
+    <w:lsdException w:name="Medium Shading 2" w:uiPriority="64"/>
+    <w:lsdException w:name="Medium List 1" w:uiPriority="65"/>
+    <w:lsdException w:name="Medium List 2" w:uiPriority="66"/>
+    <w:lsdException w:name="Medium Grid 1" w:uiPriority="67"/>
+    <w:lsdException w:name="Medium Grid 2" w:uiPriority="68"/>
+    <w:lsdException w:name="Medium Grid 3" w:uiPriority="69"/>
+    <w:lsdException w:name="Dark List" w:uiPriority="70"/>
+    <w:lsdException w:name="Colorful Shading" w:uiPriority="71"/>
+    <w:lsdException w:name="Colorful List" w:uiPriority="72"/>
+    <w:lsdException w:name="Colorful Grid" w:uiPriority="73"/>
+    <w:lsdException w:name="Light Shading Accent 1" w:uiPriority="60"/>
+    <w:lsdException w:name="Light List Accent 1" w:uiPriority="61"/>
+    <w:lsdException w:name="Light Grid Accent 1" w:uiPriority="62"/>
+    <w:lsdException w:name="Medium Shading 1 Accent 1" w:uiPriority="63"/>
+    <w:lsdException w:name="Medium Shading 2 Accent 1" w:uiPriority="64"/>
+    <w:lsdException w:name="Medium List 1 Accent 1" w:uiPriority="65"/>
+    <w:lsdException w:name="Revision" w:semiHidden="1"/>
+    <w:lsdException w:name="List Paragraph" w:uiPriority="34" w:qFormat="1"/>
+    <w:lsdException w:name="Quote" w:uiPriority="29" w:qFormat="1"/>
+    <w:lsdException w:name="Intense Quote" w:uiPriority="30" w:qFormat="1"/>
+    <w:lsdException w:name="Medium List 2 Accent 1" w:uiPriority="66"/>
+    <w:lsdException w:name="Medium Grid 1 Accent 1" w:uiPriority="67"/>
+    <w:lsdException w:name="Medium Grid 2 Accent 1" w:uiPriority="68"/>
+    <w:lsdException w:name="Medium Grid 3 Accent 1" w:uiPriority="69"/>
+    <w:lsdException w:name="Dark List Accent 1" w:uiPriority="70"/>
+    <w:lsdException w:name="Colorful Shading Accent 1" w:uiPriority="71"/>
+    <w:lsdException w:name="Colorful List Accent 1" w:uiPriority="72"/>
+    <w:lsdException w:name="Colorful Grid Accent 1" w:uiPriority="73"/>
+    <w:lsdException w:name="Light Shading Accent 2" w:uiPriority="60"/>
+    <w:lsdException w:name="Light List Accent 2" w:uiPriority="61"/>
+    <w:lsdException w:name="Light Grid Accent 2" w:uiPriority="62"/>
+    <w:lsdException w:name="Medium Shading 1 Accent 2" w:uiPriority="63"/>
+    <w:lsdException w:name="Medium Shading 2 Accent 2" w:uiPriority="64"/>
+    <w:lsdException w:name="Medium List 1 Accent 2" w:uiPriority="65"/>
+    <w:lsdException w:name="Medium List 2 Accent 2" w:uiPriority="66"/>
+    <w:lsdException w:name="Medium Grid 1 Accent 2" w:uiPriority="67"/>
+    <w:lsdException w:name="Medium Grid 2 Accent 2" w:uiPriority="68"/>
+    <w:lsdException w:name="Medium Grid 3 Accent 2" w:uiPriority="69"/>
+    <w:lsdException w:name="Dark List Accent 2" w:uiPriority="70"/>
+    <w:lsdException w:name="Colorful Shading Accent 2" w:uiPriority="71"/>
+    <w:lsdException w:name="Colorful List Accent 2" w:uiPriority="72"/>
+    <w:lsdException w:name="Colorful Grid Accent 2" w:uiPriority="73"/>
+    <w:lsdException w:name="Light Shading Accent 3" w:uiPriority="60"/>
+    <w:lsdException w:name="Light List Accent 3" w:uiPriority="61"/>
+    <w:lsdException w:name="Light Grid Accent 3" w:uiPriority="62"/>
+    <w:lsdException w:name="Medium Shading 1 Accent 3" w:uiPriority="63"/>
+    <w:lsdException w:name="Medium Shading 2 Accent 3" w:uiPriority="64"/>
+    <w:lsdException w:name="Medium List 1 Accent 3" w:uiPriority="65"/>
+    <w:lsdException w:name="Medium List 2 Accent 3" w:uiPriority="66"/>
+    <w:lsdException w:name="Medium Grid 1 Accent 3" w:uiPriority="67"/>
+    <w:lsdException w:name="Medium Grid 2 Accent 3" w:uiPriority="68"/>
+    <w:lsdException w:name="Medium Grid 3 Accent 3" w:uiPriority="69"/>
+    <w:lsdException w:name="Dark List Accent 3" w:uiPriority="70"/>
+    <w:lsdException w:name="Colorful Shading Accent 3" w:uiPriority="71"/>
+    <w:lsdException w:name="Colorful List Accent 3" w:uiPriority="72"/>
+    <w:lsdException w:name="Colorful Grid Accent 3" w:uiPriority="73"/>
+    <w:lsdException w:name="Light Shading Accent 4" w:uiPriority="60"/>
+    <w:lsdException w:name="Light List Accent 4" w:uiPriority="61"/>
+    <w:lsdException w:name="Light Grid Accent 4" w:uiPriority="62"/>
+    <w:lsdException w:name="Medium Shading 1 Accent 4" w:uiPriority="63"/>
+    <w:lsdException w:name="Medium Shading 2 Accent 4" w:uiPriority="64"/>
+    <w:lsdException w:name="Medium List 1 Accent 4" w:uiPriority="65"/>
+    <w:lsdException w:name="Medium List 2 Accent 4" w:uiPriority="66"/>
+    <w:lsdException w:name="Medium Grid 1 Accent 4" w:uiPriority="67"/>
+    <w:lsdException w:name="Medium Grid 2 Accent 4" w:uiPriority="68"/>
+    <w:lsdException w:name="Medium Grid 3 Accent 4" w:uiPriority="69"/>
+    <w:lsdException w:name="Dark List Accent 4" w:uiPriority="70"/>
+    <w:lsdException w:name="Colorful Shading Accent 4" w:uiPriority="71"/>
+    <w:lsdException w:name="Colorful List Accent 4" w:uiPriority="72"/>
+    <w:lsdException w:name="Colorful Grid Accent 4" w:uiPriority="73"/>
+    <w:lsdException w:name="Light Shading Accent 5" w:uiPriority="60"/>
+    <w:lsdException w:name="Light List Accent 5" w:uiPriority="61"/>
+    <w:lsdException w:name="Light Grid Accent 5" w:uiPriority="62"/>
+    <w:lsdException w:name="Medium Shading 1 Accent 5" w:uiPriority="63"/>
+    <w:lsdException w:name="Medium Shading 2 Accent 5" w:uiPriority="64"/>
+    <w:lsdException w:name="Medium List 1 Accent 5" w:uiPriority="65"/>
+    <w:lsdException w:name="Medium List 2 Accent 5" w:uiPriority="66"/>
+    <w:lsdException w:name="Medium Grid 1 Accent 5" w:uiPriority="67"/>
+    <w:lsdException w:name="Medium Grid 2 Accent 5" w:uiPriority="68"/>
+    <w:lsdException w:name="Medium Grid 3 Accent 5" w:uiPriority="69"/>
+    <w:lsdException w:name="Dark List Accent 5" w:uiPriority="70"/>
+    <w:lsdException w:name="Colorful Shading Accent 5" w:uiPriority="71"/>
+    <w:lsdException w:name="Colorful List Accent 5" w:uiPriority="72"/>
+    <w:lsdException w:name="Colorful Grid Accent 5" w:uiPriority="73"/>
+    <w:lsdException w:name="Light Shading Accent 6" w:uiPriority="60"/>
+    <w:lsdException w:name="Light List Accent 6" w:uiPriority="61"/>
+    <w:lsdException w:name="Light Grid Accent 6" w:uiPriority="62"/>
+    <w:lsdException w:name="Medium Shading 1 Accent 6" w:uiPriority="63"/>
+    <w:lsdException w:name="Medium Shading 2 Accent 6" w:uiPriority="64"/>
+    <w:lsdException w:name="Medium List 1 Accent 6" w:uiPriority="65"/>
+    <w:lsdException w:name="Medium List 2 Accent 6" w:uiPriority="66"/>
+    <w:lsdException w:name="Medium Grid 1 Accent 6" w:uiPriority="67"/>
+    <w:lsdException w:name="Medium Grid 2 Accent 6" w:uiPriority="68"/>
+    <w:lsdException w:name="Medium Grid 3 Accent 6" w:uiPriority="69"/>
+    <w:lsdException w:name="Dark List Accent 6" w:uiPriority="70"/>
+    <w:lsdException w:name="Colorful Shading Accent 6" w:uiPriority="71"/>
+    <w:lsdException w:name="Colorful List Accent 6" w:uiPriority="72"/>
+    <w:lsdException w:name="Colorful Grid Accent 6" w:uiPriority="73"/>
+    <w:lsdException w:name="Subtle Emphasis" w:uiPriority="19" w:qFormat="1"/>
+    <w:lsdException w:name="Intense Emphasis" w:uiPriority="21" w:qFormat="1"/>
+    <w:lsdException w:name="Subtle Reference" w:uiPriority="31" w:qFormat="1"/>
+    <w:lsdException w:name="Intense Reference" w:uiPriority="32" w:qFormat="1"/>
+    <w:lsdException w:name="Book Title" w:uiPriority="33" w:qFormat="1"/>
+    <w:lsdException w:name="Bibliography" w:semiHidden="1" w:uiPriority="37" w:unhideWhenUsed="1"/>
+    <w:lsdException w:name="TOC Heading" w:semiHidden="1" w:uiPriority="39" w:unhideWhenUsed="1" w:qFormat="1"/>
+    <w:lsdException w:name="Plain Table 1" w:uiPriority="41"/>
+    <w:lsdException w:name="Plain Table 2" w:uiPriority="42"/>
+    <w:lsdException w:name="Plain Table 3" w:uiPriority="43"/>
+    <w:lsdException w:name="Plain Table 4" w:uiPriority="44"/>
+    <w:lsdException w:name="Plain Table 5" w:uiPriority="45"/>
+    <w:lsdException w:name="Grid Table Light" w:uiPriority="40"/>
+    <w:lsdException w:name="Grid Table 1 Light" w:uiPriority="46"/>
+    <w:lsdException w:name="Grid Table 2" w:uiPriority="47"/>
+    <w:lsdException w:name="Grid Table 3" w:uiPriority="48"/>
+    <w:lsdException w:name="Grid Table 4" w:uiPriority="49"/>
+    <w:lsdException w:name="Grid Table 5 Dark" w:uiPriority="50"/>
+    <w:lsdException w:name="Grid Table 6 Colorful" w:uiPriority="51"/>
+    <w:lsdException w:name="Grid Table 7 Colorful" w:uiPriority="52"/>
+    <w:lsdException w:name="Grid Table 1 Light Accent 1" w:uiPriority="46"/>
+    <w:lsdException w:name="Grid Table 2 Accent 1" w:uiPriority="47"/>
+    <w:lsdException w:name="Grid Table 3 Accent 1" w:uiPriority="48"/>
+    <w:lsdException w:name="Grid Table 4 Accent 1" w:uiPriority="49"/>
+    <w:lsdException w:name="Grid Table 5 Dark Accent 1" w:uiPriority="50"/>
+    <w:lsdException w:name="Grid Table 6 Colorful Accent 1" w:uiPriority="51"/>
+    <w:lsdException w:name="Grid Table 7 Colorful Accent 1" w:uiPriority="52"/>
+    <w:lsdException w:name="Grid Table 1 Light Accent 2" w:uiPriority="46"/>
+    <w:lsdException w:name="Grid Table 2 Accent 2" w:uiPriority="47"/>
+    <w:lsdException w:name="Grid Table 3 Accent 2" w:uiPriority="48"/>
+    <w:lsdException w:name="Grid Table 4 Accent 2" w:uiPriority="49"/>
+    <w:lsdException w:name="Grid Table 5 Dark Accent 2" w:uiPriority="50"/>
+    <w:lsdException w:name="Grid Table 6 Colorful Accent 2" w:uiPriority="51"/>
+    <w:lsdException w:name="Grid Table 7 Colorful Accent 2" w:uiPriority="52"/>
+    <w:lsdException w:name="Grid Table 1 Light Accent 3" w:uiPriority="46"/>
+    <w:lsdException w:name="Grid Table 2 Accent 3" w:uiPriority="47"/>
+    <w:lsdException w:name="Grid Table 3 Accent 3" w:uiPriority="48"/>
+    <w:lsdException w:name="Grid Table 4 Accent 3" w:uiPriority="49"/>
+    <w:lsdException w:name="Grid Table 5 Dark Accent 3" w:uiPriority="50"/>
+    <w:lsdException w:name="Grid Table 6 Colorful Accent 3" w:uiPriority="51"/>
+    <w:lsdException w:name="Grid Table 7 Colorful Accent 3" w:uiPriority="52"/>
+    <w:lsdException w:name="Grid Table 1 Light Accent 4" w:uiPriority="46"/>
+    <w:lsdException w:name="Grid Table 2 Accent 4" w:uiPriority="47"/>
+    <w:lsdException w:name="Grid Table 3 Accent 4" w:uiPriority="48"/>
+    <w:lsdException w:name="Grid Table 4 Accent 4" w:uiPriority="49"/>
+    <w:lsdException w:name="Grid Table 5 Dark Accent 4" w:uiPriority="50"/>
+    <w:lsdException w:name="Grid Table 6 Colorful Accent 4" w:uiPriority="51"/>
+    <w:lsdException w:name="Grid Table 7 Colorful Accent 4" w:uiPriority="52"/>
+    <w:lsdException w:name="Grid Table 1 Light Accent 5" w:uiPriority="46"/>
+    <w:lsdException w:name="Grid Table 2 Accent 5" w:uiPriority="47"/>
+    <w:lsdException w:name="Grid Table 3 Accent 5" w:uiPriority="48"/>
+    <w:lsdException w:name="Grid Table 4 Accent 5" w:uiPriority="49"/>
+    <w:lsdException w:name="Grid Table 5 Dark Accent 5" w:uiPriority="50"/>
+    <w:lsdException w:name="Grid Table 6 Colorful Accent 5" w:uiPriority="51"/>
+    <w:lsdException w:name="Grid Table 7 Colorful Accent 5" w:uiPriority="52"/>
+    <w:lsdException w:name="Grid Table 1 Light Accent 6" w:uiPriority="46"/>
+    <w:lsdException w:name="Grid Table 2 Accent 6" w:uiPriority="47"/>
+    <w:lsdException w:name="Grid Table 3 Accent 6" w:uiPriority="48"/>
+    <w:lsdException w:name="Grid Table 4 Accent 6" w:uiPriority="49"/>
+    <w:lsdException w:name="Grid Table 5 Dark Accent 6" w:uiPriority="50"/>
+    <w:lsdException w:name="Grid Table 6 Colorful Accent 6" w:uiPriority="51"/>
+    <w:lsdException w:name="Grid Table 7 Colorful Accent 6" w:uiPriority="52"/>
+    <w:lsdException w:name="List Table 1 Light" w:uiPriority="46"/>
+    <w:lsdException w:name="List Table 2" w:uiPriority="47"/>
+    <w:lsdException w:name="List Table 3" w:uiPriority="48"/>
+    <w:lsdException w:name="List Table 4" w:uiPriority="49"/>
+    <w:lsdException w:name="List Table 5 Dark" w:uiPriority="50"/>
+    <w:lsdException w:name="List Table 6 Colorful" w:uiPriority="51"/>
+    <w:lsdException w:name="List Table 7 Colorful" w:uiPriority="52"/>
+    <w:lsdException w:name="List Table 1 Light Accent 1" w:uiPriority="46"/>
+    <w:lsdException w:name="List Table 2 Accent 1" w:uiPriority="47"/>
+    <w:lsdException w:name="List Table 3 Accent 1" w:uiPriority="48"/>
+    <w:lsdException w:name="List Table 4 Accent 1" w:uiPriority="49"/>
+    <w:lsdException w:name="List Table 5 Dark Accent 1" w:uiPriority="50"/>
+    <w:lsdException w:name="List Table 6 Colorful Accent 1" w:uiPriority="51"/>
+    <w:lsdException w:name="List Table 7 Colorful Accent 1" w:uiPriority="52"/>
+    <w:lsdException w:name="List Table 1 Light Accent 2" w:uiPriority="46"/>
+    <w:lsdException w:name="List Table 2 Accent 2" w:uiPriority="47"/>
+    <w:lsdException w:name="List Table 3 Accent 2" w:uiPriority="48"/>
+    <w:lsdException w:name="List Table 4 Accent 2" w:uiPriority="49"/>
+    <w:lsdException w:name="List Table 5 Dark Accent 2" w:uiPriority="50"/>
+    <w:lsdException w:name="List Table 6 Colorful Accent 2" w:uiPriority="51"/>
+    <w:lsdException w:name="List Table 7 Colorful Accent 2" w:uiPriority="52"/>
+    <w:lsdException w:name="List Table 1 Light Accent 3" w:uiPriority="46"/>
+    <w:lsdException w:name="List Table 2 Accent 3" w:uiPriority="47"/>
+    <w:lsdException w:name="List Table 3 Accent 3" w:uiPriority="48"/>
+    <w:lsdException w:name="List Table 4 Accent 3" w:uiPriority="49"/>
+    <w:lsdException w:name="List Table 5 Dark Accent 3" w:uiPriority="50"/>
+    <w:lsdException w:name="List Table 6 Colorful Accent 3" w:uiPriority="51"/>
+    <w:lsdException w:name="List Table 7 Colorful Accent 3" w:uiPriority="52"/>
+    <w:lsdException w:name="List Table 1 Light Accent 4" w:uiPriority="46"/>
+    <w:lsdException w:name="List Table 2 Accent 4" w:uiPriority="47"/>
+    <w:lsdException w:name="List Table 3 Accent 4" w:uiPriority="48"/>
+    <w:lsdException w:name="List Table 4 Accent 4" w:uiPriority="49"/>
+    <w:lsdException w:name="List Table 5 Dark Accent 4" w:uiPriority="50"/>
+    <w:lsdException w:name="List Table 6 Colorful Accent 4" w:uiPriority="51"/>
+    <w:lsdException w:name="List Table 7 Colorful Accent 4" w:uiPriority="52"/>
+    <w:lsdException w:name="List Table 1 Light Accent 5" w:uiPriority="46"/>
+    <w:lsdException w:name="List Table 2 Accent 5" w:uiPriority="47"/>
+    <w:lsdException w:name="List Table 3 Accent 5" w:uiPriority="48"/>
+    <w:lsdException w:name="List Table 4 Accent 5" w:uiPriority="49"/>
+    <w:lsdException w:name="List Table 5 Dark Accent 5" w:uiPriority="50"/>
+    <w:lsdException w:name="List Table 6 Colorful Accent 5" w:uiPriority="51"/>
+    <w:lsdException w:name="List Table 7 Colorful Accent 5" w:uiPriority="52"/>
+    <w:lsdException w:name="List Table 1 Light Accent 6" w:uiPriority="46"/>
+    <w:lsdException w:name="List Table 2 Accent 6" w:uiPriority="47"/>
+    <w:lsdException w:name="List Table 3 Accent 6" w:uiPriority="48"/>
+    <w:lsdException w:name="List Table 4 Accent 6" w:uiPriority="49"/>
+    <w:lsdException w:name="List Table 5 Dark Accent 6" w:uiPriority="50"/>
+    <w:lsdException w:name="List Table 6 Colorful Accent 6" w:uiPriority="51"/>
+    <w:lsdException w:name="List Table 7 Colorful Accent 6" w:uiPriority="52"/>
+    <w:lsdException w:name="Mention" w:semiHidden="1" w:unhideWhenUsed="1"/>
+    <w:lsdException w:name="Smart Hyperlink" w:semiHidden="1" w:unhideWhenUsed="1"/>
+    <w:lsdException w:name="Hashtag" w:semiHidden="1" w:unhideWhenUsed="1"/>
+    <w:lsdException w:name="Unresolved Mention" w:semiHidden="1" w:unhideWhenUsed="1"/>
+    <w:lsdException w:name="Smart Link" w:semiHidden="1" w:unhideWhenUsed="1"/>
   </w:latentStyles>
   <w:style w:type="paragraph" w:default="1" w:styleId="Normal">
     <w:name w:val="Normal"/>
     <w:qFormat/>
+  </w:style>
+  <w:style w:type="paragraph" w:styleId="Heading2">
+    <w:name w:val="heading 2"/>
+    <w:basedOn w:val="Normal"/>
+    <w:next w:val="Normal"/>
+    <w:link w:val="Heading2Char"/>
+    <w:uiPriority w:val="9"/>
+    <w:semiHidden/>
+    <w:unhideWhenUsed/>
+    <w:qFormat/>
+    <w:rsid w:val="00FC0D87"/>
+    <w:pPr>
+      <w:keepNext/>
+      <w:keepLines/>
+      <w:spacing w:before="40" w:after="0"/>
+      <w:outlineLvl w:val="1"/>
+    </w:pPr>
+    <w:rPr>
+      <w:rFonts w:asciiTheme="majorHAnsi" w:eastAsiaTheme="majorEastAsia" w:hAnsiTheme="majorHAnsi" w:cstheme="majorBidi"/>
+      <w:color w:val="365F91" w:themeColor="accent1" w:themeShade="BF"/>
+      <w:sz w:val="26"/>
+      <w:szCs w:val="26"/>
+    </w:rPr>
   </w:style>
   <w:style w:type="paragraph" w:styleId="Heading3">
     <w:name w:val="heading 3"/>
@@ -5989,7 +7428,6 @@
   <w:style w:type="character" w:default="1" w:styleId="DefaultParagraphFont">
     <w:name w:val="Default Paragraph Font"/>
     <w:uiPriority w:val="1"/>
-    <w:semiHidden/>
     <w:unhideWhenUsed/>
   </w:style>
   <w:style w:type="table" w:default="1" w:styleId="TableNormal">
@@ -6047,7 +7485,6 @@
     <w:name w:val="Normal (Web)"/>
     <w:basedOn w:val="Normal"/>
     <w:uiPriority w:val="99"/>
-    <w:semiHidden/>
     <w:unhideWhenUsed/>
     <w:rsid w:val="000E3F96"/>
     <w:pPr>
@@ -6103,325 +7540,41 @@
       <w:szCs w:val="16"/>
     </w:rPr>
   </w:style>
-</w:styles>
-</file>
-
-<file path=word/stylesWithEffects.xml><?xml version="1.0" encoding="utf-8"?>
-<w:styles xmlns:wpc="http://schemas.microsoft.com/office/word/2010/wordprocessingCanvas" xmlns:mc="http://schemas.openxmlformats.org/markup-compatibility/2006" xmlns:o="urn:schemas-microsoft-com:office:office" xmlns:r="http://schemas.openxmlformats.org/officeDocument/2006/relationships" xmlns:m="http://schemas.openxmlformats.org/officeDocument/2006/math" xmlns:v="urn:schemas-microsoft-com:vml" xmlns:wp14="http://schemas.microsoft.com/office/word/2010/wordprocessingDrawing" xmlns:wp="http://schemas.openxmlformats.org/drawingml/2006/wordprocessingDrawing" xmlns:w10="urn:schemas-microsoft-com:office:word" xmlns:w="http://schemas.openxmlformats.org/wordprocessingml/2006/main" xmlns:w14="http://schemas.microsoft.com/office/word/2010/wordml" xmlns:wpg="http://schemas.microsoft.com/office/word/2010/wordprocessingGroup" xmlns:wpi="http://schemas.microsoft.com/office/word/2010/wordprocessingInk" xmlns:wne="http://schemas.microsoft.com/office/word/2006/wordml" xmlns:wps="http://schemas.microsoft.com/office/word/2010/wordprocessingShape" mc:Ignorable="w14 wp14">
-  <w:docDefaults>
-    <w:rPrDefault>
-      <w:rPr>
-        <w:rFonts w:asciiTheme="minorHAnsi" w:eastAsiaTheme="minorHAnsi" w:hAnsiTheme="minorHAnsi" w:cstheme="minorBidi"/>
-        <w:sz w:val="22"/>
-        <w:szCs w:val="22"/>
-        <w:lang w:val="en-IN" w:eastAsia="en-US" w:bidi="ar-SA"/>
-      </w:rPr>
-    </w:rPrDefault>
-    <w:pPrDefault>
-      <w:pPr>
-        <w:spacing w:after="200" w:line="276" w:lineRule="auto"/>
-      </w:pPr>
-    </w:pPrDefault>
-  </w:docDefaults>
-  <w:latentStyles w:defLockedState="0" w:defUIPriority="99" w:defSemiHidden="1" w:defUnhideWhenUsed="1" w:defQFormat="0" w:count="267">
-    <w:lsdException w:name="Normal" w:semiHidden="0" w:uiPriority="0" w:unhideWhenUsed="0" w:qFormat="1"/>
-    <w:lsdException w:name="heading 1" w:semiHidden="0" w:uiPriority="9" w:unhideWhenUsed="0" w:qFormat="1"/>
-    <w:lsdException w:name="heading 2" w:uiPriority="9" w:qFormat="1"/>
-    <w:lsdException w:name="heading 3" w:uiPriority="9" w:qFormat="1"/>
-    <w:lsdException w:name="heading 4" w:uiPriority="9" w:qFormat="1"/>
-    <w:lsdException w:name="heading 5" w:uiPriority="9" w:qFormat="1"/>
-    <w:lsdException w:name="heading 6" w:uiPriority="9" w:qFormat="1"/>
-    <w:lsdException w:name="heading 7" w:uiPriority="9" w:qFormat="1"/>
-    <w:lsdException w:name="heading 8" w:uiPriority="9" w:qFormat="1"/>
-    <w:lsdException w:name="heading 9" w:uiPriority="9" w:qFormat="1"/>
-    <w:lsdException w:name="toc 1" w:uiPriority="39"/>
-    <w:lsdException w:name="toc 2" w:uiPriority="39"/>
-    <w:lsdException w:name="toc 3" w:uiPriority="39"/>
-    <w:lsdException w:name="toc 4" w:uiPriority="39"/>
-    <w:lsdException w:name="toc 5" w:uiPriority="39"/>
-    <w:lsdException w:name="toc 6" w:uiPriority="39"/>
-    <w:lsdException w:name="toc 7" w:uiPriority="39"/>
-    <w:lsdException w:name="toc 8" w:uiPriority="39"/>
-    <w:lsdException w:name="toc 9" w:uiPriority="39"/>
-    <w:lsdException w:name="caption" w:uiPriority="35" w:qFormat="1"/>
-    <w:lsdException w:name="Title" w:semiHidden="0" w:uiPriority="10" w:unhideWhenUsed="0" w:qFormat="1"/>
-    <w:lsdException w:name="Default Paragraph Font" w:uiPriority="1"/>
-    <w:lsdException w:name="Subtitle" w:semiHidden="0" w:uiPriority="11" w:unhideWhenUsed="0" w:qFormat="1"/>
-    <w:lsdException w:name="Strong" w:semiHidden="0" w:uiPriority="22" w:unhideWhenUsed="0" w:qFormat="1"/>
-    <w:lsdException w:name="Emphasis" w:semiHidden="0" w:uiPriority="20" w:unhideWhenUsed="0" w:qFormat="1"/>
-    <w:lsdException w:name="Table Grid" w:semiHidden="0" w:uiPriority="59" w:unhideWhenUsed="0"/>
-    <w:lsdException w:name="Placeholder Text" w:unhideWhenUsed="0"/>
-    <w:lsdException w:name="No Spacing" w:semiHidden="0" w:uiPriority="1" w:unhideWhenUsed="0" w:qFormat="1"/>
-    <w:lsdException w:name="Light Shading" w:semiHidden="0" w:uiPriority="60" w:unhideWhenUsed="0"/>
-    <w:lsdException w:name="Light List" w:semiHidden="0" w:uiPriority="61" w:unhideWhenUsed="0"/>
-    <w:lsdException w:name="Light Grid" w:semiHidden="0" w:uiPriority="62" w:unhideWhenUsed="0"/>
-    <w:lsdException w:name="Medium Shading 1" w:semiHidden="0" w:uiPriority="63" w:unhideWhenUsed="0"/>
-    <w:lsdException w:name="Medium Shading 2" w:semiHidden="0" w:uiPriority="64" w:unhideWhenUsed="0"/>
-    <w:lsdException w:name="Medium List 1" w:semiHidden="0" w:uiPriority="65" w:unhideWhenUsed="0"/>
-    <w:lsdException w:name="Medium List 2" w:semiHidden="0" w:uiPriority="66" w:unhideWhenUsed="0"/>
-    <w:lsdException w:name="Medium Grid 1" w:semiHidden="0" w:uiPriority="67" w:unhideWhenUsed="0"/>
-    <w:lsdException w:name="Medium Grid 2" w:semiHidden="0" w:uiPriority="68" w:unhideWhenUsed="0"/>
-    <w:lsdException w:name="Medium Grid 3" w:semiHidden="0" w:uiPriority="69" w:unhideWhenUsed="0"/>
-    <w:lsdException w:name="Dark List" w:semiHidden="0" w:uiPriority="70" w:unhideWhenUsed="0"/>
-    <w:lsdException w:name="Colorful Shading" w:semiHidden="0" w:uiPriority="71" w:unhideWhenUsed="0"/>
-    <w:lsdException w:name="Colorful List" w:semiHidden="0" w:uiPriority="72" w:unhideWhenUsed="0"/>
-    <w:lsdException w:name="Colorful Grid" w:semiHidden="0" w:uiPriority="73" w:unhideWhenUsed="0"/>
-    <w:lsdException w:name="Light Shading Accent 1" w:semiHidden="0" w:uiPriority="60" w:unhideWhenUsed="0"/>
-    <w:lsdException w:name="Light List Accent 1" w:semiHidden="0" w:uiPriority="61" w:unhideWhenUsed="0"/>
-    <w:lsdException w:name="Light Grid Accent 1" w:semiHidden="0" w:uiPriority="62" w:unhideWhenUsed="0"/>
-    <w:lsdException w:name="Medium Shading 1 Accent 1" w:semiHidden="0" w:uiPriority="63" w:unhideWhenUsed="0"/>
-    <w:lsdException w:name="Medium Shading 2 Accent 1" w:semiHidden="0" w:uiPriority="64" w:unhideWhenUsed="0"/>
-    <w:lsdException w:name="Medium List 1 Accent 1" w:semiHidden="0" w:uiPriority="65" w:unhideWhenUsed="0"/>
-    <w:lsdException w:name="Revision" w:unhideWhenUsed="0"/>
-    <w:lsdException w:name="List Paragraph" w:semiHidden="0" w:uiPriority="34" w:unhideWhenUsed="0" w:qFormat="1"/>
-    <w:lsdException w:name="Quote" w:semiHidden="0" w:uiPriority="29" w:unhideWhenUsed="0" w:qFormat="1"/>
-    <w:lsdException w:name="Intense Quote" w:semiHidden="0" w:uiPriority="30" w:unhideWhenUsed="0" w:qFormat="1"/>
-    <w:lsdException w:name="Medium List 2 Accent 1" w:semiHidden="0" w:uiPriority="66" w:unhideWhenUsed="0"/>
-    <w:lsdException w:name="Medium Grid 1 Accent 1" w:semiHidden="0" w:uiPriority="67" w:unhideWhenUsed="0"/>
-    <w:lsdException w:name="Medium Grid 2 Accent 1" w:semiHidden="0" w:uiPriority="68" w:unhideWhenUsed="0"/>
-    <w:lsdException w:name="Medium Grid 3 Accent 1" w:semiHidden="0" w:uiPriority="69" w:unhideWhenUsed="0"/>
-    <w:lsdException w:name="Dark List Accent 1" w:semiHidden="0" w:uiPriority="70" w:unhideWhenUsed="0"/>
-    <w:lsdException w:name="Colorful Shading Accent 1" w:semiHidden="0" w:uiPriority="71" w:unhideWhenUsed="0"/>
-    <w:lsdException w:name="Colorful List Accent 1" w:semiHidden="0" w:uiPriority="72" w:unhideWhenUsed="0"/>
-    <w:lsdException w:name="Colorful Grid Accent 1" w:semiHidden="0" w:uiPriority="73" w:unhideWhenUsed="0"/>
-    <w:lsdException w:name="Light Shading Accent 2" w:semiHidden="0" w:uiPriority="60" w:unhideWhenUsed="0"/>
-    <w:lsdException w:name="Light List Accent 2" w:semiHidden="0" w:uiPriority="61" w:unhideWhenUsed="0"/>
-    <w:lsdException w:name="Light Grid Accent 2" w:semiHidden="0" w:uiPriority="62" w:unhideWhenUsed="0"/>
-    <w:lsdException w:name="Medium Shading 1 Accent 2" w:semiHidden="0" w:uiPriority="63" w:unhideWhenUsed="0"/>
-    <w:lsdException w:name="Medium Shading 2 Accent 2" w:semiHidden="0" w:uiPriority="64" w:unhideWhenUsed="0"/>
-    <w:lsdException w:name="Medium List 1 Accent 2" w:semiHidden="0" w:uiPriority="65" w:unhideWhenUsed="0"/>
-    <w:lsdException w:name="Medium List 2 Accent 2" w:semiHidden="0" w:uiPriority="66" w:unhideWhenUsed="0"/>
-    <w:lsdException w:name="Medium Grid 1 Accent 2" w:semiHidden="0" w:uiPriority="67" w:unhideWhenUsed="0"/>
-    <w:lsdException w:name="Medium Grid 2 Accent 2" w:semiHidden="0" w:uiPriority="68" w:unhideWhenUsed="0"/>
-    <w:lsdException w:name="Medium Grid 3 Accent 2" w:semiHidden="0" w:uiPriority="69" w:unhideWhenUsed="0"/>
-    <w:lsdException w:name="Dark List Accent 2" w:semiHidden="0" w:uiPriority="70" w:unhideWhenUsed="0"/>
-    <w:lsdException w:name="Colorful Shading Accent 2" w:semiHidden="0" w:uiPriority="71" w:unhideWhenUsed="0"/>
-    <w:lsdException w:name="Colorful List Accent 2" w:semiHidden="0" w:uiPriority="72" w:unhideWhenUsed="0"/>
-    <w:lsdException w:name="Colorful Grid Accent 2" w:semiHidden="0" w:uiPriority="73" w:unhideWhenUsed="0"/>
-    <w:lsdException w:name="Light Shading Accent 3" w:semiHidden="0" w:uiPriority="60" w:unhideWhenUsed="0"/>
-    <w:lsdException w:name="Light List Accent 3" w:semiHidden="0" w:uiPriority="61" w:unhideWhenUsed="0"/>
-    <w:lsdException w:name="Light Grid Accent 3" w:semiHidden="0" w:uiPriority="62" w:unhideWhenUsed="0"/>
-    <w:lsdException w:name="Medium Shading 1 Accent 3" w:semiHidden="0" w:uiPriority="63" w:unhideWhenUsed="0"/>
-    <w:lsdException w:name="Medium Shading 2 Accent 3" w:semiHidden="0" w:uiPriority="64" w:unhideWhenUsed="0"/>
-    <w:lsdException w:name="Medium List 1 Accent 3" w:semiHidden="0" w:uiPriority="65" w:unhideWhenUsed="0"/>
-    <w:lsdException w:name="Medium List 2 Accent 3" w:semiHidden="0" w:uiPriority="66" w:unhideWhenUsed="0"/>
-    <w:lsdException w:name="Medium Grid 1 Accent 3" w:semiHidden="0" w:uiPriority="67" w:unhideWhenUsed="0"/>
-    <w:lsdException w:name="Medium Grid 2 Accent 3" w:semiHidden="0" w:uiPriority="68" w:unhideWhenUsed="0"/>
-    <w:lsdException w:name="Medium Grid 3 Accent 3" w:semiHidden="0" w:uiPriority="69" w:unhideWhenUsed="0"/>
-    <w:lsdException w:name="Dark List Accent 3" w:semiHidden="0" w:uiPriority="70" w:unhideWhenUsed="0"/>
-    <w:lsdException w:name="Colorful Shading Accent 3" w:semiHidden="0" w:uiPriority="71" w:unhideWhenUsed="0"/>
-    <w:lsdException w:name="Colorful List Accent 3" w:semiHidden="0" w:uiPriority="72" w:unhideWhenUsed="0"/>
-    <w:lsdException w:name="Colorful Grid Accent 3" w:semiHidden="0" w:uiPriority="73" w:unhideWhenUsed="0"/>
-    <w:lsdException w:name="Light Shading Accent 4" w:semiHidden="0" w:uiPriority="60" w:unhideWhenUsed="0"/>
-    <w:lsdException w:name="Light List Accent 4" w:semiHidden="0" w:uiPriority="61" w:unhideWhenUsed="0"/>
-    <w:lsdException w:name="Light Grid Accent 4" w:semiHidden="0" w:uiPriority="62" w:unhideWhenUsed="0"/>
-    <w:lsdException w:name="Medium Shading 1 Accent 4" w:semiHidden="0" w:uiPriority="63" w:unhideWhenUsed="0"/>
-    <w:lsdException w:name="Medium Shading 2 Accent 4" w:semiHidden="0" w:uiPriority="64" w:unhideWhenUsed="0"/>
-    <w:lsdException w:name="Medium List 1 Accent 4" w:semiHidden="0" w:uiPriority="65" w:unhideWhenUsed="0"/>
-    <w:lsdException w:name="Medium List 2 Accent 4" w:semiHidden="0" w:uiPriority="66" w:unhideWhenUsed="0"/>
-    <w:lsdException w:name="Medium Grid 1 Accent 4" w:semiHidden="0" w:uiPriority="67" w:unhideWhenUsed="0"/>
-    <w:lsdException w:name="Medium Grid 2 Accent 4" w:semiHidden="0" w:uiPriority="68" w:unhideWhenUsed="0"/>
-    <w:lsdException w:name="Medium Grid 3 Accent 4" w:semiHidden="0" w:uiPriority="69" w:unhideWhenUsed="0"/>
-    <w:lsdException w:name="Dark List Accent 4" w:semiHidden="0" w:uiPriority="70" w:unhideWhenUsed="0"/>
-    <w:lsdException w:name="Colorful Shading Accent 4" w:semiHidden="0" w:uiPriority="71" w:unhideWhenUsed="0"/>
-    <w:lsdException w:name="Colorful List Accent 4" w:semiHidden="0" w:uiPriority="72" w:unhideWhenUsed="0"/>
-    <w:lsdException w:name="Colorful Grid Accent 4" w:semiHidden="0" w:uiPriority="73" w:unhideWhenUsed="0"/>
-    <w:lsdException w:name="Light Shading Accent 5" w:semiHidden="0" w:uiPriority="60" w:unhideWhenUsed="0"/>
-    <w:lsdException w:name="Light List Accent 5" w:semiHidden="0" w:uiPriority="61" w:unhideWhenUsed="0"/>
-    <w:lsdException w:name="Light Grid Accent 5" w:semiHidden="0" w:uiPriority="62" w:unhideWhenUsed="0"/>
-    <w:lsdException w:name="Medium Shading 1 Accent 5" w:semiHidden="0" w:uiPriority="63" w:unhideWhenUsed="0"/>
-    <w:lsdException w:name="Medium Shading 2 Accent 5" w:semiHidden="0" w:uiPriority="64" w:unhideWhenUsed="0"/>
-    <w:lsdException w:name="Medium List 1 Accent 5" w:semiHidden="0" w:uiPriority="65" w:unhideWhenUsed="0"/>
-    <w:lsdException w:name="Medium List 2 Accent 5" w:semiHidden="0" w:uiPriority="66" w:unhideWhenUsed="0"/>
-    <w:lsdException w:name="Medium Grid 1 Accent 5" w:semiHidden="0" w:uiPriority="67" w:unhideWhenUsed="0"/>
-    <w:lsdException w:name="Medium Grid 2 Accent 5" w:semiHidden="0" w:uiPriority="68" w:unhideWhenUsed="0"/>
-    <w:lsdException w:name="Medium Grid 3 Accent 5" w:semiHidden="0" w:uiPriority="69" w:unhideWhenUsed="0"/>
-    <w:lsdException w:name="Dark List Accent 5" w:semiHidden="0" w:uiPriority="70" w:unhideWhenUsed="0"/>
-    <w:lsdException w:name="Colorful Shading Accent 5" w:semiHidden="0" w:uiPriority="71" w:unhideWhenUsed="0"/>
-    <w:lsdException w:name="Colorful List Accent 5" w:semiHidden="0" w:uiPriority="72" w:unhideWhenUsed="0"/>
-    <w:lsdException w:name="Colorful Grid Accent 5" w:semiHidden="0" w:uiPriority="73" w:unhideWhenUsed="0"/>
-    <w:lsdException w:name="Light Shading Accent 6" w:semiHidden="0" w:uiPriority="60" w:unhideWhenUsed="0"/>
-    <w:lsdException w:name="Light List Accent 6" w:semiHidden="0" w:uiPriority="61" w:unhideWhenUsed="0"/>
-    <w:lsdException w:name="Light Grid Accent 6" w:semiHidden="0" w:uiPriority="62" w:unhideWhenUsed="0"/>
-    <w:lsdException w:name="Medium Shading 1 Accent 6" w:semiHidden="0" w:uiPriority="63" w:unhideWhenUsed="0"/>
-    <w:lsdException w:name="Medium Shading 2 Accent 6" w:semiHidden="0" w:uiPriority="64" w:unhideWhenUsed="0"/>
-    <w:lsdException w:name="Medium List 1 Accent 6" w:semiHidden="0" w:uiPriority="65" w:unhideWhenUsed="0"/>
-    <w:lsdException w:name="Medium List 2 Accent 6" w:semiHidden="0" w:uiPriority="66" w:unhideWhenUsed="0"/>
-    <w:lsdException w:name="Medium Grid 1 Accent 6" w:semiHidden="0" w:uiPriority="67" w:unhideWhenUsed="0"/>
-    <w:lsdException w:name="Medium Grid 2 Accent 6" w:semiHidden="0" w:uiPriority="68" w:unhideWhenUsed="0"/>
-    <w:lsdException w:name="Medium Grid 3 Accent 6" w:semiHidden="0" w:uiPriority="69" w:unhideWhenUsed="0"/>
-    <w:lsdException w:name="Dark List Accent 6" w:semiHidden="0" w:uiPriority="70" w:unhideWhenUsed="0"/>
-    <w:lsdException w:name="Colorful Shading Accent 6" w:semiHidden="0" w:uiPriority="71" w:unhideWhenUsed="0"/>
-    <w:lsdException w:name="Colorful List Accent 6" w:semiHidden="0" w:uiPriority="72" w:unhideWhenUsed="0"/>
-    <w:lsdException w:name="Colorful Grid Accent 6" w:semiHidden="0" w:uiPriority="73" w:unhideWhenUsed="0"/>
-    <w:lsdException w:name="Subtle Emphasis" w:semiHidden="0" w:uiPriority="19" w:unhideWhenUsed="0" w:qFormat="1"/>
-    <w:lsdException w:name="Intense Emphasis" w:semiHidden="0" w:uiPriority="21" w:unhideWhenUsed="0" w:qFormat="1"/>
-    <w:lsdException w:name="Subtle Reference" w:semiHidden="0" w:uiPriority="31" w:unhideWhenUsed="0" w:qFormat="1"/>
-    <w:lsdException w:name="Intense Reference" w:semiHidden="0" w:uiPriority="32" w:unhideWhenUsed="0" w:qFormat="1"/>
-    <w:lsdException w:name="Book Title" w:semiHidden="0" w:uiPriority="33" w:unhideWhenUsed="0" w:qFormat="1"/>
-    <w:lsdException w:name="Bibliography" w:uiPriority="37"/>
-    <w:lsdException w:name="TOC Heading" w:uiPriority="39" w:qFormat="1"/>
-  </w:latentStyles>
-  <w:style w:type="paragraph" w:default="1" w:styleId="Normal">
-    <w:name w:val="Normal"/>
+  <w:style w:type="character" w:customStyle="1" w:styleId="Heading2Char">
+    <w:name w:val="Heading 2 Char"/>
+    <w:basedOn w:val="DefaultParagraphFont"/>
+    <w:link w:val="Heading2"/>
+    <w:uiPriority w:val="9"/>
+    <w:semiHidden/>
+    <w:rsid w:val="00FC0D87"/>
+    <w:rPr>
+      <w:rFonts w:asciiTheme="majorHAnsi" w:eastAsiaTheme="majorEastAsia" w:hAnsiTheme="majorHAnsi" w:cstheme="majorBidi"/>
+      <w:color w:val="365F91" w:themeColor="accent1" w:themeShade="BF"/>
+      <w:sz w:val="26"/>
+      <w:szCs w:val="26"/>
+    </w:rPr>
+  </w:style>
+  <w:style w:type="character" w:styleId="Strong">
+    <w:name w:val="Strong"/>
+    <w:basedOn w:val="DefaultParagraphFont"/>
+    <w:uiPriority w:val="22"/>
     <w:qFormat/>
-  </w:style>
-  <w:style w:type="paragraph" w:styleId="Heading3">
-    <w:name w:val="heading 3"/>
-    <w:basedOn w:val="Normal"/>
-    <w:link w:val="Heading3Char"/>
-    <w:uiPriority w:val="9"/>
-    <w:qFormat/>
-    <w:rsid w:val="000E3F96"/>
-    <w:pPr>
-      <w:spacing w:before="100" w:beforeAutospacing="1" w:after="100" w:afterAutospacing="1" w:line="240" w:lineRule="auto"/>
-      <w:outlineLvl w:val="2"/>
-    </w:pPr>
+    <w:rsid w:val="00FC0D87"/>
     <w:rPr>
-      <w:rFonts w:ascii="Times New Roman" w:eastAsia="Times New Roman" w:hAnsi="Times New Roman" w:cs="Times New Roman"/>
       <w:b/>
       <w:bCs/>
-      <w:sz w:val="27"/>
-      <w:szCs w:val="27"/>
-      <w:lang w:eastAsia="en-IN"/>
     </w:rPr>
   </w:style>
-  <w:style w:type="paragraph" w:styleId="Heading4">
-    <w:name w:val="heading 4"/>
+  <w:style w:type="paragraph" w:styleId="ListParagraph">
+    <w:name w:val="List Paragraph"/>
     <w:basedOn w:val="Normal"/>
-    <w:link w:val="Heading4Char"/>
-    <w:uiPriority w:val="9"/>
+    <w:uiPriority w:val="34"/>
     <w:qFormat/>
-    <w:rsid w:val="000E3F96"/>
+    <w:rsid w:val="00FC0D87"/>
     <w:pPr>
-      <w:spacing w:before="100" w:beforeAutospacing="1" w:after="100" w:afterAutospacing="1" w:line="240" w:lineRule="auto"/>
-      <w:outlineLvl w:val="3"/>
+      <w:ind w:left="720"/>
+      <w:contextualSpacing/>
     </w:pPr>
-    <w:rPr>
-      <w:rFonts w:ascii="Times New Roman" w:eastAsia="Times New Roman" w:hAnsi="Times New Roman" w:cs="Times New Roman"/>
-      <w:b/>
-      <w:bCs/>
-      <w:sz w:val="24"/>
-      <w:szCs w:val="24"/>
-      <w:lang w:eastAsia="en-IN"/>
-    </w:rPr>
-  </w:style>
-  <w:style w:type="character" w:default="1" w:styleId="DefaultParagraphFont">
-    <w:name w:val="Default Paragraph Font"/>
-    <w:uiPriority w:val="1"/>
-    <w:semiHidden/>
-    <w:unhideWhenUsed/>
-  </w:style>
-  <w:style w:type="table" w:default="1" w:styleId="TableNormal">
-    <w:name w:val="Normal Table"/>
-    <w:uiPriority w:val="99"/>
-    <w:semiHidden/>
-    <w:unhideWhenUsed/>
-    <w:tblPr>
-      <w:tblInd w:w="0" w:type="dxa"/>
-      <w:tblCellMar>
-        <w:top w:w="0" w:type="dxa"/>
-        <w:left w:w="108" w:type="dxa"/>
-        <w:bottom w:w="0" w:type="dxa"/>
-        <w:right w:w="108" w:type="dxa"/>
-      </w:tblCellMar>
-    </w:tblPr>
-  </w:style>
-  <w:style w:type="numbering" w:default="1" w:styleId="NoList">
-    <w:name w:val="No List"/>
-    <w:uiPriority w:val="99"/>
-    <w:semiHidden/>
-    <w:unhideWhenUsed/>
-  </w:style>
-  <w:style w:type="character" w:customStyle="1" w:styleId="Heading3Char">
-    <w:name w:val="Heading 3 Char"/>
-    <w:basedOn w:val="DefaultParagraphFont"/>
-    <w:link w:val="Heading3"/>
-    <w:uiPriority w:val="9"/>
-    <w:rsid w:val="000E3F96"/>
-    <w:rPr>
-      <w:rFonts w:ascii="Times New Roman" w:eastAsia="Times New Roman" w:hAnsi="Times New Roman" w:cs="Times New Roman"/>
-      <w:b/>
-      <w:bCs/>
-      <w:sz w:val="27"/>
-      <w:szCs w:val="27"/>
-      <w:lang w:eastAsia="en-IN"/>
-    </w:rPr>
-  </w:style>
-  <w:style w:type="character" w:customStyle="1" w:styleId="Heading4Char">
-    <w:name w:val="Heading 4 Char"/>
-    <w:basedOn w:val="DefaultParagraphFont"/>
-    <w:link w:val="Heading4"/>
-    <w:uiPriority w:val="9"/>
-    <w:rsid w:val="000E3F96"/>
-    <w:rPr>
-      <w:rFonts w:ascii="Times New Roman" w:eastAsia="Times New Roman" w:hAnsi="Times New Roman" w:cs="Times New Roman"/>
-      <w:b/>
-      <w:bCs/>
-      <w:sz w:val="24"/>
-      <w:szCs w:val="24"/>
-      <w:lang w:eastAsia="en-IN"/>
-    </w:rPr>
-  </w:style>
-  <w:style w:type="paragraph" w:styleId="NormalWeb">
-    <w:name w:val="Normal (Web)"/>
-    <w:basedOn w:val="Normal"/>
-    <w:uiPriority w:val="99"/>
-    <w:semiHidden/>
-    <w:unhideWhenUsed/>
-    <w:rsid w:val="000E3F96"/>
-    <w:pPr>
-      <w:spacing w:before="100" w:beforeAutospacing="1" w:after="100" w:afterAutospacing="1" w:line="240" w:lineRule="auto"/>
-    </w:pPr>
-    <w:rPr>
-      <w:rFonts w:ascii="Times New Roman" w:eastAsia="Times New Roman" w:hAnsi="Times New Roman" w:cs="Times New Roman"/>
-      <w:sz w:val="24"/>
-      <w:szCs w:val="24"/>
-      <w:lang w:eastAsia="en-IN"/>
-    </w:rPr>
-  </w:style>
-  <w:style w:type="character" w:styleId="HTMLCode">
-    <w:name w:val="HTML Code"/>
-    <w:basedOn w:val="DefaultParagraphFont"/>
-    <w:uiPriority w:val="99"/>
-    <w:semiHidden/>
-    <w:unhideWhenUsed/>
-    <w:rsid w:val="000E3F96"/>
-    <w:rPr>
-      <w:rFonts w:ascii="Courier New" w:eastAsia="Times New Roman" w:hAnsi="Courier New" w:cs="Courier New"/>
-      <w:sz w:val="20"/>
-      <w:szCs w:val="20"/>
-    </w:rPr>
-  </w:style>
-  <w:style w:type="paragraph" w:styleId="BalloonText">
-    <w:name w:val="Balloon Text"/>
-    <w:basedOn w:val="Normal"/>
-    <w:link w:val="BalloonTextChar"/>
-    <w:uiPriority w:val="99"/>
-    <w:semiHidden/>
-    <w:unhideWhenUsed/>
-    <w:rsid w:val="001F3EB9"/>
-    <w:pPr>
-      <w:spacing w:after="0" w:line="240" w:lineRule="auto"/>
-    </w:pPr>
-    <w:rPr>
-      <w:rFonts w:ascii="Tahoma" w:hAnsi="Tahoma" w:cs="Tahoma"/>
-      <w:sz w:val="16"/>
-      <w:szCs w:val="16"/>
-    </w:rPr>
-  </w:style>
-  <w:style w:type="character" w:customStyle="1" w:styleId="BalloonTextChar">
-    <w:name w:val="Balloon Text Char"/>
-    <w:basedOn w:val="DefaultParagraphFont"/>
-    <w:link w:val="BalloonText"/>
-    <w:uiPriority w:val="99"/>
-    <w:semiHidden/>
-    <w:rsid w:val="001F3EB9"/>
-    <w:rPr>
-      <w:rFonts w:ascii="Tahoma" w:hAnsi="Tahoma" w:cs="Tahoma"/>
-      <w:sz w:val="16"/>
-      <w:szCs w:val="16"/>
-    </w:rPr>
   </w:style>
 </w:styles>
 </file>

</xml_diff>